<commit_message>
Polish human docs with covers and index
</commit_message>
<xml_diff>
--- a/doc/human/SB-00_Decision_Register_v1_1.docx
+++ b/doc/human/SB-00_Decision_Register_v1_1.docx
@@ -11,9 +11,208 @@
         <w:rPr>
           <w:rFonts w:ascii="TH Sarabun New" w:hAnsi="TH Sarabun New" w:eastAsia="TH Sarabun New" w:cs="TH Sarabun New"/>
           <w:b/>
-          <w:sz w:val="48"/>
+          <w:i w:val="0"/>
+          <w:sz w:val="52"/>
         </w:rPr>
         <w:t>SB-00 - Decision Register</w:t>
+      </w:r>
+    </w:p>
+    <w:p>
+      <w:pPr>
+        <w:pStyle w:val="Subtitle"/>
+        <w:jc w:val="center"/>
+      </w:pPr>
+      <w:r>
+        <w:rPr>
+          <w:rFonts w:ascii="TH Sarabun New" w:hAnsi="TH Sarabun New" w:eastAsia="TH Sarabun New" w:cs="TH Sarabun New"/>
+          <w:b w:val="0"/>
+          <w:i w:val="0"/>
+          <w:sz w:val="32"/>
+        </w:rPr>
+        <w:t>Version 1.1 | April 2026 | Meeting-ready decisions for SB-00 v1.1 | Last synced: 2026-04-02</w:t>
+      </w:r>
+    </w:p>
+    <w:p/>
+    <w:p>
+      <w:pPr>
+        <w:jc w:val="center"/>
+      </w:pPr>
+      <w:r>
+        <w:rPr>
+          <w:rFonts w:ascii="TH Sarabun New" w:hAnsi="TH Sarabun New" w:eastAsia="TH Sarabun New" w:cs="TH Sarabun New"/>
+          <w:b w:val="0"/>
+          <w:i w:val="0"/>
+          <w:sz w:val="28"/>
+        </w:rPr>
+        <w:t xml:space="preserve">Human-readable edition generated from </w:t>
+      </w:r>
+      <w:r>
+        <w:rPr>
+          <w:rFonts w:ascii="Consolas" w:hAnsi="Consolas" w:eastAsia="Consolas" w:cs="Consolas"/>
+          <w:b w:val="0"/>
+          <w:i w:val="0"/>
+          <w:sz w:val="20"/>
+        </w:rPr>
+        <w:t>doc/ai/SB-00_Decision_Register_v1_1.md</w:t>
+      </w:r>
+    </w:p>
+    <w:p>
+      <w:pPr>
+        <w:jc w:val="center"/>
+      </w:pPr>
+      <w:r>
+        <w:rPr>
+          <w:rFonts w:ascii="TH Sarabun New" w:hAnsi="TH Sarabun New" w:eastAsia="TH Sarabun New" w:cs="TH Sarabun New"/>
+          <w:b w:val="0"/>
+          <w:i w:val="0"/>
+          <w:sz w:val="28"/>
+        </w:rPr>
+        <w:t>Generated on: 2026-04-02</w:t>
+      </w:r>
+    </w:p>
+    <w:p>
+      <w:pPr>
+        <w:jc w:val="center"/>
+      </w:pPr>
+      <w:r>
+        <w:rPr>
+          <w:rFonts w:ascii="TH Sarabun New" w:hAnsi="TH Sarabun New" w:eastAsia="TH Sarabun New" w:cs="TH Sarabun New"/>
+          <w:b w:val="0"/>
+          <w:i w:val="0"/>
+          <w:sz w:val="26"/>
+        </w:rPr>
+        <w:t>เปิดไฟล์ใน Microsoft Word แล้วกด Update Field หากต้องการ refresh สารบัญและเลขหน้า</w:t>
+      </w:r>
+    </w:p>
+    <w:p>
+      <w:r>
+        <w:br w:type="page"/>
+      </w:r>
+    </w:p>
+    <w:p>
+      <w:pPr>
+        <w:pStyle w:val="Heading1"/>
+      </w:pPr>
+      <w:r>
+        <w:rPr>
+          <w:rFonts w:ascii="TH Sarabun New" w:hAnsi="TH Sarabun New" w:eastAsia="TH Sarabun New" w:cs="TH Sarabun New"/>
+          <w:b/>
+          <w:i w:val="0"/>
+          <w:sz w:val="40"/>
+        </w:rPr>
+        <w:t>สารบัญ</w:t>
+      </w:r>
+    </w:p>
+    <w:p>
+      <w:r>
+        <w:rPr>
+          <w:rFonts w:ascii="TH Sarabun New" w:hAnsi="TH Sarabun New" w:eastAsia="TH Sarabun New" w:cs="TH Sarabun New"/>
+          <w:sz w:val="20"/>
+        </w:rPr>
+        <w:fldChar w:fldCharType="begin"/>
+        <w:instrText xml:space="preserve"> TOC \o "1-3" \h \z \u </w:instrText>
+        <w:fldChar w:fldCharType="separate"/>
+        <w:fldChar w:fldCharType="end"/>
+      </w:r>
+    </w:p>
+    <w:p>
+      <w:r>
+        <w:br w:type="page"/>
+      </w:r>
+    </w:p>
+    <w:p>
+      <w:pPr>
+        <w:ind w:left="360"/>
+      </w:pPr>
+      <w:r>
+        <w:rPr>
+          <w:rFonts w:ascii="TH Sarabun New" w:hAnsi="TH Sarabun New" w:eastAsia="TH Sarabun New" w:cs="TH Sarabun New"/>
+          <w:b/>
+          <w:i w:val="0"/>
+          <w:sz w:val="32"/>
+        </w:rPr>
+        <w:t>Reference baseline:</w:t>
+      </w:r>
+      <w:r>
+        <w:rPr>
+          <w:rFonts w:ascii="TH Sarabun New" w:hAnsi="TH Sarabun New" w:eastAsia="TH Sarabun New" w:cs="TH Sarabun New"/>
+          <w:b w:val="0"/>
+          <w:i w:val="0"/>
+          <w:sz w:val="32"/>
+        </w:rPr>
+        <w:t xml:space="preserve"> ใช้คู่กับ SB-00</w:t>
+      </w:r>
+      <w:r>
+        <w:rPr>
+          <w:rFonts w:ascii="TH Sarabun New" w:hAnsi="TH Sarabun New" w:eastAsia="TH Sarabun New" w:cs="TH Sarabun New"/>
+          <w:b w:val="0"/>
+          <w:i/>
+          <w:sz w:val="32"/>
+        </w:rPr>
+        <w:t>Master</w:t>
+      </w:r>
+      <w:r>
+        <w:rPr>
+          <w:rFonts w:ascii="TH Sarabun New" w:hAnsi="TH Sarabun New" w:eastAsia="TH Sarabun New" w:cs="TH Sarabun New"/>
+          <w:b w:val="0"/>
+          <w:i w:val="0"/>
+          <w:sz w:val="32"/>
+        </w:rPr>
+        <w:t>Assumptions</w:t>
+      </w:r>
+      <w:r>
+        <w:rPr>
+          <w:rFonts w:ascii="TH Sarabun New" w:hAnsi="TH Sarabun New" w:eastAsia="TH Sarabun New" w:cs="TH Sarabun New"/>
+          <w:b w:val="0"/>
+          <w:i/>
+          <w:sz w:val="32"/>
+        </w:rPr>
+        <w:t>v1</w:t>
+      </w:r>
+      <w:r>
+        <w:rPr>
+          <w:rFonts w:ascii="TH Sarabun New" w:hAnsi="TH Sarabun New" w:eastAsia="TH Sarabun New" w:cs="TH Sarabun New"/>
+          <w:b w:val="0"/>
+          <w:i w:val="0"/>
+          <w:sz w:val="32"/>
+        </w:rPr>
+        <w:t>1.md (./SB-00</w:t>
+      </w:r>
+      <w:r>
+        <w:rPr>
+          <w:rFonts w:ascii="TH Sarabun New" w:hAnsi="TH Sarabun New" w:eastAsia="TH Sarabun New" w:cs="TH Sarabun New"/>
+          <w:b w:val="0"/>
+          <w:i/>
+          <w:sz w:val="32"/>
+        </w:rPr>
+        <w:t>Master</w:t>
+      </w:r>
+      <w:r>
+        <w:rPr>
+          <w:rFonts w:ascii="TH Sarabun New" w:hAnsi="TH Sarabun New" w:eastAsia="TH Sarabun New" w:cs="TH Sarabun New"/>
+          <w:b w:val="0"/>
+          <w:i w:val="0"/>
+          <w:sz w:val="32"/>
+        </w:rPr>
+        <w:t>Assumptions</w:t>
+      </w:r>
+      <w:r>
+        <w:rPr>
+          <w:rFonts w:ascii="TH Sarabun New" w:hAnsi="TH Sarabun New" w:eastAsia="TH Sarabun New" w:cs="TH Sarabun New"/>
+          <w:b w:val="0"/>
+          <w:i/>
+          <w:sz w:val="32"/>
+        </w:rPr>
+        <w:t>v1</w:t>
+      </w:r>
+      <w:r>
+        <w:rPr>
+          <w:rFonts w:ascii="TH Sarabun New" w:hAnsi="TH Sarabun New" w:eastAsia="TH Sarabun New" w:cs="TH Sarabun New"/>
+          <w:b w:val="0"/>
+          <w:i w:val="0"/>
+          <w:sz w:val="32"/>
+        </w:rPr>
+        <w:t>1.md)</w:t>
       </w:r>
     </w:p>
     <w:p/>
@@ -21,39 +220,8 @@
       <w:r>
         <w:rPr>
           <w:rFonts w:ascii="TH Sarabun New" w:hAnsi="TH Sarabun New" w:eastAsia="TH Sarabun New" w:cs="TH Sarabun New"/>
-          <w:sz w:val="32"/>
-        </w:rPr>
-        <w:t>**Version 1.1 | April 2026 | Meeting-ready decisions for SB-00 v1.1 | Last synced: 2026-04-02**</w:t>
-      </w:r>
-    </w:p>
-    <w:p/>
-    <w:p>
-      <w:pPr>
-        <w:ind w:left="360"/>
-      </w:pPr>
-      <w:r>
-        <w:rPr>
-          <w:rFonts w:ascii="TH Sarabun New" w:hAnsi="TH Sarabun New" w:eastAsia="TH Sarabun New" w:cs="TH Sarabun New"/>
-          <w:sz w:val="32"/>
-        </w:rPr>
-        <w:t>**Reference baseline:** ใช้คู่กับ SB-00_Master_Assumptions_v1_1.md (./SB-00_Master_Assumptions_v1_1.md)</w:t>
-      </w:r>
-    </w:p>
-    <w:p/>
-    <w:p>
-      <w:r>
-        <w:rPr>
-          <w:rFonts w:ascii="TH Sarabun New" w:hAnsi="TH Sarabun New" w:eastAsia="TH Sarabun New" w:cs="TH Sarabun New"/>
-          <w:sz w:val="32"/>
-        </w:rPr>
-        <w:t>---</w:t>
-      </w:r>
-    </w:p>
-    <w:p/>
-    <w:p>
-      <w:r>
-        <w:rPr>
-          <w:rFonts w:ascii="TH Sarabun New" w:hAnsi="TH Sarabun New" w:eastAsia="TH Sarabun New" w:cs="TH Sarabun New"/>
+          <w:b w:val="0"/>
+          <w:i w:val="0"/>
           <w:sz w:val="32"/>
         </w:rPr>
         <w:t>เอกสารนี้ใช้สรุป decision ที่ยังต้องปิด เพื่อให้การประชุมทีมตัดสินใจได้เร็วขึ้นและไม่ต้องย้อนเปิดหลายไฟล์พร้อมกัน</w:t>
@@ -62,13 +230,14 @@
     <w:p/>
     <w:p>
       <w:pPr>
-        <w:pStyle w:val="Heading1"/>
+        <w:pStyle w:val="Heading2"/>
       </w:pPr>
       <w:r>
         <w:rPr>
           <w:rFonts w:ascii="TH Sarabun New" w:hAnsi="TH Sarabun New" w:eastAsia="TH Sarabun New" w:cs="TH Sarabun New"/>
           <w:b/>
-          <w:sz w:val="40"/>
+          <w:i w:val="0"/>
+          <w:sz w:val="36"/>
         </w:rPr>
         <w:t>วิธีใช้</w:t>
       </w:r>
@@ -81,9 +250,29 @@
       <w:r>
         <w:rPr>
           <w:rFonts w:ascii="TH Sarabun New" w:hAnsi="TH Sarabun New" w:eastAsia="TH Sarabun New" w:cs="TH Sarabun New"/>
+          <w:b w:val="0"/>
+          <w:i w:val="0"/>
           <w:sz w:val="32"/>
         </w:rPr>
-        <w:t>ดู Recommendation เป็นทางเลือกที่สอดคล้องกับ baseline ปัจจุบันของเอกสาร</w:t>
+        <w:t xml:space="preserve">ดู </w:t>
+      </w:r>
+      <w:r>
+        <w:rPr>
+          <w:rFonts w:ascii="Consolas" w:hAnsi="Consolas" w:eastAsia="Consolas" w:cs="Consolas"/>
+          <w:b w:val="0"/>
+          <w:i w:val="0"/>
+          <w:sz w:val="20"/>
+        </w:rPr>
+        <w:t>Recommendation</w:t>
+      </w:r>
+      <w:r>
+        <w:rPr>
+          <w:rFonts w:ascii="TH Sarabun New" w:hAnsi="TH Sarabun New" w:eastAsia="TH Sarabun New" w:cs="TH Sarabun New"/>
+          <w:b w:val="0"/>
+          <w:i w:val="0"/>
+          <w:sz w:val="32"/>
+        </w:rPr>
+        <w:t xml:space="preserve"> เป็นทางเลือกที่สอดคล้องกับ baseline ปัจจุบันของเอกสาร</w:t>
       </w:r>
     </w:p>
     <w:p>
@@ -93,9 +282,83 @@
       <w:r>
         <w:rPr>
           <w:rFonts w:ascii="TH Sarabun New" w:hAnsi="TH Sarabun New" w:eastAsia="TH Sarabun New" w:cs="TH Sarabun New"/>
+          <w:b w:val="0"/>
+          <w:i w:val="0"/>
           <w:sz w:val="32"/>
         </w:rPr>
-        <w:t>ถ้าตัดสินใจเปลี่ยนจาก recommendation ให้ update SB-00_Master_Assumptions_v1_1.md (./SB-00_Master_Assumptions_v1_1.md) ก่อน แล้วค่อย sync เอกสารชุดอื่น</w:t>
+        <w:t>ถ้าตัดสินใจเปลี่ยนจาก recommendation ให้ update SB-00</w:t>
+      </w:r>
+      <w:r>
+        <w:rPr>
+          <w:rFonts w:ascii="TH Sarabun New" w:hAnsi="TH Sarabun New" w:eastAsia="TH Sarabun New" w:cs="TH Sarabun New"/>
+          <w:b w:val="0"/>
+          <w:i/>
+          <w:sz w:val="32"/>
+        </w:rPr>
+        <w:t>Master</w:t>
+      </w:r>
+      <w:r>
+        <w:rPr>
+          <w:rFonts w:ascii="TH Sarabun New" w:hAnsi="TH Sarabun New" w:eastAsia="TH Sarabun New" w:cs="TH Sarabun New"/>
+          <w:b w:val="0"/>
+          <w:i w:val="0"/>
+          <w:sz w:val="32"/>
+        </w:rPr>
+        <w:t>Assumptions</w:t>
+      </w:r>
+      <w:r>
+        <w:rPr>
+          <w:rFonts w:ascii="TH Sarabun New" w:hAnsi="TH Sarabun New" w:eastAsia="TH Sarabun New" w:cs="TH Sarabun New"/>
+          <w:b w:val="0"/>
+          <w:i/>
+          <w:sz w:val="32"/>
+        </w:rPr>
+        <w:t>v1</w:t>
+      </w:r>
+      <w:r>
+        <w:rPr>
+          <w:rFonts w:ascii="TH Sarabun New" w:hAnsi="TH Sarabun New" w:eastAsia="TH Sarabun New" w:cs="TH Sarabun New"/>
+          <w:b w:val="0"/>
+          <w:i w:val="0"/>
+          <w:sz w:val="32"/>
+        </w:rPr>
+        <w:t>1.md (./SB-00</w:t>
+      </w:r>
+      <w:r>
+        <w:rPr>
+          <w:rFonts w:ascii="TH Sarabun New" w:hAnsi="TH Sarabun New" w:eastAsia="TH Sarabun New" w:cs="TH Sarabun New"/>
+          <w:b w:val="0"/>
+          <w:i/>
+          <w:sz w:val="32"/>
+        </w:rPr>
+        <w:t>Master</w:t>
+      </w:r>
+      <w:r>
+        <w:rPr>
+          <w:rFonts w:ascii="TH Sarabun New" w:hAnsi="TH Sarabun New" w:eastAsia="TH Sarabun New" w:cs="TH Sarabun New"/>
+          <w:b w:val="0"/>
+          <w:i w:val="0"/>
+          <w:sz w:val="32"/>
+        </w:rPr>
+        <w:t>Assumptions</w:t>
+      </w:r>
+      <w:r>
+        <w:rPr>
+          <w:rFonts w:ascii="TH Sarabun New" w:hAnsi="TH Sarabun New" w:eastAsia="TH Sarabun New" w:cs="TH Sarabun New"/>
+          <w:b w:val="0"/>
+          <w:i/>
+          <w:sz w:val="32"/>
+        </w:rPr>
+        <w:t>v1</w:t>
+      </w:r>
+      <w:r>
+        <w:rPr>
+          <w:rFonts w:ascii="TH Sarabun New" w:hAnsi="TH Sarabun New" w:eastAsia="TH Sarabun New" w:cs="TH Sarabun New"/>
+          <w:b w:val="0"/>
+          <w:i w:val="0"/>
+          <w:sz w:val="32"/>
+        </w:rPr>
+        <w:t>1.md) ก่อน แล้วค่อย sync เอกสารชุดอื่น</w:t>
       </w:r>
     </w:p>
     <w:p>
@@ -105,21 +368,78 @@
       <w:r>
         <w:rPr>
           <w:rFonts w:ascii="TH Sarabun New" w:hAnsi="TH Sarabun New" w:eastAsia="TH Sarabun New" w:cs="TH Sarabun New"/>
+          <w:b w:val="0"/>
+          <w:i w:val="0"/>
           <w:sz w:val="32"/>
         </w:rPr>
-        <w:t>เมื่อปิด decision แล้ว ให้เปลี่ยน Status จาก Open เป็น Closed พร้อมใส่วันที่และเหตุผลย่อ</w:t>
+        <w:t xml:space="preserve">เมื่อปิด decision แล้ว ให้เปลี่ยน </w:t>
+      </w:r>
+      <w:r>
+        <w:rPr>
+          <w:rFonts w:ascii="Consolas" w:hAnsi="Consolas" w:eastAsia="Consolas" w:cs="Consolas"/>
+          <w:b w:val="0"/>
+          <w:i w:val="0"/>
+          <w:sz w:val="20"/>
+        </w:rPr>
+        <w:t>Status</w:t>
+      </w:r>
+      <w:r>
+        <w:rPr>
+          <w:rFonts w:ascii="TH Sarabun New" w:hAnsi="TH Sarabun New" w:eastAsia="TH Sarabun New" w:cs="TH Sarabun New"/>
+          <w:b w:val="0"/>
+          <w:i w:val="0"/>
+          <w:sz w:val="32"/>
+        </w:rPr>
+        <w:t xml:space="preserve"> จาก </w:t>
+      </w:r>
+      <w:r>
+        <w:rPr>
+          <w:rFonts w:ascii="Consolas" w:hAnsi="Consolas" w:eastAsia="Consolas" w:cs="Consolas"/>
+          <w:b w:val="0"/>
+          <w:i w:val="0"/>
+          <w:sz w:val="20"/>
+        </w:rPr>
+        <w:t>Open</w:t>
+      </w:r>
+      <w:r>
+        <w:rPr>
+          <w:rFonts w:ascii="TH Sarabun New" w:hAnsi="TH Sarabun New" w:eastAsia="TH Sarabun New" w:cs="TH Sarabun New"/>
+          <w:b w:val="0"/>
+          <w:i w:val="0"/>
+          <w:sz w:val="32"/>
+        </w:rPr>
+        <w:t xml:space="preserve"> เป็น </w:t>
+      </w:r>
+      <w:r>
+        <w:rPr>
+          <w:rFonts w:ascii="Consolas" w:hAnsi="Consolas" w:eastAsia="Consolas" w:cs="Consolas"/>
+          <w:b w:val="0"/>
+          <w:i w:val="0"/>
+          <w:sz w:val="20"/>
+        </w:rPr>
+        <w:t>Closed</w:t>
+      </w:r>
+      <w:r>
+        <w:rPr>
+          <w:rFonts w:ascii="TH Sarabun New" w:hAnsi="TH Sarabun New" w:eastAsia="TH Sarabun New" w:cs="TH Sarabun New"/>
+          <w:b w:val="0"/>
+          <w:i w:val="0"/>
+          <w:sz w:val="32"/>
+        </w:rPr>
+        <w:t xml:space="preserve"> พร้อมใส่วันที่และเหตุผลย่อ</w:t>
       </w:r>
     </w:p>
     <w:p/>
     <w:p>
       <w:pPr>
-        <w:pStyle w:val="Heading1"/>
+        <w:pStyle w:val="Heading2"/>
       </w:pPr>
       <w:r>
         <w:rPr>
           <w:rFonts w:ascii="TH Sarabun New" w:hAnsi="TH Sarabun New" w:eastAsia="TH Sarabun New" w:cs="TH Sarabun New"/>
           <w:b/>
-          <w:sz w:val="40"/>
+          <w:i w:val="0"/>
+          <w:sz w:val="36"/>
         </w:rPr>
         <w:t>Decision List</w:t>
       </w:r>
@@ -129,25 +449,27 @@
       <w:tblPr>
         <w:tblStyle w:val="TableGrid"/>
         <w:tblW w:type="auto" w:w="0"/>
+        <w:tblLayout w:type="autofit"/>
         <w:tblLook w:firstColumn="1" w:firstRow="1" w:lastColumn="0" w:lastRow="0" w:noHBand="0" w:noVBand="1" w:val="04A0"/>
       </w:tblPr>
       <w:tblGrid>
-        <w:gridCol w:w="1872"/>
-        <w:gridCol w:w="1872"/>
-        <w:gridCol w:w="1872"/>
-        <w:gridCol w:w="1872"/>
-        <w:gridCol w:w="1872"/>
+        <w:gridCol w:w="1805"/>
+        <w:gridCol w:w="1805"/>
+        <w:gridCol w:w="1805"/>
+        <w:gridCol w:w="1805"/>
+        <w:gridCol w:w="1805"/>
       </w:tblGrid>
       <w:tr>
         <w:tc>
           <w:tcPr>
-            <w:tcW w:type="dxa" w:w="1872"/>
+            <w:tcW w:type="dxa" w:w="1805"/>
           </w:tcPr>
           <w:p>
             <w:r>
               <w:rPr>
                 <w:rFonts w:ascii="TH Sarabun New" w:hAnsi="TH Sarabun New" w:eastAsia="TH Sarabun New" w:cs="TH Sarabun New"/>
                 <w:b/>
+                <w:i w:val="0"/>
                 <w:sz w:val="32"/>
               </w:rPr>
               <w:t>ID</w:t>
@@ -156,13 +478,14 @@
         </w:tc>
         <w:tc>
           <w:tcPr>
-            <w:tcW w:type="dxa" w:w="1872"/>
+            <w:tcW w:type="dxa" w:w="1805"/>
           </w:tcPr>
           <w:p>
             <w:r>
               <w:rPr>
                 <w:rFonts w:ascii="TH Sarabun New" w:hAnsi="TH Sarabun New" w:eastAsia="TH Sarabun New" w:cs="TH Sarabun New"/>
                 <w:b/>
+                <w:i w:val="0"/>
                 <w:sz w:val="32"/>
               </w:rPr>
               <w:t>Decision</w:t>
@@ -171,13 +494,14 @@
         </w:tc>
         <w:tc>
           <w:tcPr>
-            <w:tcW w:type="dxa" w:w="1872"/>
+            <w:tcW w:type="dxa" w:w="1805"/>
           </w:tcPr>
           <w:p>
             <w:r>
               <w:rPr>
                 <w:rFonts w:ascii="TH Sarabun New" w:hAnsi="TH Sarabun New" w:eastAsia="TH Sarabun New" w:cs="TH Sarabun New"/>
                 <w:b/>
+                <w:i w:val="0"/>
                 <w:sz w:val="32"/>
               </w:rPr>
               <w:t>Status</w:t>
@@ -186,13 +510,14 @@
         </w:tc>
         <w:tc>
           <w:tcPr>
-            <w:tcW w:type="dxa" w:w="1872"/>
+            <w:tcW w:type="dxa" w:w="1805"/>
           </w:tcPr>
           <w:p>
             <w:r>
               <w:rPr>
                 <w:rFonts w:ascii="TH Sarabun New" w:hAnsi="TH Sarabun New" w:eastAsia="TH Sarabun New" w:cs="TH Sarabun New"/>
                 <w:b/>
+                <w:i w:val="0"/>
                 <w:sz w:val="32"/>
               </w:rPr>
               <w:t>Owner</w:t>
@@ -201,13 +526,14 @@
         </w:tc>
         <w:tc>
           <w:tcPr>
-            <w:tcW w:type="dxa" w:w="1872"/>
+            <w:tcW w:type="dxa" w:w="1805"/>
           </w:tcPr>
           <w:p>
             <w:r>
               <w:rPr>
                 <w:rFonts w:ascii="TH Sarabun New" w:hAnsi="TH Sarabun New" w:eastAsia="TH Sarabun New" w:cs="TH Sarabun New"/>
                 <w:b/>
+                <w:i w:val="0"/>
                 <w:sz w:val="32"/>
               </w:rPr>
               <w:t>Target date</w:t>
@@ -218,12 +544,14 @@
       <w:tr>
         <w:tc>
           <w:tcPr>
-            <w:tcW w:type="dxa" w:w="1872"/>
+            <w:tcW w:type="dxa" w:w="1805"/>
           </w:tcPr>
           <w:p>
             <w:r>
               <w:rPr>
                 <w:rFonts w:ascii="TH Sarabun New" w:hAnsi="TH Sarabun New" w:eastAsia="TH Sarabun New" w:cs="TH Sarabun New"/>
+                <w:b w:val="0"/>
+                <w:i w:val="0"/>
                 <w:sz w:val="32"/>
               </w:rPr>
               <w:t>D-01</w:t>
@@ -232,12 +560,14 @@
         </w:tc>
         <w:tc>
           <w:tcPr>
-            <w:tcW w:type="dxa" w:w="1872"/>
+            <w:tcW w:type="dxa" w:w="1805"/>
           </w:tcPr>
           <w:p>
             <w:r>
               <w:rPr>
                 <w:rFonts w:ascii="TH Sarabun New" w:hAnsi="TH Sarabun New" w:eastAsia="TH Sarabun New" w:cs="TH Sarabun New"/>
+                <w:b w:val="0"/>
+                <w:i w:val="0"/>
                 <w:sz w:val="32"/>
               </w:rPr>
               <w:t>Final enclosure external size</w:t>
@@ -246,12 +576,14 @@
         </w:tc>
         <w:tc>
           <w:tcPr>
-            <w:tcW w:type="dxa" w:w="1872"/>
+            <w:tcW w:type="dxa" w:w="1805"/>
           </w:tcPr>
           <w:p>
             <w:r>
               <w:rPr>
                 <w:rFonts w:ascii="TH Sarabun New" w:hAnsi="TH Sarabun New" w:eastAsia="TH Sarabun New" w:cs="TH Sarabun New"/>
+                <w:b w:val="0"/>
+                <w:i w:val="0"/>
                 <w:sz w:val="32"/>
               </w:rPr>
               <w:t>Open</w:t>
@@ -260,12 +592,14 @@
         </w:tc>
         <w:tc>
           <w:tcPr>
-            <w:tcW w:type="dxa" w:w="1872"/>
+            <w:tcW w:type="dxa" w:w="1805"/>
           </w:tcPr>
           <w:p>
             <w:r>
               <w:rPr>
                 <w:rFonts w:ascii="TH Sarabun New" w:hAnsi="TH Sarabun New" w:eastAsia="TH Sarabun New" w:cs="TH Sarabun New"/>
+                <w:b w:val="0"/>
+                <w:i w:val="0"/>
                 <w:sz w:val="32"/>
               </w:rPr>
               <w:t>เอ</w:t>
@@ -274,12 +608,14 @@
         </w:tc>
         <w:tc>
           <w:tcPr>
-            <w:tcW w:type="dxa" w:w="1872"/>
+            <w:tcW w:type="dxa" w:w="1805"/>
           </w:tcPr>
           <w:p>
             <w:r>
               <w:rPr>
                 <w:rFonts w:ascii="TH Sarabun New" w:hAnsi="TH Sarabun New" w:eastAsia="TH Sarabun New" w:cs="TH Sarabun New"/>
+                <w:b w:val="0"/>
+                <w:i w:val="0"/>
                 <w:sz w:val="32"/>
               </w:rPr>
               <w:t>ก่อนสั่ง PCB v1</w:t>
@@ -290,12 +626,14 @@
       <w:tr>
         <w:tc>
           <w:tcPr>
-            <w:tcW w:type="dxa" w:w="1872"/>
+            <w:tcW w:type="dxa" w:w="1805"/>
           </w:tcPr>
           <w:p>
             <w:r>
               <w:rPr>
                 <w:rFonts w:ascii="TH Sarabun New" w:hAnsi="TH Sarabun New" w:eastAsia="TH Sarabun New" w:cs="TH Sarabun New"/>
+                <w:b w:val="0"/>
+                <w:i w:val="0"/>
                 <w:sz w:val="32"/>
               </w:rPr>
               <w:t>D-02</w:t>
@@ -304,26 +642,66 @@
         </w:tc>
         <w:tc>
           <w:tcPr>
-            <w:tcW w:type="dxa" w:w="1872"/>
+            <w:tcW w:type="dxa" w:w="1805"/>
           </w:tcPr>
           <w:p>
             <w:r>
               <w:rPr>
                 <w:rFonts w:ascii="TH Sarabun New" w:hAnsi="TH Sarabun New" w:eastAsia="TH Sarabun New" w:cs="TH Sarabun New"/>
+                <w:b w:val="0"/>
+                <w:i w:val="0"/>
                 <w:sz w:val="32"/>
               </w:rPr>
-              <w:t>GPS fallback trigger (L76K -&gt; NEO-M8N)</w:t>
+              <w:t>GPS fallback trigger (</w:t>
+            </w:r>
+            <w:r>
+              <w:rPr>
+                <w:rFonts w:ascii="Consolas" w:hAnsi="Consolas" w:eastAsia="Consolas" w:cs="Consolas"/>
+                <w:b w:val="0"/>
+                <w:i w:val="0"/>
+                <w:sz w:val="20"/>
+              </w:rPr>
+              <w:t>L76K</w:t>
+            </w:r>
+            <w:r>
+              <w:rPr>
+                <w:rFonts w:ascii="TH Sarabun New" w:hAnsi="TH Sarabun New" w:eastAsia="TH Sarabun New" w:cs="TH Sarabun New"/>
+                <w:b w:val="0"/>
+                <w:i w:val="0"/>
+                <w:sz w:val="32"/>
+              </w:rPr>
+              <w:t xml:space="preserve"> -&gt; </w:t>
+            </w:r>
+            <w:r>
+              <w:rPr>
+                <w:rFonts w:ascii="Consolas" w:hAnsi="Consolas" w:eastAsia="Consolas" w:cs="Consolas"/>
+                <w:b w:val="0"/>
+                <w:i w:val="0"/>
+                <w:sz w:val="20"/>
+              </w:rPr>
+              <w:t>NEO-M8N</w:t>
+            </w:r>
+            <w:r>
+              <w:rPr>
+                <w:rFonts w:ascii="TH Sarabun New" w:hAnsi="TH Sarabun New" w:eastAsia="TH Sarabun New" w:cs="TH Sarabun New"/>
+                <w:b w:val="0"/>
+                <w:i w:val="0"/>
+                <w:sz w:val="32"/>
+              </w:rPr>
+              <w:t>)</w:t>
             </w:r>
           </w:p>
         </w:tc>
         <w:tc>
           <w:tcPr>
-            <w:tcW w:type="dxa" w:w="1872"/>
+            <w:tcW w:type="dxa" w:w="1805"/>
           </w:tcPr>
           <w:p>
             <w:r>
               <w:rPr>
                 <w:rFonts w:ascii="TH Sarabun New" w:hAnsi="TH Sarabun New" w:eastAsia="TH Sarabun New" w:cs="TH Sarabun New"/>
+                <w:b w:val="0"/>
+                <w:i w:val="0"/>
                 <w:sz w:val="32"/>
               </w:rPr>
               <w:t>Open</w:t>
@@ -332,12 +710,14 @@
         </w:tc>
         <w:tc>
           <w:tcPr>
-            <w:tcW w:type="dxa" w:w="1872"/>
+            <w:tcW w:type="dxa" w:w="1805"/>
           </w:tcPr>
           <w:p>
             <w:r>
               <w:rPr>
                 <w:rFonts w:ascii="TH Sarabun New" w:hAnsi="TH Sarabun New" w:eastAsia="TH Sarabun New" w:cs="TH Sarabun New"/>
+                <w:b w:val="0"/>
+                <w:i w:val="0"/>
                 <w:sz w:val="32"/>
               </w:rPr>
               <w:t>พล + เอ</w:t>
@@ -346,12 +726,14 @@
         </w:tc>
         <w:tc>
           <w:tcPr>
-            <w:tcW w:type="dxa" w:w="1872"/>
+            <w:tcW w:type="dxa" w:w="1805"/>
           </w:tcPr>
           <w:p>
             <w:r>
               <w:rPr>
                 <w:rFonts w:ascii="TH Sarabun New" w:hAnsi="TH Sarabun New" w:eastAsia="TH Sarabun New" w:cs="TH Sarabun New"/>
+                <w:b w:val="0"/>
+                <w:i w:val="0"/>
                 <w:sz w:val="32"/>
               </w:rPr>
               <w:t>ก่อน freeze PCB v2</w:t>
@@ -362,12 +744,14 @@
       <w:tr>
         <w:tc>
           <w:tcPr>
-            <w:tcW w:type="dxa" w:w="1872"/>
+            <w:tcW w:type="dxa" w:w="1805"/>
           </w:tcPr>
           <w:p>
             <w:r>
               <w:rPr>
                 <w:rFonts w:ascii="TH Sarabun New" w:hAnsi="TH Sarabun New" w:eastAsia="TH Sarabun New" w:cs="TH Sarabun New"/>
+                <w:b w:val="0"/>
+                <w:i w:val="0"/>
                 <w:sz w:val="32"/>
               </w:rPr>
               <w:t>D-03</w:t>
@@ -376,12 +760,14 @@
         </w:tc>
         <w:tc>
           <w:tcPr>
-            <w:tcW w:type="dxa" w:w="1872"/>
+            <w:tcW w:type="dxa" w:w="1805"/>
           </w:tcPr>
           <w:p>
             <w:r>
               <w:rPr>
                 <w:rFonts w:ascii="TH Sarabun New" w:hAnsi="TH Sarabun New" w:eastAsia="TH Sarabun New" w:cs="TH Sarabun New"/>
+                <w:b w:val="0"/>
+                <w:i w:val="0"/>
                 <w:sz w:val="32"/>
               </w:rPr>
               <w:t>BLE provisioning support matrix</w:t>
@@ -390,12 +776,14 @@
         </w:tc>
         <w:tc>
           <w:tcPr>
-            <w:tcW w:type="dxa" w:w="1872"/>
+            <w:tcW w:type="dxa" w:w="1805"/>
           </w:tcPr>
           <w:p>
             <w:r>
               <w:rPr>
                 <w:rFonts w:ascii="TH Sarabun New" w:hAnsi="TH Sarabun New" w:eastAsia="TH Sarabun New" w:cs="TH Sarabun New"/>
+                <w:b w:val="0"/>
+                <w:i w:val="0"/>
                 <w:sz w:val="32"/>
               </w:rPr>
               <w:t>Open</w:t>
@@ -404,12 +792,14 @@
         </w:tc>
         <w:tc>
           <w:tcPr>
-            <w:tcW w:type="dxa" w:w="1872"/>
+            <w:tcW w:type="dxa" w:w="1805"/>
           </w:tcPr>
           <w:p>
             <w:r>
               <w:rPr>
                 <w:rFonts w:ascii="TH Sarabun New" w:hAnsi="TH Sarabun New" w:eastAsia="TH Sarabun New" w:cs="TH Sarabun New"/>
+                <w:b w:val="0"/>
+                <w:i w:val="0"/>
                 <w:sz w:val="32"/>
               </w:rPr>
               <w:t>พล</w:t>
@@ -418,12 +808,14 @@
         </w:tc>
         <w:tc>
           <w:tcPr>
-            <w:tcW w:type="dxa" w:w="1872"/>
+            <w:tcW w:type="dxa" w:w="1805"/>
           </w:tcPr>
           <w:p>
             <w:r>
               <w:rPr>
                 <w:rFonts w:ascii="TH Sarabun New" w:hAnsi="TH Sarabun New" w:eastAsia="TH Sarabun New" w:cs="TH Sarabun New"/>
+                <w:b w:val="0"/>
+                <w:i w:val="0"/>
                 <w:sz w:val="32"/>
               </w:rPr>
               <w:t>ก่อน implement onboarding Phase 2</w:t>
@@ -434,12 +826,14 @@
       <w:tr>
         <w:tc>
           <w:tcPr>
-            <w:tcW w:type="dxa" w:w="1872"/>
+            <w:tcW w:type="dxa" w:w="1805"/>
           </w:tcPr>
           <w:p>
             <w:r>
               <w:rPr>
                 <w:rFonts w:ascii="TH Sarabun New" w:hAnsi="TH Sarabun New" w:eastAsia="TH Sarabun New" w:cs="TH Sarabun New"/>
+                <w:b w:val="0"/>
+                <w:i w:val="0"/>
                 <w:sz w:val="32"/>
               </w:rPr>
               <w:t>D-04</w:t>
@@ -448,26 +842,66 @@
         </w:tc>
         <w:tc>
           <w:tcPr>
-            <w:tcW w:type="dxa" w:w="1872"/>
+            <w:tcW w:type="dxa" w:w="1805"/>
           </w:tcPr>
           <w:p>
             <w:r>
               <w:rPr>
                 <w:rFonts w:ascii="TH Sarabun New" w:hAnsi="TH Sarabun New" w:eastAsia="TH Sarabun New" w:cs="TH Sarabun New"/>
+                <w:b w:val="0"/>
+                <w:i w:val="0"/>
                 <w:sz w:val="32"/>
               </w:rPr>
-              <w:t>Production 4G sourcing fallback (A7670E / SIM7670E)</w:t>
+              <w:t>Production 4G sourcing fallback (</w:t>
+            </w:r>
+            <w:r>
+              <w:rPr>
+                <w:rFonts w:ascii="Consolas" w:hAnsi="Consolas" w:eastAsia="Consolas" w:cs="Consolas"/>
+                <w:b w:val="0"/>
+                <w:i w:val="0"/>
+                <w:sz w:val="20"/>
+              </w:rPr>
+              <w:t>A7670E</w:t>
+            </w:r>
+            <w:r>
+              <w:rPr>
+                <w:rFonts w:ascii="TH Sarabun New" w:hAnsi="TH Sarabun New" w:eastAsia="TH Sarabun New" w:cs="TH Sarabun New"/>
+                <w:b w:val="0"/>
+                <w:i w:val="0"/>
+                <w:sz w:val="32"/>
+              </w:rPr>
+              <w:t xml:space="preserve"> / </w:t>
+            </w:r>
+            <w:r>
+              <w:rPr>
+                <w:rFonts w:ascii="Consolas" w:hAnsi="Consolas" w:eastAsia="Consolas" w:cs="Consolas"/>
+                <w:b w:val="0"/>
+                <w:i w:val="0"/>
+                <w:sz w:val="20"/>
+              </w:rPr>
+              <w:t>SIM7670E</w:t>
+            </w:r>
+            <w:r>
+              <w:rPr>
+                <w:rFonts w:ascii="TH Sarabun New" w:hAnsi="TH Sarabun New" w:eastAsia="TH Sarabun New" w:cs="TH Sarabun New"/>
+                <w:b w:val="0"/>
+                <w:i w:val="0"/>
+                <w:sz w:val="32"/>
+              </w:rPr>
+              <w:t>)</w:t>
             </w:r>
           </w:p>
         </w:tc>
         <w:tc>
           <w:tcPr>
-            <w:tcW w:type="dxa" w:w="1872"/>
+            <w:tcW w:type="dxa" w:w="1805"/>
           </w:tcPr>
           <w:p>
             <w:r>
               <w:rPr>
                 <w:rFonts w:ascii="TH Sarabun New" w:hAnsi="TH Sarabun New" w:eastAsia="TH Sarabun New" w:cs="TH Sarabun New"/>
+                <w:b w:val="0"/>
+                <w:i w:val="0"/>
                 <w:sz w:val="32"/>
               </w:rPr>
               <w:t>Open</w:t>
@@ -476,12 +910,14 @@
         </w:tc>
         <w:tc>
           <w:tcPr>
-            <w:tcW w:type="dxa" w:w="1872"/>
+            <w:tcW w:type="dxa" w:w="1805"/>
           </w:tcPr>
           <w:p>
             <w:r>
               <w:rPr>
                 <w:rFonts w:ascii="TH Sarabun New" w:hAnsi="TH Sarabun New" w:eastAsia="TH Sarabun New" w:cs="TH Sarabun New"/>
+                <w:b w:val="0"/>
+                <w:i w:val="0"/>
                 <w:sz w:val="32"/>
               </w:rPr>
               <w:t>เอ</w:t>
@@ -490,12 +926,14 @@
         </w:tc>
         <w:tc>
           <w:tcPr>
-            <w:tcW w:type="dxa" w:w="1872"/>
+            <w:tcW w:type="dxa" w:w="1805"/>
           </w:tcPr>
           <w:p>
             <w:r>
               <w:rPr>
                 <w:rFonts w:ascii="TH Sarabun New" w:hAnsi="TH Sarabun New" w:eastAsia="TH Sarabun New" w:cs="TH Sarabun New"/>
+                <w:b w:val="0"/>
+                <w:i w:val="0"/>
                 <w:sz w:val="32"/>
               </w:rPr>
               <w:t>ก่อน freeze production BOM</w:t>
@@ -506,12 +944,14 @@
       <w:tr>
         <w:tc>
           <w:tcPr>
-            <w:tcW w:type="dxa" w:w="1872"/>
+            <w:tcW w:type="dxa" w:w="1805"/>
           </w:tcPr>
           <w:p>
             <w:r>
               <w:rPr>
                 <w:rFonts w:ascii="TH Sarabun New" w:hAnsi="TH Sarabun New" w:eastAsia="TH Sarabun New" w:cs="TH Sarabun New"/>
+                <w:b w:val="0"/>
+                <w:i w:val="0"/>
                 <w:sz w:val="32"/>
               </w:rPr>
               <w:t>D-05</w:t>
@@ -520,12 +960,14 @@
         </w:tc>
         <w:tc>
           <w:tcPr>
-            <w:tcW w:type="dxa" w:w="1872"/>
+            <w:tcW w:type="dxa" w:w="1805"/>
           </w:tcPr>
           <w:p>
             <w:r>
               <w:rPr>
                 <w:rFonts w:ascii="TH Sarabun New" w:hAnsi="TH Sarabun New" w:eastAsia="TH Sarabun New" w:cs="TH Sarabun New"/>
+                <w:b w:val="0"/>
+                <w:i w:val="0"/>
                 <w:sz w:val="32"/>
               </w:rPr>
               <w:t>LINE OA paid plan / notification budget trigger</w:t>
@@ -534,12 +976,14 @@
         </w:tc>
         <w:tc>
           <w:tcPr>
-            <w:tcW w:type="dxa" w:w="1872"/>
+            <w:tcW w:type="dxa" w:w="1805"/>
           </w:tcPr>
           <w:p>
             <w:r>
               <w:rPr>
                 <w:rFonts w:ascii="TH Sarabun New" w:hAnsi="TH Sarabun New" w:eastAsia="TH Sarabun New" w:cs="TH Sarabun New"/>
+                <w:b w:val="0"/>
+                <w:i w:val="0"/>
                 <w:sz w:val="32"/>
               </w:rPr>
               <w:t>Open</w:t>
@@ -548,12 +992,14 @@
         </w:tc>
         <w:tc>
           <w:tcPr>
-            <w:tcW w:type="dxa" w:w="1872"/>
+            <w:tcW w:type="dxa" w:w="1805"/>
           </w:tcPr>
           <w:p>
             <w:r>
               <w:rPr>
                 <w:rFonts w:ascii="TH Sarabun New" w:hAnsi="TH Sarabun New" w:eastAsia="TH Sarabun New" w:cs="TH Sarabun New"/>
+                <w:b w:val="0"/>
+                <w:i w:val="0"/>
                 <w:sz w:val="32"/>
               </w:rPr>
               <w:t>พล</w:t>
@@ -562,12 +1008,14 @@
         </w:tc>
         <w:tc>
           <w:tcPr>
-            <w:tcW w:type="dxa" w:w="1872"/>
+            <w:tcW w:type="dxa" w:w="1805"/>
           </w:tcPr>
           <w:p>
             <w:r>
               <w:rPr>
                 <w:rFonts w:ascii="TH Sarabun New" w:hAnsi="TH Sarabun New" w:eastAsia="TH Sarabun New" w:cs="TH Sarabun New"/>
+                <w:b w:val="0"/>
+                <w:i w:val="0"/>
                 <w:sz w:val="32"/>
               </w:rPr>
               <w:t>ก่อน launch readiness review</w:t>
@@ -579,24 +1027,15 @@
     <w:p/>
     <w:p/>
     <w:p>
-      <w:r>
-        <w:rPr>
-          <w:rFonts w:ascii="TH Sarabun New" w:hAnsi="TH Sarabun New" w:eastAsia="TH Sarabun New" w:cs="TH Sarabun New"/>
-          <w:sz w:val="32"/>
-        </w:rPr>
-        <w:t>---</w:t>
-      </w:r>
-    </w:p>
-    <w:p/>
-    <w:p>
       <w:pPr>
-        <w:pStyle w:val="Heading1"/>
+        <w:pStyle w:val="Heading2"/>
       </w:pPr>
       <w:r>
         <w:rPr>
           <w:rFonts w:ascii="TH Sarabun New" w:hAnsi="TH Sarabun New" w:eastAsia="TH Sarabun New" w:cs="TH Sarabun New"/>
           <w:b/>
-          <w:sz w:val="40"/>
+          <w:i w:val="0"/>
+          <w:sz w:val="36"/>
         </w:rPr>
         <w:t>D-01 Enclosure External Size</w:t>
       </w:r>
@@ -606,22 +1045,24 @@
       <w:tblPr>
         <w:tblStyle w:val="TableGrid"/>
         <w:tblW w:type="auto" w:w="0"/>
+        <w:tblLayout w:type="autofit"/>
         <w:tblLook w:firstColumn="1" w:firstRow="1" w:lastColumn="0" w:lastRow="0" w:noHBand="0" w:noVBand="1" w:val="04A0"/>
       </w:tblPr>
       <w:tblGrid>
-        <w:gridCol w:w="4680"/>
-        <w:gridCol w:w="4680"/>
+        <w:gridCol w:w="4513"/>
+        <w:gridCol w:w="4513"/>
       </w:tblGrid>
       <w:tr>
         <w:tc>
           <w:tcPr>
-            <w:tcW w:type="dxa" w:w="4680"/>
+            <w:tcW w:type="dxa" w:w="4513"/>
           </w:tcPr>
           <w:p>
             <w:r>
               <w:rPr>
                 <w:rFonts w:ascii="TH Sarabun New" w:hAnsi="TH Sarabun New" w:eastAsia="TH Sarabun New" w:cs="TH Sarabun New"/>
                 <w:b/>
+                <w:i w:val="0"/>
                 <w:sz w:val="32"/>
               </w:rPr>
               <w:t>Item</w:t>
@@ -630,13 +1071,14 @@
         </w:tc>
         <w:tc>
           <w:tcPr>
-            <w:tcW w:type="dxa" w:w="4680"/>
+            <w:tcW w:type="dxa" w:w="4513"/>
           </w:tcPr>
           <w:p>
             <w:r>
               <w:rPr>
                 <w:rFonts w:ascii="TH Sarabun New" w:hAnsi="TH Sarabun New" w:eastAsia="TH Sarabun New" w:cs="TH Sarabun New"/>
                 <w:b/>
+                <w:i w:val="0"/>
                 <w:sz w:val="32"/>
               </w:rPr>
               <w:t>Detail</w:t>
@@ -647,12 +1089,14 @@
       <w:tr>
         <w:tc>
           <w:tcPr>
-            <w:tcW w:type="dxa" w:w="4680"/>
+            <w:tcW w:type="dxa" w:w="4513"/>
           </w:tcPr>
           <w:p>
             <w:r>
               <w:rPr>
                 <w:rFonts w:ascii="TH Sarabun New" w:hAnsi="TH Sarabun New" w:eastAsia="TH Sarabun New" w:cs="TH Sarabun New"/>
+                <w:b w:val="0"/>
+                <w:i w:val="0"/>
                 <w:sz w:val="32"/>
               </w:rPr>
               <w:t>Current baseline</w:t>
@@ -661,15 +1105,26 @@
         </w:tc>
         <w:tc>
           <w:tcPr>
-            <w:tcW w:type="dxa" w:w="4680"/>
+            <w:tcW w:type="dxa" w:w="4513"/>
           </w:tcPr>
           <w:p>
             <w:r>
               <w:rPr>
                 <w:rFonts w:ascii="TH Sarabun New" w:hAnsi="TH Sarabun New" w:eastAsia="TH Sarabun New" w:cs="TH Sarabun New"/>
+                <w:b w:val="0"/>
+                <w:i w:val="0"/>
                 <w:sz w:val="32"/>
               </w:rPr>
-              <w:t>Current planning size ประมาณ 150 × 100 × 60 mm</w:t>
+              <w:t xml:space="preserve">Current planning size ประมาณ </w:t>
+            </w:r>
+            <w:r>
+              <w:rPr>
+                <w:rFonts w:ascii="Consolas" w:hAnsi="Consolas" w:eastAsia="Consolas" w:cs="Consolas"/>
+                <w:b w:val="0"/>
+                <w:i w:val="0"/>
+                <w:sz w:val="20"/>
+              </w:rPr>
+              <w:t>150 × 100 × 60 mm</w:t>
             </w:r>
           </w:p>
         </w:tc>
@@ -677,12 +1132,14 @@
       <w:tr>
         <w:tc>
           <w:tcPr>
-            <w:tcW w:type="dxa" w:w="4680"/>
+            <w:tcW w:type="dxa" w:w="4513"/>
           </w:tcPr>
           <w:p>
             <w:r>
               <w:rPr>
                 <w:rFonts w:ascii="TH Sarabun New" w:hAnsi="TH Sarabun New" w:eastAsia="TH Sarabun New" w:cs="TH Sarabun New"/>
+                <w:b w:val="0"/>
+                <w:i w:val="0"/>
                 <w:sz w:val="32"/>
               </w:rPr>
               <w:t>Why it matters</w:t>
@@ -691,12 +1148,14 @@
         </w:tc>
         <w:tc>
           <w:tcPr>
-            <w:tcW w:type="dxa" w:w="4680"/>
+            <w:tcW w:type="dxa" w:w="4513"/>
           </w:tcPr>
           <w:p>
             <w:r>
               <w:rPr>
                 <w:rFonts w:ascii="TH Sarabun New" w:hAnsi="TH Sarabun New" w:eastAsia="TH Sarabun New" w:cs="TH Sarabun New"/>
+                <w:b w:val="0"/>
+                <w:i w:val="0"/>
                 <w:sz w:val="32"/>
               </w:rPr>
               <w:t>กระทบ PCB outline, 3D print cost, น้ำหนักรวม, buoyancy, การจัดวาง antenna, และ assembly</w:t>
@@ -707,12 +1166,14 @@
       <w:tr>
         <w:tc>
           <w:tcPr>
-            <w:tcW w:type="dxa" w:w="4680"/>
+            <w:tcW w:type="dxa" w:w="4513"/>
           </w:tcPr>
           <w:p>
             <w:r>
               <w:rPr>
                 <w:rFonts w:ascii="TH Sarabun New" w:hAnsi="TH Sarabun New" w:eastAsia="TH Sarabun New" w:cs="TH Sarabun New"/>
+                <w:b w:val="0"/>
+                <w:i w:val="0"/>
                 <w:sz w:val="32"/>
               </w:rPr>
               <w:t>Options</w:t>
@@ -721,15 +1182,62 @@
         </w:tc>
         <w:tc>
           <w:tcPr>
-            <w:tcW w:type="dxa" w:w="4680"/>
+            <w:tcW w:type="dxa" w:w="4513"/>
           </w:tcPr>
           <w:p>
             <w:r>
               <w:rPr>
+                <w:rFonts w:ascii="Consolas" w:hAnsi="Consolas" w:eastAsia="Consolas" w:cs="Consolas"/>
+                <w:b w:val="0"/>
+                <w:i w:val="0"/>
+                <w:sz w:val="20"/>
+              </w:rPr>
+              <w:t>A)</w:t>
+            </w:r>
+            <w:r>
+              <w:rPr>
                 <w:rFonts w:ascii="TH Sarabun New" w:hAnsi="TH Sarabun New" w:eastAsia="TH Sarabun New" w:cs="TH Sarabun New"/>
+                <w:b w:val="0"/>
+                <w:i w:val="0"/>
                 <w:sz w:val="32"/>
               </w:rPr>
-              <w:t>A) คงขนาดประมาณ 150×100×60mm ไว้ก่อน, B) ลด footprint หลัง PCB layout รอบแรก, C) ขยายให้ service/assembly ง่ายขึ้น</w:t>
+              <w:t xml:space="preserve"> คงขนาดประมาณ 150×100×60mm ไว้ก่อน, </w:t>
+            </w:r>
+            <w:r>
+              <w:rPr>
+                <w:rFonts w:ascii="Consolas" w:hAnsi="Consolas" w:eastAsia="Consolas" w:cs="Consolas"/>
+                <w:b w:val="0"/>
+                <w:i w:val="0"/>
+                <w:sz w:val="20"/>
+              </w:rPr>
+              <w:t>B)</w:t>
+            </w:r>
+            <w:r>
+              <w:rPr>
+                <w:rFonts w:ascii="TH Sarabun New" w:hAnsi="TH Sarabun New" w:eastAsia="TH Sarabun New" w:cs="TH Sarabun New"/>
+                <w:b w:val="0"/>
+                <w:i w:val="0"/>
+                <w:sz w:val="32"/>
+              </w:rPr>
+              <w:t xml:space="preserve"> ลด footprint หลัง PCB layout รอบแรก, </w:t>
+            </w:r>
+            <w:r>
+              <w:rPr>
+                <w:rFonts w:ascii="Consolas" w:hAnsi="Consolas" w:eastAsia="Consolas" w:cs="Consolas"/>
+                <w:b w:val="0"/>
+                <w:i w:val="0"/>
+                <w:sz w:val="20"/>
+              </w:rPr>
+              <w:t>C)</w:t>
+            </w:r>
+            <w:r>
+              <w:rPr>
+                <w:rFonts w:ascii="TH Sarabun New" w:hAnsi="TH Sarabun New" w:eastAsia="TH Sarabun New" w:cs="TH Sarabun New"/>
+                <w:b w:val="0"/>
+                <w:i w:val="0"/>
+                <w:sz w:val="32"/>
+              </w:rPr>
+              <w:t xml:space="preserve"> ขยายให้ service/assembly ง่ายขึ้น</w:t>
             </w:r>
           </w:p>
         </w:tc>
@@ -737,12 +1245,14 @@
       <w:tr>
         <w:tc>
           <w:tcPr>
-            <w:tcW w:type="dxa" w:w="4680"/>
+            <w:tcW w:type="dxa" w:w="4513"/>
           </w:tcPr>
           <w:p>
             <w:r>
               <w:rPr>
                 <w:rFonts w:ascii="TH Sarabun New" w:hAnsi="TH Sarabun New" w:eastAsia="TH Sarabun New" w:cs="TH Sarabun New"/>
+                <w:b w:val="0"/>
+                <w:i w:val="0"/>
                 <w:sz w:val="32"/>
               </w:rPr>
               <w:t>Recommendation</w:t>
@@ -751,15 +1261,26 @@
         </w:tc>
         <w:tc>
           <w:tcPr>
-            <w:tcW w:type="dxa" w:w="4680"/>
+            <w:tcW w:type="dxa" w:w="4513"/>
           </w:tcPr>
           <w:p>
             <w:r>
               <w:rPr>
+                <w:rFonts w:ascii="Consolas" w:hAnsi="Consolas" w:eastAsia="Consolas" w:cs="Consolas"/>
+                <w:b w:val="0"/>
+                <w:i w:val="0"/>
+                <w:sz w:val="20"/>
+              </w:rPr>
+              <w:t>A)</w:t>
+            </w:r>
+            <w:r>
+              <w:rPr>
                 <w:rFonts w:ascii="TH Sarabun New" w:hAnsi="TH Sarabun New" w:eastAsia="TH Sarabun New" w:cs="TH Sarabun New"/>
+                <w:b w:val="0"/>
+                <w:i w:val="0"/>
                 <w:sz w:val="32"/>
               </w:rPr>
-              <w:t>A) คง planning size เดิมไว้ก่อนจนกว่าจะมี PCB layout รอบแรก แล้วค่อยตัดสินใจรอบสุดท้าย</w:t>
+              <w:t xml:space="preserve"> คง planning size เดิมไว้ก่อนจนกว่าจะมี PCB layout รอบแรก แล้วค่อยตัดสินใจรอบสุดท้าย</w:t>
             </w:r>
           </w:p>
         </w:tc>
@@ -767,12 +1288,14 @@
       <w:tr>
         <w:tc>
           <w:tcPr>
-            <w:tcW w:type="dxa" w:w="4680"/>
+            <w:tcW w:type="dxa" w:w="4513"/>
           </w:tcPr>
           <w:p>
             <w:r>
               <w:rPr>
                 <w:rFonts w:ascii="TH Sarabun New" w:hAnsi="TH Sarabun New" w:eastAsia="TH Sarabun New" w:cs="TH Sarabun New"/>
+                <w:b w:val="0"/>
+                <w:i w:val="0"/>
                 <w:sz w:val="32"/>
               </w:rPr>
               <w:t>Reasoning</w:t>
@@ -781,12 +1304,14 @@
         </w:tc>
         <w:tc>
           <w:tcPr>
-            <w:tcW w:type="dxa" w:w="4680"/>
+            <w:tcW w:type="dxa" w:w="4513"/>
           </w:tcPr>
           <w:p>
             <w:r>
               <w:rPr>
                 <w:rFonts w:ascii="TH Sarabun New" w:hAnsi="TH Sarabun New" w:eastAsia="TH Sarabun New" w:cs="TH Sarabun New"/>
+                <w:b w:val="0"/>
+                <w:i w:val="0"/>
                 <w:sz w:val="32"/>
               </w:rPr>
               <w:t>ลดความเสี่ยง rework ในช่วงต้น และยังเปิดทางให้ย่อกล่องภายหลังเมื่อรู้ component placement จริง</w:t>
@@ -797,12 +1322,14 @@
       <w:tr>
         <w:tc>
           <w:tcPr>
-            <w:tcW w:type="dxa" w:w="4680"/>
+            <w:tcW w:type="dxa" w:w="4513"/>
           </w:tcPr>
           <w:p>
             <w:r>
               <w:rPr>
                 <w:rFonts w:ascii="TH Sarabun New" w:hAnsi="TH Sarabun New" w:eastAsia="TH Sarabun New" w:cs="TH Sarabun New"/>
+                <w:b w:val="0"/>
+                <w:i w:val="0"/>
                 <w:sz w:val="32"/>
               </w:rPr>
               <w:t>If delayed</w:t>
@@ -811,12 +1338,14 @@
         </w:tc>
         <w:tc>
           <w:tcPr>
-            <w:tcW w:type="dxa" w:w="4680"/>
+            <w:tcW w:type="dxa" w:w="4513"/>
           </w:tcPr>
           <w:p>
             <w:r>
               <w:rPr>
                 <w:rFonts w:ascii="TH Sarabun New" w:hAnsi="TH Sarabun New" w:eastAsia="TH Sarabun New" w:cs="TH Sarabun New"/>
+                <w:b w:val="0"/>
+                <w:i w:val="0"/>
                 <w:sz w:val="32"/>
               </w:rPr>
               <w:t>enclosure, waterproof design, และ procurement จะค้างหลายจุดพร้อมกัน</w:t>
@@ -827,12 +1356,14 @@
       <w:tr>
         <w:tc>
           <w:tcPr>
-            <w:tcW w:type="dxa" w:w="4680"/>
+            <w:tcW w:type="dxa" w:w="4513"/>
           </w:tcPr>
           <w:p>
             <w:r>
               <w:rPr>
                 <w:rFonts w:ascii="TH Sarabun New" w:hAnsi="TH Sarabun New" w:eastAsia="TH Sarabun New" w:cs="TH Sarabun New"/>
+                <w:b w:val="0"/>
+                <w:i w:val="0"/>
                 <w:sz w:val="32"/>
               </w:rPr>
               <w:t>Related docs</w:t>
@@ -841,15 +1372,161 @@
         </w:tc>
         <w:tc>
           <w:tcPr>
-            <w:tcW w:type="dxa" w:w="4680"/>
+            <w:tcW w:type="dxa" w:w="4513"/>
           </w:tcPr>
           <w:p>
             <w:r>
               <w:rPr>
                 <w:rFonts w:ascii="TH Sarabun New" w:hAnsi="TH Sarabun New" w:eastAsia="TH Sarabun New" w:cs="TH Sarabun New"/>
+                <w:b w:val="0"/>
+                <w:i w:val="0"/>
                 <w:sz w:val="32"/>
               </w:rPr>
-              <w:t>SB-00_Master_Assumptions_v1_1.md (./SB-00_Master_Assumptions_v1_1.md), SB-00_Firmware_Hardware_v1_1.md (./SB-00_Firmware_Hardware_v1_1.md)</w:t>
+              <w:t>SB-00</w:t>
+            </w:r>
+            <w:r>
+              <w:rPr>
+                <w:rFonts w:ascii="TH Sarabun New" w:hAnsi="TH Sarabun New" w:eastAsia="TH Sarabun New" w:cs="TH Sarabun New"/>
+                <w:b w:val="0"/>
+                <w:i/>
+                <w:sz w:val="32"/>
+              </w:rPr>
+              <w:t>Master</w:t>
+            </w:r>
+            <w:r>
+              <w:rPr>
+                <w:rFonts w:ascii="TH Sarabun New" w:hAnsi="TH Sarabun New" w:eastAsia="TH Sarabun New" w:cs="TH Sarabun New"/>
+                <w:b w:val="0"/>
+                <w:i w:val="0"/>
+                <w:sz w:val="32"/>
+              </w:rPr>
+              <w:t>Assumptions</w:t>
+            </w:r>
+            <w:r>
+              <w:rPr>
+                <w:rFonts w:ascii="TH Sarabun New" w:hAnsi="TH Sarabun New" w:eastAsia="TH Sarabun New" w:cs="TH Sarabun New"/>
+                <w:b w:val="0"/>
+                <w:i/>
+                <w:sz w:val="32"/>
+              </w:rPr>
+              <w:t>v1</w:t>
+            </w:r>
+            <w:r>
+              <w:rPr>
+                <w:rFonts w:ascii="TH Sarabun New" w:hAnsi="TH Sarabun New" w:eastAsia="TH Sarabun New" w:cs="TH Sarabun New"/>
+                <w:b w:val="0"/>
+                <w:i w:val="0"/>
+                <w:sz w:val="32"/>
+              </w:rPr>
+              <w:t>1.md (./SB-00</w:t>
+            </w:r>
+            <w:r>
+              <w:rPr>
+                <w:rFonts w:ascii="TH Sarabun New" w:hAnsi="TH Sarabun New" w:eastAsia="TH Sarabun New" w:cs="TH Sarabun New"/>
+                <w:b w:val="0"/>
+                <w:i/>
+                <w:sz w:val="32"/>
+              </w:rPr>
+              <w:t>Master</w:t>
+            </w:r>
+            <w:r>
+              <w:rPr>
+                <w:rFonts w:ascii="TH Sarabun New" w:hAnsi="TH Sarabun New" w:eastAsia="TH Sarabun New" w:cs="TH Sarabun New"/>
+                <w:b w:val="0"/>
+                <w:i w:val="0"/>
+                <w:sz w:val="32"/>
+              </w:rPr>
+              <w:t>Assumptions</w:t>
+            </w:r>
+            <w:r>
+              <w:rPr>
+                <w:rFonts w:ascii="TH Sarabun New" w:hAnsi="TH Sarabun New" w:eastAsia="TH Sarabun New" w:cs="TH Sarabun New"/>
+                <w:b w:val="0"/>
+                <w:i/>
+                <w:sz w:val="32"/>
+              </w:rPr>
+              <w:t>v1</w:t>
+            </w:r>
+            <w:r>
+              <w:rPr>
+                <w:rFonts w:ascii="TH Sarabun New" w:hAnsi="TH Sarabun New" w:eastAsia="TH Sarabun New" w:cs="TH Sarabun New"/>
+                <w:b w:val="0"/>
+                <w:i w:val="0"/>
+                <w:sz w:val="32"/>
+              </w:rPr>
+              <w:t>1.md), SB-00</w:t>
+            </w:r>
+            <w:r>
+              <w:rPr>
+                <w:rFonts w:ascii="TH Sarabun New" w:hAnsi="TH Sarabun New" w:eastAsia="TH Sarabun New" w:cs="TH Sarabun New"/>
+                <w:b w:val="0"/>
+                <w:i/>
+                <w:sz w:val="32"/>
+              </w:rPr>
+              <w:t>Firmware</w:t>
+            </w:r>
+            <w:r>
+              <w:rPr>
+                <w:rFonts w:ascii="TH Sarabun New" w:hAnsi="TH Sarabun New" w:eastAsia="TH Sarabun New" w:cs="TH Sarabun New"/>
+                <w:b w:val="0"/>
+                <w:i w:val="0"/>
+                <w:sz w:val="32"/>
+              </w:rPr>
+              <w:t>Hardware</w:t>
+            </w:r>
+            <w:r>
+              <w:rPr>
+                <w:rFonts w:ascii="TH Sarabun New" w:hAnsi="TH Sarabun New" w:eastAsia="TH Sarabun New" w:cs="TH Sarabun New"/>
+                <w:b w:val="0"/>
+                <w:i/>
+                <w:sz w:val="32"/>
+              </w:rPr>
+              <w:t>v1</w:t>
+            </w:r>
+            <w:r>
+              <w:rPr>
+                <w:rFonts w:ascii="TH Sarabun New" w:hAnsi="TH Sarabun New" w:eastAsia="TH Sarabun New" w:cs="TH Sarabun New"/>
+                <w:b w:val="0"/>
+                <w:i w:val="0"/>
+                <w:sz w:val="32"/>
+              </w:rPr>
+              <w:t>1.md (./SB-00</w:t>
+            </w:r>
+            <w:r>
+              <w:rPr>
+                <w:rFonts w:ascii="TH Sarabun New" w:hAnsi="TH Sarabun New" w:eastAsia="TH Sarabun New" w:cs="TH Sarabun New"/>
+                <w:b w:val="0"/>
+                <w:i/>
+                <w:sz w:val="32"/>
+              </w:rPr>
+              <w:t>Firmware</w:t>
+            </w:r>
+            <w:r>
+              <w:rPr>
+                <w:rFonts w:ascii="TH Sarabun New" w:hAnsi="TH Sarabun New" w:eastAsia="TH Sarabun New" w:cs="TH Sarabun New"/>
+                <w:b w:val="0"/>
+                <w:i w:val="0"/>
+                <w:sz w:val="32"/>
+              </w:rPr>
+              <w:t>Hardware</w:t>
+            </w:r>
+            <w:r>
+              <w:rPr>
+                <w:rFonts w:ascii="TH Sarabun New" w:hAnsi="TH Sarabun New" w:eastAsia="TH Sarabun New" w:cs="TH Sarabun New"/>
+                <w:b w:val="0"/>
+                <w:i/>
+                <w:sz w:val="32"/>
+              </w:rPr>
+              <w:t>v1</w:t>
+            </w:r>
+            <w:r>
+              <w:rPr>
+                <w:rFonts w:ascii="TH Sarabun New" w:hAnsi="TH Sarabun New" w:eastAsia="TH Sarabun New" w:cs="TH Sarabun New"/>
+                <w:b w:val="0"/>
+                <w:i w:val="0"/>
+                <w:sz w:val="32"/>
+              </w:rPr>
+              <w:t>1.md)</w:t>
             </w:r>
           </w:p>
         </w:tc>
@@ -859,13 +1536,14 @@
     <w:p/>
     <w:p>
       <w:pPr>
-        <w:pStyle w:val="Heading1"/>
+        <w:pStyle w:val="Heading2"/>
       </w:pPr>
       <w:r>
         <w:rPr>
           <w:rFonts w:ascii="TH Sarabun New" w:hAnsi="TH Sarabun New" w:eastAsia="TH Sarabun New" w:cs="TH Sarabun New"/>
           <w:b/>
-          <w:sz w:val="40"/>
+          <w:i w:val="0"/>
+          <w:sz w:val="36"/>
         </w:rPr>
         <w:t>D-02 GPS Fallback Trigger</w:t>
       </w:r>
@@ -875,22 +1553,24 @@
       <w:tblPr>
         <w:tblStyle w:val="TableGrid"/>
         <w:tblW w:type="auto" w:w="0"/>
+        <w:tblLayout w:type="autofit"/>
         <w:tblLook w:firstColumn="1" w:firstRow="1" w:lastColumn="0" w:lastRow="0" w:noHBand="0" w:noVBand="1" w:val="04A0"/>
       </w:tblPr>
       <w:tblGrid>
-        <w:gridCol w:w="4680"/>
-        <w:gridCol w:w="4680"/>
+        <w:gridCol w:w="4513"/>
+        <w:gridCol w:w="4513"/>
       </w:tblGrid>
       <w:tr>
         <w:tc>
           <w:tcPr>
-            <w:tcW w:type="dxa" w:w="4680"/>
+            <w:tcW w:type="dxa" w:w="4513"/>
           </w:tcPr>
           <w:p>
             <w:r>
               <w:rPr>
                 <w:rFonts w:ascii="TH Sarabun New" w:hAnsi="TH Sarabun New" w:eastAsia="TH Sarabun New" w:cs="TH Sarabun New"/>
                 <w:b/>
+                <w:i w:val="0"/>
                 <w:sz w:val="32"/>
               </w:rPr>
               <w:t>Item</w:t>
@@ -899,13 +1579,14 @@
         </w:tc>
         <w:tc>
           <w:tcPr>
-            <w:tcW w:type="dxa" w:w="4680"/>
+            <w:tcW w:type="dxa" w:w="4513"/>
           </w:tcPr>
           <w:p>
             <w:r>
               <w:rPr>
                 <w:rFonts w:ascii="TH Sarabun New" w:hAnsi="TH Sarabun New" w:eastAsia="TH Sarabun New" w:cs="TH Sarabun New"/>
                 <w:b/>
+                <w:i w:val="0"/>
                 <w:sz w:val="32"/>
               </w:rPr>
               <w:t>Detail</w:t>
@@ -916,12 +1597,14 @@
       <w:tr>
         <w:tc>
           <w:tcPr>
-            <w:tcW w:type="dxa" w:w="4680"/>
+            <w:tcW w:type="dxa" w:w="4513"/>
           </w:tcPr>
           <w:p>
             <w:r>
               <w:rPr>
                 <w:rFonts w:ascii="TH Sarabun New" w:hAnsi="TH Sarabun New" w:eastAsia="TH Sarabun New" w:cs="TH Sarabun New"/>
+                <w:b w:val="0"/>
+                <w:i w:val="0"/>
                 <w:sz w:val="32"/>
               </w:rPr>
               <w:t>Current baseline</w:t>
@@ -930,15 +1613,53 @@
         </w:tc>
         <w:tc>
           <w:tcPr>
-            <w:tcW w:type="dxa" w:w="4680"/>
+            <w:tcW w:type="dxa" w:w="4513"/>
           </w:tcPr>
           <w:p>
             <w:r>
               <w:rPr>
                 <w:rFonts w:ascii="TH Sarabun New" w:hAnsi="TH Sarabun New" w:eastAsia="TH Sarabun New" w:cs="TH Sarabun New"/>
+                <w:b w:val="0"/>
+                <w:i w:val="0"/>
                 <w:sz w:val="32"/>
               </w:rPr>
-              <w:t>ใช้ L76K เป็น default ทั้ง prototype และ production; NEO-M8N เป็น fallback</w:t>
+              <w:t xml:space="preserve">ใช้ </w:t>
+            </w:r>
+            <w:r>
+              <w:rPr>
+                <w:rFonts w:ascii="Consolas" w:hAnsi="Consolas" w:eastAsia="Consolas" w:cs="Consolas"/>
+                <w:b w:val="0"/>
+                <w:i w:val="0"/>
+                <w:sz w:val="20"/>
+              </w:rPr>
+              <w:t>L76K</w:t>
+            </w:r>
+            <w:r>
+              <w:rPr>
+                <w:rFonts w:ascii="TH Sarabun New" w:hAnsi="TH Sarabun New" w:eastAsia="TH Sarabun New" w:cs="TH Sarabun New"/>
+                <w:b w:val="0"/>
+                <w:i w:val="0"/>
+                <w:sz w:val="32"/>
+              </w:rPr>
+              <w:t xml:space="preserve"> เป็น default ทั้ง prototype และ production; </w:t>
+            </w:r>
+            <w:r>
+              <w:rPr>
+                <w:rFonts w:ascii="Consolas" w:hAnsi="Consolas" w:eastAsia="Consolas" w:cs="Consolas"/>
+                <w:b w:val="0"/>
+                <w:i w:val="0"/>
+                <w:sz w:val="20"/>
+              </w:rPr>
+              <w:t>NEO-M8N</w:t>
+            </w:r>
+            <w:r>
+              <w:rPr>
+                <w:rFonts w:ascii="TH Sarabun New" w:hAnsi="TH Sarabun New" w:eastAsia="TH Sarabun New" w:cs="TH Sarabun New"/>
+                <w:b w:val="0"/>
+                <w:i w:val="0"/>
+                <w:sz w:val="32"/>
+              </w:rPr>
+              <w:t xml:space="preserve"> เป็น fallback</w:t>
             </w:r>
           </w:p>
         </w:tc>
@@ -946,12 +1667,14 @@
       <w:tr>
         <w:tc>
           <w:tcPr>
-            <w:tcW w:type="dxa" w:w="4680"/>
+            <w:tcW w:type="dxa" w:w="4513"/>
           </w:tcPr>
           <w:p>
             <w:r>
               <w:rPr>
                 <w:rFonts w:ascii="TH Sarabun New" w:hAnsi="TH Sarabun New" w:eastAsia="TH Sarabun New" w:cs="TH Sarabun New"/>
+                <w:b w:val="0"/>
+                <w:i w:val="0"/>
                 <w:sz w:val="32"/>
               </w:rPr>
               <w:t>Why it matters</w:t>
@@ -960,12 +1683,14 @@
         </w:tc>
         <w:tc>
           <w:tcPr>
-            <w:tcW w:type="dxa" w:w="4680"/>
+            <w:tcW w:type="dxa" w:w="4513"/>
           </w:tcPr>
           <w:p>
             <w:r>
               <w:rPr>
                 <w:rFonts w:ascii="TH Sarabun New" w:hAnsi="TH Sarabun New" w:eastAsia="TH Sarabun New" w:cs="TH Sarabun New"/>
+                <w:b w:val="0"/>
+                <w:i w:val="0"/>
                 <w:sz w:val="32"/>
               </w:rPr>
               <w:t>กระทบ BOM, power budget, enclosure space, antenna placement, และ geofence reliability</w:t>
@@ -976,12 +1701,14 @@
       <w:tr>
         <w:tc>
           <w:tcPr>
-            <w:tcW w:type="dxa" w:w="4680"/>
+            <w:tcW w:type="dxa" w:w="4513"/>
           </w:tcPr>
           <w:p>
             <w:r>
               <w:rPr>
                 <w:rFonts w:ascii="TH Sarabun New" w:hAnsi="TH Sarabun New" w:eastAsia="TH Sarabun New" w:cs="TH Sarabun New"/>
+                <w:b w:val="0"/>
+                <w:i w:val="0"/>
                 <w:sz w:val="32"/>
               </w:rPr>
               <w:t>Options</w:t>
@@ -990,15 +1717,62 @@
         </w:tc>
         <w:tc>
           <w:tcPr>
-            <w:tcW w:type="dxa" w:w="4680"/>
+            <w:tcW w:type="dxa" w:w="4513"/>
           </w:tcPr>
           <w:p>
             <w:r>
               <w:rPr>
+                <w:rFonts w:ascii="Consolas" w:hAnsi="Consolas" w:eastAsia="Consolas" w:cs="Consolas"/>
+                <w:b w:val="0"/>
+                <w:i w:val="0"/>
+                <w:sz w:val="20"/>
+              </w:rPr>
+              <w:t>A)</w:t>
+            </w:r>
+            <w:r>
+              <w:rPr>
                 <w:rFonts w:ascii="TH Sarabun New" w:hAnsi="TH Sarabun New" w:eastAsia="TH Sarabun New" w:cs="TH Sarabun New"/>
+                <w:b w:val="0"/>
+                <w:i w:val="0"/>
                 <w:sz w:val="32"/>
               </w:rPr>
-              <w:t>A) ใช้ L76K ต่อไปถ้า field test ผ่าน, B) เปลี่ยนเป็น NEO-M8N ทันทีเพื่อความแม่นยำ, C) ใช้ L76K ใน pilot แล้วกำหนด trigger ชัดเจนค่อยสลับ</w:t>
+              <w:t xml:space="preserve"> ใช้ L76K ต่อไปถ้า field test ผ่าน, </w:t>
+            </w:r>
+            <w:r>
+              <w:rPr>
+                <w:rFonts w:ascii="Consolas" w:hAnsi="Consolas" w:eastAsia="Consolas" w:cs="Consolas"/>
+                <w:b w:val="0"/>
+                <w:i w:val="0"/>
+                <w:sz w:val="20"/>
+              </w:rPr>
+              <w:t>B)</w:t>
+            </w:r>
+            <w:r>
+              <w:rPr>
+                <w:rFonts w:ascii="TH Sarabun New" w:hAnsi="TH Sarabun New" w:eastAsia="TH Sarabun New" w:cs="TH Sarabun New"/>
+                <w:b w:val="0"/>
+                <w:i w:val="0"/>
+                <w:sz w:val="32"/>
+              </w:rPr>
+              <w:t xml:space="preserve"> เปลี่ยนเป็น NEO-M8N ทันทีเพื่อความแม่นยำ, </w:t>
+            </w:r>
+            <w:r>
+              <w:rPr>
+                <w:rFonts w:ascii="Consolas" w:hAnsi="Consolas" w:eastAsia="Consolas" w:cs="Consolas"/>
+                <w:b w:val="0"/>
+                <w:i w:val="0"/>
+                <w:sz w:val="20"/>
+              </w:rPr>
+              <w:t>C)</w:t>
+            </w:r>
+            <w:r>
+              <w:rPr>
+                <w:rFonts w:ascii="TH Sarabun New" w:hAnsi="TH Sarabun New" w:eastAsia="TH Sarabun New" w:cs="TH Sarabun New"/>
+                <w:b w:val="0"/>
+                <w:i w:val="0"/>
+                <w:sz w:val="32"/>
+              </w:rPr>
+              <w:t xml:space="preserve"> ใช้ L76K ใน pilot แล้วกำหนด trigger ชัดเจนค่อยสลับ</w:t>
             </w:r>
           </w:p>
         </w:tc>
@@ -1006,12 +1780,14 @@
       <w:tr>
         <w:tc>
           <w:tcPr>
-            <w:tcW w:type="dxa" w:w="4680"/>
+            <w:tcW w:type="dxa" w:w="4513"/>
           </w:tcPr>
           <w:p>
             <w:r>
               <w:rPr>
                 <w:rFonts w:ascii="TH Sarabun New" w:hAnsi="TH Sarabun New" w:eastAsia="TH Sarabun New" w:cs="TH Sarabun New"/>
+                <w:b w:val="0"/>
+                <w:i w:val="0"/>
                 <w:sz w:val="32"/>
               </w:rPr>
               <w:t>Recommendation</w:t>
@@ -1020,15 +1796,26 @@
         </w:tc>
         <w:tc>
           <w:tcPr>
-            <w:tcW w:type="dxa" w:w="4680"/>
+            <w:tcW w:type="dxa" w:w="4513"/>
           </w:tcPr>
           <w:p>
             <w:r>
               <w:rPr>
+                <w:rFonts w:ascii="Consolas" w:hAnsi="Consolas" w:eastAsia="Consolas" w:cs="Consolas"/>
+                <w:b w:val="0"/>
+                <w:i w:val="0"/>
+                <w:sz w:val="20"/>
+              </w:rPr>
+              <w:t>C)</w:t>
+            </w:r>
+            <w:r>
+              <w:rPr>
                 <w:rFonts w:ascii="TH Sarabun New" w:hAnsi="TH Sarabun New" w:eastAsia="TH Sarabun New" w:cs="TH Sarabun New"/>
+                <w:b w:val="0"/>
+                <w:i w:val="0"/>
                 <w:sz w:val="32"/>
               </w:rPr>
-              <w:t>C) ใช้ L76K ใน pilot และกำหนด trigger ชัดเจน เช่น fix time, accuracy, และ geofence false alert rate</w:t>
+              <w:t xml:space="preserve"> ใช้ L76K ใน pilot และกำหนด trigger ชัดเจน เช่น fix time, accuracy, และ geofence false alert rate</w:t>
             </w:r>
           </w:p>
         </w:tc>
@@ -1036,12 +1823,14 @@
       <w:tr>
         <w:tc>
           <w:tcPr>
-            <w:tcW w:type="dxa" w:w="4680"/>
+            <w:tcW w:type="dxa" w:w="4513"/>
           </w:tcPr>
           <w:p>
             <w:r>
               <w:rPr>
                 <w:rFonts w:ascii="TH Sarabun New" w:hAnsi="TH Sarabun New" w:eastAsia="TH Sarabun New" w:cs="TH Sarabun New"/>
+                <w:b w:val="0"/>
+                <w:i w:val="0"/>
                 <w:sz w:val="32"/>
               </w:rPr>
               <w:t>Reasoning</w:t>
@@ -1050,12 +1839,14 @@
         </w:tc>
         <w:tc>
           <w:tcPr>
-            <w:tcW w:type="dxa" w:w="4680"/>
+            <w:tcW w:type="dxa" w:w="4513"/>
           </w:tcPr>
           <w:p>
             <w:r>
               <w:rPr>
                 <w:rFonts w:ascii="TH Sarabun New" w:hAnsi="TH Sarabun New" w:eastAsia="TH Sarabun New" w:cs="TH Sarabun New"/>
+                <w:b w:val="0"/>
+                <w:i w:val="0"/>
                 <w:sz w:val="32"/>
               </w:rPr>
               <w:t>เก็บต้นทุนต่ำไว้ก่อน แต่ไม่ปล่อยให้ decision ค้างแบบไม่มีเกณฑ์</w:t>
@@ -1066,12 +1857,14 @@
       <w:tr>
         <w:tc>
           <w:tcPr>
-            <w:tcW w:type="dxa" w:w="4680"/>
+            <w:tcW w:type="dxa" w:w="4513"/>
           </w:tcPr>
           <w:p>
             <w:r>
               <w:rPr>
                 <w:rFonts w:ascii="TH Sarabun New" w:hAnsi="TH Sarabun New" w:eastAsia="TH Sarabun New" w:cs="TH Sarabun New"/>
+                <w:b w:val="0"/>
+                <w:i w:val="0"/>
                 <w:sz w:val="32"/>
               </w:rPr>
               <w:t>If delayed</w:t>
@@ -1080,12 +1873,14 @@
         </w:tc>
         <w:tc>
           <w:tcPr>
-            <w:tcW w:type="dxa" w:w="4680"/>
+            <w:tcW w:type="dxa" w:w="4513"/>
           </w:tcPr>
           <w:p>
             <w:r>
               <w:rPr>
                 <w:rFonts w:ascii="TH Sarabun New" w:hAnsi="TH Sarabun New" w:eastAsia="TH Sarabun New" w:cs="TH Sarabun New"/>
+                <w:b w:val="0"/>
+                <w:i w:val="0"/>
                 <w:sz w:val="32"/>
               </w:rPr>
               <w:t>ทีมจะคุยเรื่อง GPS กันคนละ assumption และ PCB v2 อาจต้องเผื่อเกินจำเป็น</w:t>
@@ -1096,12 +1891,14 @@
       <w:tr>
         <w:tc>
           <w:tcPr>
-            <w:tcW w:type="dxa" w:w="4680"/>
+            <w:tcW w:type="dxa" w:w="4513"/>
           </w:tcPr>
           <w:p>
             <w:r>
               <w:rPr>
                 <w:rFonts w:ascii="TH Sarabun New" w:hAnsi="TH Sarabun New" w:eastAsia="TH Sarabun New" w:cs="TH Sarabun New"/>
+                <w:b w:val="0"/>
+                <w:i w:val="0"/>
                 <w:sz w:val="32"/>
               </w:rPr>
               <w:t>Related docs</w:t>
@@ -1110,15 +1907,233 @@
         </w:tc>
         <w:tc>
           <w:tcPr>
-            <w:tcW w:type="dxa" w:w="4680"/>
+            <w:tcW w:type="dxa" w:w="4513"/>
           </w:tcPr>
           <w:p>
             <w:r>
               <w:rPr>
                 <w:rFonts w:ascii="TH Sarabun New" w:hAnsi="TH Sarabun New" w:eastAsia="TH Sarabun New" w:cs="TH Sarabun New"/>
+                <w:b w:val="0"/>
+                <w:i w:val="0"/>
                 <w:sz w:val="32"/>
               </w:rPr>
-              <w:t>SB-00_Master_Assumptions_v1_1.md (./SB-00_Master_Assumptions_v1_1.md), SB-00_Firmware_Hardware_v1_1.md (./SB-00_Firmware_Hardware_v1_1.md), SB-00_Backend_Security_v1_1.md (./SB-00_Backend_Security_v1_1.md)</w:t>
+              <w:t>SB-00</w:t>
+            </w:r>
+            <w:r>
+              <w:rPr>
+                <w:rFonts w:ascii="TH Sarabun New" w:hAnsi="TH Sarabun New" w:eastAsia="TH Sarabun New" w:cs="TH Sarabun New"/>
+                <w:b w:val="0"/>
+                <w:i/>
+                <w:sz w:val="32"/>
+              </w:rPr>
+              <w:t>Master</w:t>
+            </w:r>
+            <w:r>
+              <w:rPr>
+                <w:rFonts w:ascii="TH Sarabun New" w:hAnsi="TH Sarabun New" w:eastAsia="TH Sarabun New" w:cs="TH Sarabun New"/>
+                <w:b w:val="0"/>
+                <w:i w:val="0"/>
+                <w:sz w:val="32"/>
+              </w:rPr>
+              <w:t>Assumptions</w:t>
+            </w:r>
+            <w:r>
+              <w:rPr>
+                <w:rFonts w:ascii="TH Sarabun New" w:hAnsi="TH Sarabun New" w:eastAsia="TH Sarabun New" w:cs="TH Sarabun New"/>
+                <w:b w:val="0"/>
+                <w:i/>
+                <w:sz w:val="32"/>
+              </w:rPr>
+              <w:t>v1</w:t>
+            </w:r>
+            <w:r>
+              <w:rPr>
+                <w:rFonts w:ascii="TH Sarabun New" w:hAnsi="TH Sarabun New" w:eastAsia="TH Sarabun New" w:cs="TH Sarabun New"/>
+                <w:b w:val="0"/>
+                <w:i w:val="0"/>
+                <w:sz w:val="32"/>
+              </w:rPr>
+              <w:t>1.md (./SB-00</w:t>
+            </w:r>
+            <w:r>
+              <w:rPr>
+                <w:rFonts w:ascii="TH Sarabun New" w:hAnsi="TH Sarabun New" w:eastAsia="TH Sarabun New" w:cs="TH Sarabun New"/>
+                <w:b w:val="0"/>
+                <w:i/>
+                <w:sz w:val="32"/>
+              </w:rPr>
+              <w:t>Master</w:t>
+            </w:r>
+            <w:r>
+              <w:rPr>
+                <w:rFonts w:ascii="TH Sarabun New" w:hAnsi="TH Sarabun New" w:eastAsia="TH Sarabun New" w:cs="TH Sarabun New"/>
+                <w:b w:val="0"/>
+                <w:i w:val="0"/>
+                <w:sz w:val="32"/>
+              </w:rPr>
+              <w:t>Assumptions</w:t>
+            </w:r>
+            <w:r>
+              <w:rPr>
+                <w:rFonts w:ascii="TH Sarabun New" w:hAnsi="TH Sarabun New" w:eastAsia="TH Sarabun New" w:cs="TH Sarabun New"/>
+                <w:b w:val="0"/>
+                <w:i/>
+                <w:sz w:val="32"/>
+              </w:rPr>
+              <w:t>v1</w:t>
+            </w:r>
+            <w:r>
+              <w:rPr>
+                <w:rFonts w:ascii="TH Sarabun New" w:hAnsi="TH Sarabun New" w:eastAsia="TH Sarabun New" w:cs="TH Sarabun New"/>
+                <w:b w:val="0"/>
+                <w:i w:val="0"/>
+                <w:sz w:val="32"/>
+              </w:rPr>
+              <w:t>1.md), SB-00</w:t>
+            </w:r>
+            <w:r>
+              <w:rPr>
+                <w:rFonts w:ascii="TH Sarabun New" w:hAnsi="TH Sarabun New" w:eastAsia="TH Sarabun New" w:cs="TH Sarabun New"/>
+                <w:b w:val="0"/>
+                <w:i/>
+                <w:sz w:val="32"/>
+              </w:rPr>
+              <w:t>Firmware</w:t>
+            </w:r>
+            <w:r>
+              <w:rPr>
+                <w:rFonts w:ascii="TH Sarabun New" w:hAnsi="TH Sarabun New" w:eastAsia="TH Sarabun New" w:cs="TH Sarabun New"/>
+                <w:b w:val="0"/>
+                <w:i w:val="0"/>
+                <w:sz w:val="32"/>
+              </w:rPr>
+              <w:t>Hardware</w:t>
+            </w:r>
+            <w:r>
+              <w:rPr>
+                <w:rFonts w:ascii="TH Sarabun New" w:hAnsi="TH Sarabun New" w:eastAsia="TH Sarabun New" w:cs="TH Sarabun New"/>
+                <w:b w:val="0"/>
+                <w:i/>
+                <w:sz w:val="32"/>
+              </w:rPr>
+              <w:t>v1</w:t>
+            </w:r>
+            <w:r>
+              <w:rPr>
+                <w:rFonts w:ascii="TH Sarabun New" w:hAnsi="TH Sarabun New" w:eastAsia="TH Sarabun New" w:cs="TH Sarabun New"/>
+                <w:b w:val="0"/>
+                <w:i w:val="0"/>
+                <w:sz w:val="32"/>
+              </w:rPr>
+              <w:t>1.md (./SB-00</w:t>
+            </w:r>
+            <w:r>
+              <w:rPr>
+                <w:rFonts w:ascii="TH Sarabun New" w:hAnsi="TH Sarabun New" w:eastAsia="TH Sarabun New" w:cs="TH Sarabun New"/>
+                <w:b w:val="0"/>
+                <w:i/>
+                <w:sz w:val="32"/>
+              </w:rPr>
+              <w:t>Firmware</w:t>
+            </w:r>
+            <w:r>
+              <w:rPr>
+                <w:rFonts w:ascii="TH Sarabun New" w:hAnsi="TH Sarabun New" w:eastAsia="TH Sarabun New" w:cs="TH Sarabun New"/>
+                <w:b w:val="0"/>
+                <w:i w:val="0"/>
+                <w:sz w:val="32"/>
+              </w:rPr>
+              <w:t>Hardware</w:t>
+            </w:r>
+            <w:r>
+              <w:rPr>
+                <w:rFonts w:ascii="TH Sarabun New" w:hAnsi="TH Sarabun New" w:eastAsia="TH Sarabun New" w:cs="TH Sarabun New"/>
+                <w:b w:val="0"/>
+                <w:i/>
+                <w:sz w:val="32"/>
+              </w:rPr>
+              <w:t>v1</w:t>
+            </w:r>
+            <w:r>
+              <w:rPr>
+                <w:rFonts w:ascii="TH Sarabun New" w:hAnsi="TH Sarabun New" w:eastAsia="TH Sarabun New" w:cs="TH Sarabun New"/>
+                <w:b w:val="0"/>
+                <w:i w:val="0"/>
+                <w:sz w:val="32"/>
+              </w:rPr>
+              <w:t>1.md), SB-00</w:t>
+            </w:r>
+            <w:r>
+              <w:rPr>
+                <w:rFonts w:ascii="TH Sarabun New" w:hAnsi="TH Sarabun New" w:eastAsia="TH Sarabun New" w:cs="TH Sarabun New"/>
+                <w:b w:val="0"/>
+                <w:i/>
+                <w:sz w:val="32"/>
+              </w:rPr>
+              <w:t>Backend</w:t>
+            </w:r>
+            <w:r>
+              <w:rPr>
+                <w:rFonts w:ascii="TH Sarabun New" w:hAnsi="TH Sarabun New" w:eastAsia="TH Sarabun New" w:cs="TH Sarabun New"/>
+                <w:b w:val="0"/>
+                <w:i w:val="0"/>
+                <w:sz w:val="32"/>
+              </w:rPr>
+              <w:t>Security</w:t>
+            </w:r>
+            <w:r>
+              <w:rPr>
+                <w:rFonts w:ascii="TH Sarabun New" w:hAnsi="TH Sarabun New" w:eastAsia="TH Sarabun New" w:cs="TH Sarabun New"/>
+                <w:b w:val="0"/>
+                <w:i/>
+                <w:sz w:val="32"/>
+              </w:rPr>
+              <w:t>v1</w:t>
+            </w:r>
+            <w:r>
+              <w:rPr>
+                <w:rFonts w:ascii="TH Sarabun New" w:hAnsi="TH Sarabun New" w:eastAsia="TH Sarabun New" w:cs="TH Sarabun New"/>
+                <w:b w:val="0"/>
+                <w:i w:val="0"/>
+                <w:sz w:val="32"/>
+              </w:rPr>
+              <w:t>1.md (./SB-00</w:t>
+            </w:r>
+            <w:r>
+              <w:rPr>
+                <w:rFonts w:ascii="TH Sarabun New" w:hAnsi="TH Sarabun New" w:eastAsia="TH Sarabun New" w:cs="TH Sarabun New"/>
+                <w:b w:val="0"/>
+                <w:i/>
+                <w:sz w:val="32"/>
+              </w:rPr>
+              <w:t>Backend</w:t>
+            </w:r>
+            <w:r>
+              <w:rPr>
+                <w:rFonts w:ascii="TH Sarabun New" w:hAnsi="TH Sarabun New" w:eastAsia="TH Sarabun New" w:cs="TH Sarabun New"/>
+                <w:b w:val="0"/>
+                <w:i w:val="0"/>
+                <w:sz w:val="32"/>
+              </w:rPr>
+              <w:t>Security</w:t>
+            </w:r>
+            <w:r>
+              <w:rPr>
+                <w:rFonts w:ascii="TH Sarabun New" w:hAnsi="TH Sarabun New" w:eastAsia="TH Sarabun New" w:cs="TH Sarabun New"/>
+                <w:b w:val="0"/>
+                <w:i/>
+                <w:sz w:val="32"/>
+              </w:rPr>
+              <w:t>v1</w:t>
+            </w:r>
+            <w:r>
+              <w:rPr>
+                <w:rFonts w:ascii="TH Sarabun New" w:hAnsi="TH Sarabun New" w:eastAsia="TH Sarabun New" w:cs="TH Sarabun New"/>
+                <w:b w:val="0"/>
+                <w:i w:val="0"/>
+                <w:sz w:val="32"/>
+              </w:rPr>
+              <w:t>1.md)</w:t>
             </w:r>
           </w:p>
         </w:tc>
@@ -1128,13 +2143,14 @@
     <w:p/>
     <w:p>
       <w:pPr>
-        <w:pStyle w:val="Heading1"/>
+        <w:pStyle w:val="Heading2"/>
       </w:pPr>
       <w:r>
         <w:rPr>
           <w:rFonts w:ascii="TH Sarabun New" w:hAnsi="TH Sarabun New" w:eastAsia="TH Sarabun New" w:cs="TH Sarabun New"/>
           <w:b/>
-          <w:sz w:val="40"/>
+          <w:i w:val="0"/>
+          <w:sz w:val="36"/>
         </w:rPr>
         <w:t>D-03 BLE Provisioning Support Matrix</w:t>
       </w:r>
@@ -1144,22 +2160,24 @@
       <w:tblPr>
         <w:tblStyle w:val="TableGrid"/>
         <w:tblW w:type="auto" w:w="0"/>
+        <w:tblLayout w:type="autofit"/>
         <w:tblLook w:firstColumn="1" w:firstRow="1" w:lastColumn="0" w:lastRow="0" w:noHBand="0" w:noVBand="1" w:val="04A0"/>
       </w:tblPr>
       <w:tblGrid>
-        <w:gridCol w:w="4680"/>
-        <w:gridCol w:w="4680"/>
+        <w:gridCol w:w="4513"/>
+        <w:gridCol w:w="4513"/>
       </w:tblGrid>
       <w:tr>
         <w:tc>
           <w:tcPr>
-            <w:tcW w:type="dxa" w:w="4680"/>
+            <w:tcW w:type="dxa" w:w="4513"/>
           </w:tcPr>
           <w:p>
             <w:r>
               <w:rPr>
                 <w:rFonts w:ascii="TH Sarabun New" w:hAnsi="TH Sarabun New" w:eastAsia="TH Sarabun New" w:cs="TH Sarabun New"/>
                 <w:b/>
+                <w:i w:val="0"/>
                 <w:sz w:val="32"/>
               </w:rPr>
               <w:t>Item</w:t>
@@ -1168,13 +2186,14 @@
         </w:tc>
         <w:tc>
           <w:tcPr>
-            <w:tcW w:type="dxa" w:w="4680"/>
+            <w:tcW w:type="dxa" w:w="4513"/>
           </w:tcPr>
           <w:p>
             <w:r>
               <w:rPr>
                 <w:rFonts w:ascii="TH Sarabun New" w:hAnsi="TH Sarabun New" w:eastAsia="TH Sarabun New" w:cs="TH Sarabun New"/>
                 <w:b/>
+                <w:i w:val="0"/>
                 <w:sz w:val="32"/>
               </w:rPr>
               <w:t>Detail</w:t>
@@ -1185,12 +2204,14 @@
       <w:tr>
         <w:tc>
           <w:tcPr>
-            <w:tcW w:type="dxa" w:w="4680"/>
+            <w:tcW w:type="dxa" w:w="4513"/>
           </w:tcPr>
           <w:p>
             <w:r>
               <w:rPr>
                 <w:rFonts w:ascii="TH Sarabun New" w:hAnsi="TH Sarabun New" w:eastAsia="TH Sarabun New" w:cs="TH Sarabun New"/>
+                <w:b w:val="0"/>
+                <w:i w:val="0"/>
                 <w:sz w:val="32"/>
               </w:rPr>
               <w:t>Current baseline</w:t>
@@ -1199,15 +2220,53 @@
         </w:tc>
         <w:tc>
           <w:tcPr>
-            <w:tcW w:type="dxa" w:w="4680"/>
+            <w:tcW w:type="dxa" w:w="4513"/>
           </w:tcPr>
           <w:p>
             <w:r>
               <w:rPr>
                 <w:rFonts w:ascii="TH Sarabun New" w:hAnsi="TH Sarabun New" w:eastAsia="TH Sarabun New" w:cs="TH Sarabun New"/>
+                <w:b w:val="0"/>
+                <w:i w:val="0"/>
                 <w:sz w:val="32"/>
               </w:rPr>
-              <w:t>MVP ใช้ QR + Web/PWA; Phase 2+ ใช้ BLE ผ่าน mobile PWA/Web Bluetooth; native app ไม่ใช่ baseline</w:t>
+              <w:t xml:space="preserve">MVP ใช้ </w:t>
+            </w:r>
+            <w:r>
+              <w:rPr>
+                <w:rFonts w:ascii="Consolas" w:hAnsi="Consolas" w:eastAsia="Consolas" w:cs="Consolas"/>
+                <w:b w:val="0"/>
+                <w:i w:val="0"/>
+                <w:sz w:val="20"/>
+              </w:rPr>
+              <w:t>QR + Web/PWA</w:t>
+            </w:r>
+            <w:r>
+              <w:rPr>
+                <w:rFonts w:ascii="TH Sarabun New" w:hAnsi="TH Sarabun New" w:eastAsia="TH Sarabun New" w:cs="TH Sarabun New"/>
+                <w:b w:val="0"/>
+                <w:i w:val="0"/>
+                <w:sz w:val="32"/>
+              </w:rPr>
+              <w:t xml:space="preserve">; Phase 2+ ใช้ </w:t>
+            </w:r>
+            <w:r>
+              <w:rPr>
+                <w:rFonts w:ascii="Consolas" w:hAnsi="Consolas" w:eastAsia="Consolas" w:cs="Consolas"/>
+                <w:b w:val="0"/>
+                <w:i w:val="0"/>
+                <w:sz w:val="20"/>
+              </w:rPr>
+              <w:t>BLE ผ่าน mobile PWA/Web Bluetooth</w:t>
+            </w:r>
+            <w:r>
+              <w:rPr>
+                <w:rFonts w:ascii="TH Sarabun New" w:hAnsi="TH Sarabun New" w:eastAsia="TH Sarabun New" w:cs="TH Sarabun New"/>
+                <w:b w:val="0"/>
+                <w:i w:val="0"/>
+                <w:sz w:val="32"/>
+              </w:rPr>
+              <w:t>; native app ไม่ใช่ baseline</w:t>
             </w:r>
           </w:p>
         </w:tc>
@@ -1215,12 +2274,14 @@
       <w:tr>
         <w:tc>
           <w:tcPr>
-            <w:tcW w:type="dxa" w:w="4680"/>
+            <w:tcW w:type="dxa" w:w="4513"/>
           </w:tcPr>
           <w:p>
             <w:r>
               <w:rPr>
                 <w:rFonts w:ascii="TH Sarabun New" w:hAnsi="TH Sarabun New" w:eastAsia="TH Sarabun New" w:cs="TH Sarabun New"/>
+                <w:b w:val="0"/>
+                <w:i w:val="0"/>
                 <w:sz w:val="32"/>
               </w:rPr>
               <w:t>Why it matters</w:t>
@@ -1229,12 +2290,14 @@
         </w:tc>
         <w:tc>
           <w:tcPr>
-            <w:tcW w:type="dxa" w:w="4680"/>
+            <w:tcW w:type="dxa" w:w="4513"/>
           </w:tcPr>
           <w:p>
             <w:r>
               <w:rPr>
                 <w:rFonts w:ascii="TH Sarabun New" w:hAnsi="TH Sarabun New" w:eastAsia="TH Sarabun New" w:cs="TH Sarabun New"/>
+                <w:b w:val="0"/>
+                <w:i w:val="0"/>
                 <w:sz w:val="32"/>
               </w:rPr>
               <w:t>กระทบ onboarding UX, support load, browser compatibility, และ recovery flow ตอน provisioning fail</w:t>
@@ -1245,12 +2308,14 @@
       <w:tr>
         <w:tc>
           <w:tcPr>
-            <w:tcW w:type="dxa" w:w="4680"/>
+            <w:tcW w:type="dxa" w:w="4513"/>
           </w:tcPr>
           <w:p>
             <w:r>
               <w:rPr>
                 <w:rFonts w:ascii="TH Sarabun New" w:hAnsi="TH Sarabun New" w:eastAsia="TH Sarabun New" w:cs="TH Sarabun New"/>
+                <w:b w:val="0"/>
+                <w:i w:val="0"/>
                 <w:sz w:val="32"/>
               </w:rPr>
               <w:t>Options</w:t>
@@ -1259,15 +2324,62 @@
         </w:tc>
         <w:tc>
           <w:tcPr>
-            <w:tcW w:type="dxa" w:w="4680"/>
+            <w:tcW w:type="dxa" w:w="4513"/>
           </w:tcPr>
           <w:p>
             <w:r>
               <w:rPr>
+                <w:rFonts w:ascii="Consolas" w:hAnsi="Consolas" w:eastAsia="Consolas" w:cs="Consolas"/>
+                <w:b w:val="0"/>
+                <w:i w:val="0"/>
+                <w:sz w:val="20"/>
+              </w:rPr>
+              <w:t>A)</w:t>
+            </w:r>
+            <w:r>
+              <w:rPr>
                 <w:rFonts w:ascii="TH Sarabun New" w:hAnsi="TH Sarabun New" w:eastAsia="TH Sarabun New" w:cs="TH Sarabun New"/>
+                <w:b w:val="0"/>
+                <w:i w:val="0"/>
                 <w:sz w:val="32"/>
               </w:rPr>
-              <w:t>A) รองรับเฉพาะ mobile PWA/Web Bluetooth + USB fallback, B) ทำ native app เพิ่ม, C) ยกเลิก BLE แล้วใช้ factory-only provisioning</w:t>
+              <w:t xml:space="preserve"> รองรับเฉพาะ mobile PWA/Web Bluetooth + USB fallback, </w:t>
+            </w:r>
+            <w:r>
+              <w:rPr>
+                <w:rFonts w:ascii="Consolas" w:hAnsi="Consolas" w:eastAsia="Consolas" w:cs="Consolas"/>
+                <w:b w:val="0"/>
+                <w:i w:val="0"/>
+                <w:sz w:val="20"/>
+              </w:rPr>
+              <w:t>B)</w:t>
+            </w:r>
+            <w:r>
+              <w:rPr>
+                <w:rFonts w:ascii="TH Sarabun New" w:hAnsi="TH Sarabun New" w:eastAsia="TH Sarabun New" w:cs="TH Sarabun New"/>
+                <w:b w:val="0"/>
+                <w:i w:val="0"/>
+                <w:sz w:val="32"/>
+              </w:rPr>
+              <w:t xml:space="preserve"> ทำ native app เพิ่ม, </w:t>
+            </w:r>
+            <w:r>
+              <w:rPr>
+                <w:rFonts w:ascii="Consolas" w:hAnsi="Consolas" w:eastAsia="Consolas" w:cs="Consolas"/>
+                <w:b w:val="0"/>
+                <w:i w:val="0"/>
+                <w:sz w:val="20"/>
+              </w:rPr>
+              <w:t>C)</w:t>
+            </w:r>
+            <w:r>
+              <w:rPr>
+                <w:rFonts w:ascii="TH Sarabun New" w:hAnsi="TH Sarabun New" w:eastAsia="TH Sarabun New" w:cs="TH Sarabun New"/>
+                <w:b w:val="0"/>
+                <w:i w:val="0"/>
+                <w:sz w:val="32"/>
+              </w:rPr>
+              <w:t xml:space="preserve"> ยกเลิก BLE แล้วใช้ factory-only provisioning</w:t>
             </w:r>
           </w:p>
         </w:tc>
@@ -1275,12 +2387,14 @@
       <w:tr>
         <w:tc>
           <w:tcPr>
-            <w:tcW w:type="dxa" w:w="4680"/>
+            <w:tcW w:type="dxa" w:w="4513"/>
           </w:tcPr>
           <w:p>
             <w:r>
               <w:rPr>
                 <w:rFonts w:ascii="TH Sarabun New" w:hAnsi="TH Sarabun New" w:eastAsia="TH Sarabun New" w:cs="TH Sarabun New"/>
+                <w:b w:val="0"/>
+                <w:i w:val="0"/>
                 <w:sz w:val="32"/>
               </w:rPr>
               <w:t>Recommendation</w:t>
@@ -1289,15 +2403,26 @@
         </w:tc>
         <w:tc>
           <w:tcPr>
-            <w:tcW w:type="dxa" w:w="4680"/>
+            <w:tcW w:type="dxa" w:w="4513"/>
           </w:tcPr>
           <w:p>
             <w:r>
               <w:rPr>
+                <w:rFonts w:ascii="Consolas" w:hAnsi="Consolas" w:eastAsia="Consolas" w:cs="Consolas"/>
+                <w:b w:val="0"/>
+                <w:i w:val="0"/>
+                <w:sz w:val="20"/>
+              </w:rPr>
+              <w:t>A)</w:t>
+            </w:r>
+            <w:r>
+              <w:rPr>
                 <w:rFonts w:ascii="TH Sarabun New" w:hAnsi="TH Sarabun New" w:eastAsia="TH Sarabun New" w:cs="TH Sarabun New"/>
+                <w:b w:val="0"/>
+                <w:i w:val="0"/>
                 <w:sz w:val="32"/>
               </w:rPr>
-              <w:t>A) รองรับ mobile PWA/Web Bluetooth เป็นหลัก และเขียน fallback matrix ให้ชัดว่า browser/device ไหนใช้ได้</w:t>
+              <w:t xml:space="preserve"> รองรับ mobile PWA/Web Bluetooth เป็นหลัก และเขียน fallback matrix ให้ชัดว่า browser/device ไหนใช้ได้</w:t>
             </w:r>
           </w:p>
         </w:tc>
@@ -1305,12 +2430,14 @@
       <w:tr>
         <w:tc>
           <w:tcPr>
-            <w:tcW w:type="dxa" w:w="4680"/>
+            <w:tcW w:type="dxa" w:w="4513"/>
           </w:tcPr>
           <w:p>
             <w:r>
               <w:rPr>
                 <w:rFonts w:ascii="TH Sarabun New" w:hAnsi="TH Sarabun New" w:eastAsia="TH Sarabun New" w:cs="TH Sarabun New"/>
+                <w:b w:val="0"/>
+                <w:i w:val="0"/>
                 <w:sz w:val="32"/>
               </w:rPr>
               <w:t>Reasoning</w:t>
@@ -1319,12 +2446,14 @@
         </w:tc>
         <w:tc>
           <w:tcPr>
-            <w:tcW w:type="dxa" w:w="4680"/>
+            <w:tcW w:type="dxa" w:w="4513"/>
           </w:tcPr>
           <w:p>
             <w:r>
               <w:rPr>
                 <w:rFonts w:ascii="TH Sarabun New" w:hAnsi="TH Sarabun New" w:eastAsia="TH Sarabun New" w:cs="TH Sarabun New"/>
+                <w:b w:val="0"/>
+                <w:i w:val="0"/>
                 <w:sz w:val="32"/>
               </w:rPr>
               <w:t>สอดคล้องกับ roadmap ที่ดัน PWA ก่อน app และยังคุม scope ได้</w:t>
@@ -1335,12 +2464,14 @@
       <w:tr>
         <w:tc>
           <w:tcPr>
-            <w:tcW w:type="dxa" w:w="4680"/>
+            <w:tcW w:type="dxa" w:w="4513"/>
           </w:tcPr>
           <w:p>
             <w:r>
               <w:rPr>
                 <w:rFonts w:ascii="TH Sarabun New" w:hAnsi="TH Sarabun New" w:eastAsia="TH Sarabun New" w:cs="TH Sarabun New"/>
+                <w:b w:val="0"/>
+                <w:i w:val="0"/>
                 <w:sz w:val="32"/>
               </w:rPr>
               <w:t>If delayed</w:t>
@@ -1349,12 +2480,14 @@
         </w:tc>
         <w:tc>
           <w:tcPr>
-            <w:tcW w:type="dxa" w:w="4680"/>
+            <w:tcW w:type="dxa" w:w="4513"/>
           </w:tcPr>
           <w:p>
             <w:r>
               <w:rPr>
                 <w:rFonts w:ascii="TH Sarabun New" w:hAnsi="TH Sarabun New" w:eastAsia="TH Sarabun New" w:cs="TH Sarabun New"/>
+                <w:b w:val="0"/>
+                <w:i w:val="0"/>
                 <w:sz w:val="32"/>
               </w:rPr>
               <w:t>ฝั่ง firmware, backend, และ onboarding docs จะกลับไปพูดคนละ flow</w:t>
@@ -1365,12 +2498,14 @@
       <w:tr>
         <w:tc>
           <w:tcPr>
-            <w:tcW w:type="dxa" w:w="4680"/>
+            <w:tcW w:type="dxa" w:w="4513"/>
           </w:tcPr>
           <w:p>
             <w:r>
               <w:rPr>
                 <w:rFonts w:ascii="TH Sarabun New" w:hAnsi="TH Sarabun New" w:eastAsia="TH Sarabun New" w:cs="TH Sarabun New"/>
+                <w:b w:val="0"/>
+                <w:i w:val="0"/>
                 <w:sz w:val="32"/>
               </w:rPr>
               <w:t>Related docs</w:t>
@@ -1379,15 +2514,233 @@
         </w:tc>
         <w:tc>
           <w:tcPr>
-            <w:tcW w:type="dxa" w:w="4680"/>
+            <w:tcW w:type="dxa" w:w="4513"/>
           </w:tcPr>
           <w:p>
             <w:r>
               <w:rPr>
                 <w:rFonts w:ascii="TH Sarabun New" w:hAnsi="TH Sarabun New" w:eastAsia="TH Sarabun New" w:cs="TH Sarabun New"/>
+                <w:b w:val="0"/>
+                <w:i w:val="0"/>
                 <w:sz w:val="32"/>
               </w:rPr>
-              <w:t>SB-00_Master_Assumptions_v1_1.md (./SB-00_Master_Assumptions_v1_1.md), SB-00_Firmware_Hardware_v1_1.md (./SB-00_Firmware_Hardware_v1_1.md), SB-00_Backend_Security_v1_1.md (./SB-00_Backend_Security_v1_1.md)</w:t>
+              <w:t>SB-00</w:t>
+            </w:r>
+            <w:r>
+              <w:rPr>
+                <w:rFonts w:ascii="TH Sarabun New" w:hAnsi="TH Sarabun New" w:eastAsia="TH Sarabun New" w:cs="TH Sarabun New"/>
+                <w:b w:val="0"/>
+                <w:i/>
+                <w:sz w:val="32"/>
+              </w:rPr>
+              <w:t>Master</w:t>
+            </w:r>
+            <w:r>
+              <w:rPr>
+                <w:rFonts w:ascii="TH Sarabun New" w:hAnsi="TH Sarabun New" w:eastAsia="TH Sarabun New" w:cs="TH Sarabun New"/>
+                <w:b w:val="0"/>
+                <w:i w:val="0"/>
+                <w:sz w:val="32"/>
+              </w:rPr>
+              <w:t>Assumptions</w:t>
+            </w:r>
+            <w:r>
+              <w:rPr>
+                <w:rFonts w:ascii="TH Sarabun New" w:hAnsi="TH Sarabun New" w:eastAsia="TH Sarabun New" w:cs="TH Sarabun New"/>
+                <w:b w:val="0"/>
+                <w:i/>
+                <w:sz w:val="32"/>
+              </w:rPr>
+              <w:t>v1</w:t>
+            </w:r>
+            <w:r>
+              <w:rPr>
+                <w:rFonts w:ascii="TH Sarabun New" w:hAnsi="TH Sarabun New" w:eastAsia="TH Sarabun New" w:cs="TH Sarabun New"/>
+                <w:b w:val="0"/>
+                <w:i w:val="0"/>
+                <w:sz w:val="32"/>
+              </w:rPr>
+              <w:t>1.md (./SB-00</w:t>
+            </w:r>
+            <w:r>
+              <w:rPr>
+                <w:rFonts w:ascii="TH Sarabun New" w:hAnsi="TH Sarabun New" w:eastAsia="TH Sarabun New" w:cs="TH Sarabun New"/>
+                <w:b w:val="0"/>
+                <w:i/>
+                <w:sz w:val="32"/>
+              </w:rPr>
+              <w:t>Master</w:t>
+            </w:r>
+            <w:r>
+              <w:rPr>
+                <w:rFonts w:ascii="TH Sarabun New" w:hAnsi="TH Sarabun New" w:eastAsia="TH Sarabun New" w:cs="TH Sarabun New"/>
+                <w:b w:val="0"/>
+                <w:i w:val="0"/>
+                <w:sz w:val="32"/>
+              </w:rPr>
+              <w:t>Assumptions</w:t>
+            </w:r>
+            <w:r>
+              <w:rPr>
+                <w:rFonts w:ascii="TH Sarabun New" w:hAnsi="TH Sarabun New" w:eastAsia="TH Sarabun New" w:cs="TH Sarabun New"/>
+                <w:b w:val="0"/>
+                <w:i/>
+                <w:sz w:val="32"/>
+              </w:rPr>
+              <w:t>v1</w:t>
+            </w:r>
+            <w:r>
+              <w:rPr>
+                <w:rFonts w:ascii="TH Sarabun New" w:hAnsi="TH Sarabun New" w:eastAsia="TH Sarabun New" w:cs="TH Sarabun New"/>
+                <w:b w:val="0"/>
+                <w:i w:val="0"/>
+                <w:sz w:val="32"/>
+              </w:rPr>
+              <w:t>1.md), SB-00</w:t>
+            </w:r>
+            <w:r>
+              <w:rPr>
+                <w:rFonts w:ascii="TH Sarabun New" w:hAnsi="TH Sarabun New" w:eastAsia="TH Sarabun New" w:cs="TH Sarabun New"/>
+                <w:b w:val="0"/>
+                <w:i/>
+                <w:sz w:val="32"/>
+              </w:rPr>
+              <w:t>Firmware</w:t>
+            </w:r>
+            <w:r>
+              <w:rPr>
+                <w:rFonts w:ascii="TH Sarabun New" w:hAnsi="TH Sarabun New" w:eastAsia="TH Sarabun New" w:cs="TH Sarabun New"/>
+                <w:b w:val="0"/>
+                <w:i w:val="0"/>
+                <w:sz w:val="32"/>
+              </w:rPr>
+              <w:t>Hardware</w:t>
+            </w:r>
+            <w:r>
+              <w:rPr>
+                <w:rFonts w:ascii="TH Sarabun New" w:hAnsi="TH Sarabun New" w:eastAsia="TH Sarabun New" w:cs="TH Sarabun New"/>
+                <w:b w:val="0"/>
+                <w:i/>
+                <w:sz w:val="32"/>
+              </w:rPr>
+              <w:t>v1</w:t>
+            </w:r>
+            <w:r>
+              <w:rPr>
+                <w:rFonts w:ascii="TH Sarabun New" w:hAnsi="TH Sarabun New" w:eastAsia="TH Sarabun New" w:cs="TH Sarabun New"/>
+                <w:b w:val="0"/>
+                <w:i w:val="0"/>
+                <w:sz w:val="32"/>
+              </w:rPr>
+              <w:t>1.md (./SB-00</w:t>
+            </w:r>
+            <w:r>
+              <w:rPr>
+                <w:rFonts w:ascii="TH Sarabun New" w:hAnsi="TH Sarabun New" w:eastAsia="TH Sarabun New" w:cs="TH Sarabun New"/>
+                <w:b w:val="0"/>
+                <w:i/>
+                <w:sz w:val="32"/>
+              </w:rPr>
+              <w:t>Firmware</w:t>
+            </w:r>
+            <w:r>
+              <w:rPr>
+                <w:rFonts w:ascii="TH Sarabun New" w:hAnsi="TH Sarabun New" w:eastAsia="TH Sarabun New" w:cs="TH Sarabun New"/>
+                <w:b w:val="0"/>
+                <w:i w:val="0"/>
+                <w:sz w:val="32"/>
+              </w:rPr>
+              <w:t>Hardware</w:t>
+            </w:r>
+            <w:r>
+              <w:rPr>
+                <w:rFonts w:ascii="TH Sarabun New" w:hAnsi="TH Sarabun New" w:eastAsia="TH Sarabun New" w:cs="TH Sarabun New"/>
+                <w:b w:val="0"/>
+                <w:i/>
+                <w:sz w:val="32"/>
+              </w:rPr>
+              <w:t>v1</w:t>
+            </w:r>
+            <w:r>
+              <w:rPr>
+                <w:rFonts w:ascii="TH Sarabun New" w:hAnsi="TH Sarabun New" w:eastAsia="TH Sarabun New" w:cs="TH Sarabun New"/>
+                <w:b w:val="0"/>
+                <w:i w:val="0"/>
+                <w:sz w:val="32"/>
+              </w:rPr>
+              <w:t>1.md), SB-00</w:t>
+            </w:r>
+            <w:r>
+              <w:rPr>
+                <w:rFonts w:ascii="TH Sarabun New" w:hAnsi="TH Sarabun New" w:eastAsia="TH Sarabun New" w:cs="TH Sarabun New"/>
+                <w:b w:val="0"/>
+                <w:i/>
+                <w:sz w:val="32"/>
+              </w:rPr>
+              <w:t>Backend</w:t>
+            </w:r>
+            <w:r>
+              <w:rPr>
+                <w:rFonts w:ascii="TH Sarabun New" w:hAnsi="TH Sarabun New" w:eastAsia="TH Sarabun New" w:cs="TH Sarabun New"/>
+                <w:b w:val="0"/>
+                <w:i w:val="0"/>
+                <w:sz w:val="32"/>
+              </w:rPr>
+              <w:t>Security</w:t>
+            </w:r>
+            <w:r>
+              <w:rPr>
+                <w:rFonts w:ascii="TH Sarabun New" w:hAnsi="TH Sarabun New" w:eastAsia="TH Sarabun New" w:cs="TH Sarabun New"/>
+                <w:b w:val="0"/>
+                <w:i/>
+                <w:sz w:val="32"/>
+              </w:rPr>
+              <w:t>v1</w:t>
+            </w:r>
+            <w:r>
+              <w:rPr>
+                <w:rFonts w:ascii="TH Sarabun New" w:hAnsi="TH Sarabun New" w:eastAsia="TH Sarabun New" w:cs="TH Sarabun New"/>
+                <w:b w:val="0"/>
+                <w:i w:val="0"/>
+                <w:sz w:val="32"/>
+              </w:rPr>
+              <w:t>1.md (./SB-00</w:t>
+            </w:r>
+            <w:r>
+              <w:rPr>
+                <w:rFonts w:ascii="TH Sarabun New" w:hAnsi="TH Sarabun New" w:eastAsia="TH Sarabun New" w:cs="TH Sarabun New"/>
+                <w:b w:val="0"/>
+                <w:i/>
+                <w:sz w:val="32"/>
+              </w:rPr>
+              <w:t>Backend</w:t>
+            </w:r>
+            <w:r>
+              <w:rPr>
+                <w:rFonts w:ascii="TH Sarabun New" w:hAnsi="TH Sarabun New" w:eastAsia="TH Sarabun New" w:cs="TH Sarabun New"/>
+                <w:b w:val="0"/>
+                <w:i w:val="0"/>
+                <w:sz w:val="32"/>
+              </w:rPr>
+              <w:t>Security</w:t>
+            </w:r>
+            <w:r>
+              <w:rPr>
+                <w:rFonts w:ascii="TH Sarabun New" w:hAnsi="TH Sarabun New" w:eastAsia="TH Sarabun New" w:cs="TH Sarabun New"/>
+                <w:b w:val="0"/>
+                <w:i/>
+                <w:sz w:val="32"/>
+              </w:rPr>
+              <w:t>v1</w:t>
+            </w:r>
+            <w:r>
+              <w:rPr>
+                <w:rFonts w:ascii="TH Sarabun New" w:hAnsi="TH Sarabun New" w:eastAsia="TH Sarabun New" w:cs="TH Sarabun New"/>
+                <w:b w:val="0"/>
+                <w:i w:val="0"/>
+                <w:sz w:val="32"/>
+              </w:rPr>
+              <w:t>1.md)</w:t>
             </w:r>
           </w:p>
         </w:tc>
@@ -1397,13 +2750,14 @@
     <w:p/>
     <w:p>
       <w:pPr>
-        <w:pStyle w:val="Heading1"/>
+        <w:pStyle w:val="Heading2"/>
       </w:pPr>
       <w:r>
         <w:rPr>
           <w:rFonts w:ascii="TH Sarabun New" w:hAnsi="TH Sarabun New" w:eastAsia="TH Sarabun New" w:cs="TH Sarabun New"/>
           <w:b/>
-          <w:sz w:val="40"/>
+          <w:i w:val="0"/>
+          <w:sz w:val="36"/>
         </w:rPr>
         <w:t>D-04 Production 4G Sourcing Fallback</w:t>
       </w:r>
@@ -1413,22 +2767,24 @@
       <w:tblPr>
         <w:tblStyle w:val="TableGrid"/>
         <w:tblW w:type="auto" w:w="0"/>
+        <w:tblLayout w:type="autofit"/>
         <w:tblLook w:firstColumn="1" w:firstRow="1" w:lastColumn="0" w:lastRow="0" w:noHBand="0" w:noVBand="1" w:val="04A0"/>
       </w:tblPr>
       <w:tblGrid>
-        <w:gridCol w:w="4680"/>
-        <w:gridCol w:w="4680"/>
+        <w:gridCol w:w="4513"/>
+        <w:gridCol w:w="4513"/>
       </w:tblGrid>
       <w:tr>
         <w:tc>
           <w:tcPr>
-            <w:tcW w:type="dxa" w:w="4680"/>
+            <w:tcW w:type="dxa" w:w="4513"/>
           </w:tcPr>
           <w:p>
             <w:r>
               <w:rPr>
                 <w:rFonts w:ascii="TH Sarabun New" w:hAnsi="TH Sarabun New" w:eastAsia="TH Sarabun New" w:cs="TH Sarabun New"/>
                 <w:b/>
+                <w:i w:val="0"/>
                 <w:sz w:val="32"/>
               </w:rPr>
               <w:t>Item</w:t>
@@ -1437,13 +2793,14 @@
         </w:tc>
         <w:tc>
           <w:tcPr>
-            <w:tcW w:type="dxa" w:w="4680"/>
+            <w:tcW w:type="dxa" w:w="4513"/>
           </w:tcPr>
           <w:p>
             <w:r>
               <w:rPr>
                 <w:rFonts w:ascii="TH Sarabun New" w:hAnsi="TH Sarabun New" w:eastAsia="TH Sarabun New" w:cs="TH Sarabun New"/>
                 <w:b/>
+                <w:i w:val="0"/>
                 <w:sz w:val="32"/>
               </w:rPr>
               <w:t>Detail</w:t>
@@ -1454,12 +2811,14 @@
       <w:tr>
         <w:tc>
           <w:tcPr>
-            <w:tcW w:type="dxa" w:w="4680"/>
+            <w:tcW w:type="dxa" w:w="4513"/>
           </w:tcPr>
           <w:p>
             <w:r>
               <w:rPr>
                 <w:rFonts w:ascii="TH Sarabun New" w:hAnsi="TH Sarabun New" w:eastAsia="TH Sarabun New" w:cs="TH Sarabun New"/>
+                <w:b w:val="0"/>
+                <w:i w:val="0"/>
                 <w:sz w:val="32"/>
               </w:rPr>
               <w:t>Current baseline</w:t>
@@ -1468,15 +2827,44 @@
         </w:tc>
         <w:tc>
           <w:tcPr>
-            <w:tcW w:type="dxa" w:w="4680"/>
+            <w:tcW w:type="dxa" w:w="4513"/>
           </w:tcPr>
           <w:p>
             <w:r>
               <w:rPr>
+                <w:rFonts w:ascii="Consolas" w:hAnsi="Consolas" w:eastAsia="Consolas" w:cs="Consolas"/>
+                <w:b w:val="0"/>
+                <w:i w:val="0"/>
+                <w:sz w:val="20"/>
+              </w:rPr>
+              <w:t>A7670E</w:t>
+            </w:r>
+            <w:r>
+              <w:rPr>
                 <w:rFonts w:ascii="TH Sarabun New" w:hAnsi="TH Sarabun New" w:eastAsia="TH Sarabun New" w:cs="TH Sarabun New"/>
+                <w:b w:val="0"/>
+                <w:i w:val="0"/>
                 <w:sz w:val="32"/>
               </w:rPr>
-              <w:t>A7670E เป็น production default; SIM7670E เป็น sourcing fallback</w:t>
+              <w:t xml:space="preserve"> เป็น production default; </w:t>
+            </w:r>
+            <w:r>
+              <w:rPr>
+                <w:rFonts w:ascii="Consolas" w:hAnsi="Consolas" w:eastAsia="Consolas" w:cs="Consolas"/>
+                <w:b w:val="0"/>
+                <w:i w:val="0"/>
+                <w:sz w:val="20"/>
+              </w:rPr>
+              <w:t>SIM7670E</w:t>
+            </w:r>
+            <w:r>
+              <w:rPr>
+                <w:rFonts w:ascii="TH Sarabun New" w:hAnsi="TH Sarabun New" w:eastAsia="TH Sarabun New" w:cs="TH Sarabun New"/>
+                <w:b w:val="0"/>
+                <w:i w:val="0"/>
+                <w:sz w:val="32"/>
+              </w:rPr>
+              <w:t xml:space="preserve"> เป็น sourcing fallback</w:t>
             </w:r>
           </w:p>
         </w:tc>
@@ -1484,12 +2872,14 @@
       <w:tr>
         <w:tc>
           <w:tcPr>
-            <w:tcW w:type="dxa" w:w="4680"/>
+            <w:tcW w:type="dxa" w:w="4513"/>
           </w:tcPr>
           <w:p>
             <w:r>
               <w:rPr>
                 <w:rFonts w:ascii="TH Sarabun New" w:hAnsi="TH Sarabun New" w:eastAsia="TH Sarabun New" w:cs="TH Sarabun New"/>
+                <w:b w:val="0"/>
+                <w:i w:val="0"/>
                 <w:sz w:val="32"/>
               </w:rPr>
               <w:t>Why it matters</w:t>
@@ -1498,12 +2888,14 @@
         </w:tc>
         <w:tc>
           <w:tcPr>
-            <w:tcW w:type="dxa" w:w="4680"/>
+            <w:tcW w:type="dxa" w:w="4513"/>
           </w:tcPr>
           <w:p>
             <w:r>
               <w:rPr>
                 <w:rFonts w:ascii="TH Sarabun New" w:hAnsi="TH Sarabun New" w:eastAsia="TH Sarabun New" w:cs="TH Sarabun New"/>
+                <w:b w:val="0"/>
+                <w:i w:val="0"/>
                 <w:sz w:val="32"/>
               </w:rPr>
               <w:t>กระทบ BOM freeze, PCB footprint, procurement risk, และ firmware compatibility confidence</w:t>
@@ -1514,12 +2906,14 @@
       <w:tr>
         <w:tc>
           <w:tcPr>
-            <w:tcW w:type="dxa" w:w="4680"/>
+            <w:tcW w:type="dxa" w:w="4513"/>
           </w:tcPr>
           <w:p>
             <w:r>
               <w:rPr>
                 <w:rFonts w:ascii="TH Sarabun New" w:hAnsi="TH Sarabun New" w:eastAsia="TH Sarabun New" w:cs="TH Sarabun New"/>
+                <w:b w:val="0"/>
+                <w:i w:val="0"/>
                 <w:sz w:val="32"/>
               </w:rPr>
               <w:t>Options</w:t>
@@ -1528,15 +2922,62 @@
         </w:tc>
         <w:tc>
           <w:tcPr>
-            <w:tcW w:type="dxa" w:w="4680"/>
+            <w:tcW w:type="dxa" w:w="4513"/>
           </w:tcPr>
           <w:p>
             <w:r>
               <w:rPr>
+                <w:rFonts w:ascii="Consolas" w:hAnsi="Consolas" w:eastAsia="Consolas" w:cs="Consolas"/>
+                <w:b w:val="0"/>
+                <w:i w:val="0"/>
+                <w:sz w:val="20"/>
+              </w:rPr>
+              <w:t>A)</w:t>
+            </w:r>
+            <w:r>
+              <w:rPr>
                 <w:rFonts w:ascii="TH Sarabun New" w:hAnsi="TH Sarabun New" w:eastAsia="TH Sarabun New" w:cs="TH Sarabun New"/>
+                <w:b w:val="0"/>
+                <w:i w:val="0"/>
                 <w:sz w:val="32"/>
               </w:rPr>
-              <w:t>A) lock A7670E อย่างเดียว, B) lock SIM7670E อย่างเดียว, C) ออกแบบเผื่อ fallback โดยยึด A7670E เป็น default</w:t>
+              <w:t xml:space="preserve"> lock A7670E อย่างเดียว, </w:t>
+            </w:r>
+            <w:r>
+              <w:rPr>
+                <w:rFonts w:ascii="Consolas" w:hAnsi="Consolas" w:eastAsia="Consolas" w:cs="Consolas"/>
+                <w:b w:val="0"/>
+                <w:i w:val="0"/>
+                <w:sz w:val="20"/>
+              </w:rPr>
+              <w:t>B)</w:t>
+            </w:r>
+            <w:r>
+              <w:rPr>
+                <w:rFonts w:ascii="TH Sarabun New" w:hAnsi="TH Sarabun New" w:eastAsia="TH Sarabun New" w:cs="TH Sarabun New"/>
+                <w:b w:val="0"/>
+                <w:i w:val="0"/>
+                <w:sz w:val="32"/>
+              </w:rPr>
+              <w:t xml:space="preserve"> lock SIM7670E อย่างเดียว, </w:t>
+            </w:r>
+            <w:r>
+              <w:rPr>
+                <w:rFonts w:ascii="Consolas" w:hAnsi="Consolas" w:eastAsia="Consolas" w:cs="Consolas"/>
+                <w:b w:val="0"/>
+                <w:i w:val="0"/>
+                <w:sz w:val="20"/>
+              </w:rPr>
+              <w:t>C)</w:t>
+            </w:r>
+            <w:r>
+              <w:rPr>
+                <w:rFonts w:ascii="TH Sarabun New" w:hAnsi="TH Sarabun New" w:eastAsia="TH Sarabun New" w:cs="TH Sarabun New"/>
+                <w:b w:val="0"/>
+                <w:i w:val="0"/>
+                <w:sz w:val="32"/>
+              </w:rPr>
+              <w:t xml:space="preserve"> ออกแบบเผื่อ fallback โดยยึด A7670E เป็น default</w:t>
             </w:r>
           </w:p>
         </w:tc>
@@ -1544,12 +2985,14 @@
       <w:tr>
         <w:tc>
           <w:tcPr>
-            <w:tcW w:type="dxa" w:w="4680"/>
+            <w:tcW w:type="dxa" w:w="4513"/>
           </w:tcPr>
           <w:p>
             <w:r>
               <w:rPr>
                 <w:rFonts w:ascii="TH Sarabun New" w:hAnsi="TH Sarabun New" w:eastAsia="TH Sarabun New" w:cs="TH Sarabun New"/>
+                <w:b w:val="0"/>
+                <w:i w:val="0"/>
                 <w:sz w:val="32"/>
               </w:rPr>
               <w:t>Recommendation</w:t>
@@ -1558,15 +3001,26 @@
         </w:tc>
         <w:tc>
           <w:tcPr>
-            <w:tcW w:type="dxa" w:w="4680"/>
+            <w:tcW w:type="dxa" w:w="4513"/>
           </w:tcPr>
           <w:p>
             <w:r>
               <w:rPr>
+                <w:rFonts w:ascii="Consolas" w:hAnsi="Consolas" w:eastAsia="Consolas" w:cs="Consolas"/>
+                <w:b w:val="0"/>
+                <w:i w:val="0"/>
+                <w:sz w:val="20"/>
+              </w:rPr>
+              <w:t>C)</w:t>
+            </w:r>
+            <w:r>
+              <w:rPr>
                 <w:rFonts w:ascii="TH Sarabun New" w:hAnsi="TH Sarabun New" w:eastAsia="TH Sarabun New" w:cs="TH Sarabun New"/>
+                <w:b w:val="0"/>
+                <w:i w:val="0"/>
                 <w:sz w:val="32"/>
               </w:rPr>
-              <w:t>C) ยึด A7670E เป็น default แต่ตรวจ footprint/assembly compatibility สำหรับ fallback ให้ครบก่อน freeze BOM</w:t>
+              <w:t xml:space="preserve"> ยึด A7670E เป็น default แต่ตรวจ footprint/assembly compatibility สำหรับ fallback ให้ครบก่อน freeze BOM</w:t>
             </w:r>
           </w:p>
         </w:tc>
@@ -1574,12 +3028,14 @@
       <w:tr>
         <w:tc>
           <w:tcPr>
-            <w:tcW w:type="dxa" w:w="4680"/>
+            <w:tcW w:type="dxa" w:w="4513"/>
           </w:tcPr>
           <w:p>
             <w:r>
               <w:rPr>
                 <w:rFonts w:ascii="TH Sarabun New" w:hAnsi="TH Sarabun New" w:eastAsia="TH Sarabun New" w:cs="TH Sarabun New"/>
+                <w:b w:val="0"/>
+                <w:i w:val="0"/>
                 <w:sz w:val="32"/>
               </w:rPr>
               <w:t>Reasoning</w:t>
@@ -1588,12 +3044,14 @@
         </w:tc>
         <w:tc>
           <w:tcPr>
-            <w:tcW w:type="dxa" w:w="4680"/>
+            <w:tcW w:type="dxa" w:w="4513"/>
           </w:tcPr>
           <w:p>
             <w:r>
               <w:rPr>
                 <w:rFonts w:ascii="TH Sarabun New" w:hAnsi="TH Sarabun New" w:eastAsia="TH Sarabun New" w:cs="TH Sarabun New"/>
+                <w:b w:val="0"/>
+                <w:i w:val="0"/>
                 <w:sz w:val="32"/>
               </w:rPr>
               <w:t>ได้สมดุลระหว่าง supply-chain flexibility กับความชัดเจนของเอกสาร</w:t>
@@ -1604,12 +3062,14 @@
       <w:tr>
         <w:tc>
           <w:tcPr>
-            <w:tcW w:type="dxa" w:w="4680"/>
+            <w:tcW w:type="dxa" w:w="4513"/>
           </w:tcPr>
           <w:p>
             <w:r>
               <w:rPr>
                 <w:rFonts w:ascii="TH Sarabun New" w:hAnsi="TH Sarabun New" w:eastAsia="TH Sarabun New" w:cs="TH Sarabun New"/>
+                <w:b w:val="0"/>
+                <w:i w:val="0"/>
                 <w:sz w:val="32"/>
               </w:rPr>
               <w:t>If delayed</w:t>
@@ -1618,12 +3078,14 @@
         </w:tc>
         <w:tc>
           <w:tcPr>
-            <w:tcW w:type="dxa" w:w="4680"/>
+            <w:tcW w:type="dxa" w:w="4513"/>
           </w:tcPr>
           <w:p>
             <w:r>
               <w:rPr>
                 <w:rFonts w:ascii="TH Sarabun New" w:hAnsi="TH Sarabun New" w:eastAsia="TH Sarabun New" w:cs="TH Sarabun New"/>
+                <w:b w:val="0"/>
+                <w:i w:val="0"/>
                 <w:sz w:val="32"/>
               </w:rPr>
               <w:t>Procurement กับ PCB design จะเสี่ยงต้องย้อนแก้เมื่อของขาดหรือ lead time เปลี่ยน</w:t>
@@ -1634,12 +3096,14 @@
       <w:tr>
         <w:tc>
           <w:tcPr>
-            <w:tcW w:type="dxa" w:w="4680"/>
+            <w:tcW w:type="dxa" w:w="4513"/>
           </w:tcPr>
           <w:p>
             <w:r>
               <w:rPr>
                 <w:rFonts w:ascii="TH Sarabun New" w:hAnsi="TH Sarabun New" w:eastAsia="TH Sarabun New" w:cs="TH Sarabun New"/>
+                <w:b w:val="0"/>
+                <w:i w:val="0"/>
                 <w:sz w:val="32"/>
               </w:rPr>
               <w:t>Related docs</w:t>
@@ -1648,15 +3112,233 @@
         </w:tc>
         <w:tc>
           <w:tcPr>
-            <w:tcW w:type="dxa" w:w="4680"/>
+            <w:tcW w:type="dxa" w:w="4513"/>
           </w:tcPr>
           <w:p>
             <w:r>
               <w:rPr>
                 <w:rFonts w:ascii="TH Sarabun New" w:hAnsi="TH Sarabun New" w:eastAsia="TH Sarabun New" w:cs="TH Sarabun New"/>
+                <w:b w:val="0"/>
+                <w:i w:val="0"/>
                 <w:sz w:val="32"/>
               </w:rPr>
-              <w:t>SB-00_Master_Assumptions_v1_1.md (./SB-00_Master_Assumptions_v1_1.md), SB-00_Firmware_Hardware_v1_1.md (./SB-00_Firmware_Hardware_v1_1.md), SB-00_Procurement_List_v1_1.md (./SB-00_Procurement_List_v1_1.md)</w:t>
+              <w:t>SB-00</w:t>
+            </w:r>
+            <w:r>
+              <w:rPr>
+                <w:rFonts w:ascii="TH Sarabun New" w:hAnsi="TH Sarabun New" w:eastAsia="TH Sarabun New" w:cs="TH Sarabun New"/>
+                <w:b w:val="0"/>
+                <w:i/>
+                <w:sz w:val="32"/>
+              </w:rPr>
+              <w:t>Master</w:t>
+            </w:r>
+            <w:r>
+              <w:rPr>
+                <w:rFonts w:ascii="TH Sarabun New" w:hAnsi="TH Sarabun New" w:eastAsia="TH Sarabun New" w:cs="TH Sarabun New"/>
+                <w:b w:val="0"/>
+                <w:i w:val="0"/>
+                <w:sz w:val="32"/>
+              </w:rPr>
+              <w:t>Assumptions</w:t>
+            </w:r>
+            <w:r>
+              <w:rPr>
+                <w:rFonts w:ascii="TH Sarabun New" w:hAnsi="TH Sarabun New" w:eastAsia="TH Sarabun New" w:cs="TH Sarabun New"/>
+                <w:b w:val="0"/>
+                <w:i/>
+                <w:sz w:val="32"/>
+              </w:rPr>
+              <w:t>v1</w:t>
+            </w:r>
+            <w:r>
+              <w:rPr>
+                <w:rFonts w:ascii="TH Sarabun New" w:hAnsi="TH Sarabun New" w:eastAsia="TH Sarabun New" w:cs="TH Sarabun New"/>
+                <w:b w:val="0"/>
+                <w:i w:val="0"/>
+                <w:sz w:val="32"/>
+              </w:rPr>
+              <w:t>1.md (./SB-00</w:t>
+            </w:r>
+            <w:r>
+              <w:rPr>
+                <w:rFonts w:ascii="TH Sarabun New" w:hAnsi="TH Sarabun New" w:eastAsia="TH Sarabun New" w:cs="TH Sarabun New"/>
+                <w:b w:val="0"/>
+                <w:i/>
+                <w:sz w:val="32"/>
+              </w:rPr>
+              <w:t>Master</w:t>
+            </w:r>
+            <w:r>
+              <w:rPr>
+                <w:rFonts w:ascii="TH Sarabun New" w:hAnsi="TH Sarabun New" w:eastAsia="TH Sarabun New" w:cs="TH Sarabun New"/>
+                <w:b w:val="0"/>
+                <w:i w:val="0"/>
+                <w:sz w:val="32"/>
+              </w:rPr>
+              <w:t>Assumptions</w:t>
+            </w:r>
+            <w:r>
+              <w:rPr>
+                <w:rFonts w:ascii="TH Sarabun New" w:hAnsi="TH Sarabun New" w:eastAsia="TH Sarabun New" w:cs="TH Sarabun New"/>
+                <w:b w:val="0"/>
+                <w:i/>
+                <w:sz w:val="32"/>
+              </w:rPr>
+              <w:t>v1</w:t>
+            </w:r>
+            <w:r>
+              <w:rPr>
+                <w:rFonts w:ascii="TH Sarabun New" w:hAnsi="TH Sarabun New" w:eastAsia="TH Sarabun New" w:cs="TH Sarabun New"/>
+                <w:b w:val="0"/>
+                <w:i w:val="0"/>
+                <w:sz w:val="32"/>
+              </w:rPr>
+              <w:t>1.md), SB-00</w:t>
+            </w:r>
+            <w:r>
+              <w:rPr>
+                <w:rFonts w:ascii="TH Sarabun New" w:hAnsi="TH Sarabun New" w:eastAsia="TH Sarabun New" w:cs="TH Sarabun New"/>
+                <w:b w:val="0"/>
+                <w:i/>
+                <w:sz w:val="32"/>
+              </w:rPr>
+              <w:t>Firmware</w:t>
+            </w:r>
+            <w:r>
+              <w:rPr>
+                <w:rFonts w:ascii="TH Sarabun New" w:hAnsi="TH Sarabun New" w:eastAsia="TH Sarabun New" w:cs="TH Sarabun New"/>
+                <w:b w:val="0"/>
+                <w:i w:val="0"/>
+                <w:sz w:val="32"/>
+              </w:rPr>
+              <w:t>Hardware</w:t>
+            </w:r>
+            <w:r>
+              <w:rPr>
+                <w:rFonts w:ascii="TH Sarabun New" w:hAnsi="TH Sarabun New" w:eastAsia="TH Sarabun New" w:cs="TH Sarabun New"/>
+                <w:b w:val="0"/>
+                <w:i/>
+                <w:sz w:val="32"/>
+              </w:rPr>
+              <w:t>v1</w:t>
+            </w:r>
+            <w:r>
+              <w:rPr>
+                <w:rFonts w:ascii="TH Sarabun New" w:hAnsi="TH Sarabun New" w:eastAsia="TH Sarabun New" w:cs="TH Sarabun New"/>
+                <w:b w:val="0"/>
+                <w:i w:val="0"/>
+                <w:sz w:val="32"/>
+              </w:rPr>
+              <w:t>1.md (./SB-00</w:t>
+            </w:r>
+            <w:r>
+              <w:rPr>
+                <w:rFonts w:ascii="TH Sarabun New" w:hAnsi="TH Sarabun New" w:eastAsia="TH Sarabun New" w:cs="TH Sarabun New"/>
+                <w:b w:val="0"/>
+                <w:i/>
+                <w:sz w:val="32"/>
+              </w:rPr>
+              <w:t>Firmware</w:t>
+            </w:r>
+            <w:r>
+              <w:rPr>
+                <w:rFonts w:ascii="TH Sarabun New" w:hAnsi="TH Sarabun New" w:eastAsia="TH Sarabun New" w:cs="TH Sarabun New"/>
+                <w:b w:val="0"/>
+                <w:i w:val="0"/>
+                <w:sz w:val="32"/>
+              </w:rPr>
+              <w:t>Hardware</w:t>
+            </w:r>
+            <w:r>
+              <w:rPr>
+                <w:rFonts w:ascii="TH Sarabun New" w:hAnsi="TH Sarabun New" w:eastAsia="TH Sarabun New" w:cs="TH Sarabun New"/>
+                <w:b w:val="0"/>
+                <w:i/>
+                <w:sz w:val="32"/>
+              </w:rPr>
+              <w:t>v1</w:t>
+            </w:r>
+            <w:r>
+              <w:rPr>
+                <w:rFonts w:ascii="TH Sarabun New" w:hAnsi="TH Sarabun New" w:eastAsia="TH Sarabun New" w:cs="TH Sarabun New"/>
+                <w:b w:val="0"/>
+                <w:i w:val="0"/>
+                <w:sz w:val="32"/>
+              </w:rPr>
+              <w:t>1.md), SB-00</w:t>
+            </w:r>
+            <w:r>
+              <w:rPr>
+                <w:rFonts w:ascii="TH Sarabun New" w:hAnsi="TH Sarabun New" w:eastAsia="TH Sarabun New" w:cs="TH Sarabun New"/>
+                <w:b w:val="0"/>
+                <w:i/>
+                <w:sz w:val="32"/>
+              </w:rPr>
+              <w:t>Procurement</w:t>
+            </w:r>
+            <w:r>
+              <w:rPr>
+                <w:rFonts w:ascii="TH Sarabun New" w:hAnsi="TH Sarabun New" w:eastAsia="TH Sarabun New" w:cs="TH Sarabun New"/>
+                <w:b w:val="0"/>
+                <w:i w:val="0"/>
+                <w:sz w:val="32"/>
+              </w:rPr>
+              <w:t>List</w:t>
+            </w:r>
+            <w:r>
+              <w:rPr>
+                <w:rFonts w:ascii="TH Sarabun New" w:hAnsi="TH Sarabun New" w:eastAsia="TH Sarabun New" w:cs="TH Sarabun New"/>
+                <w:b w:val="0"/>
+                <w:i/>
+                <w:sz w:val="32"/>
+              </w:rPr>
+              <w:t>v1</w:t>
+            </w:r>
+            <w:r>
+              <w:rPr>
+                <w:rFonts w:ascii="TH Sarabun New" w:hAnsi="TH Sarabun New" w:eastAsia="TH Sarabun New" w:cs="TH Sarabun New"/>
+                <w:b w:val="0"/>
+                <w:i w:val="0"/>
+                <w:sz w:val="32"/>
+              </w:rPr>
+              <w:t>1.md (./SB-00</w:t>
+            </w:r>
+            <w:r>
+              <w:rPr>
+                <w:rFonts w:ascii="TH Sarabun New" w:hAnsi="TH Sarabun New" w:eastAsia="TH Sarabun New" w:cs="TH Sarabun New"/>
+                <w:b w:val="0"/>
+                <w:i/>
+                <w:sz w:val="32"/>
+              </w:rPr>
+              <w:t>Procurement</w:t>
+            </w:r>
+            <w:r>
+              <w:rPr>
+                <w:rFonts w:ascii="TH Sarabun New" w:hAnsi="TH Sarabun New" w:eastAsia="TH Sarabun New" w:cs="TH Sarabun New"/>
+                <w:b w:val="0"/>
+                <w:i w:val="0"/>
+                <w:sz w:val="32"/>
+              </w:rPr>
+              <w:t>List</w:t>
+            </w:r>
+            <w:r>
+              <w:rPr>
+                <w:rFonts w:ascii="TH Sarabun New" w:hAnsi="TH Sarabun New" w:eastAsia="TH Sarabun New" w:cs="TH Sarabun New"/>
+                <w:b w:val="0"/>
+                <w:i/>
+                <w:sz w:val="32"/>
+              </w:rPr>
+              <w:t>v1</w:t>
+            </w:r>
+            <w:r>
+              <w:rPr>
+                <w:rFonts w:ascii="TH Sarabun New" w:hAnsi="TH Sarabun New" w:eastAsia="TH Sarabun New" w:cs="TH Sarabun New"/>
+                <w:b w:val="0"/>
+                <w:i w:val="0"/>
+                <w:sz w:val="32"/>
+              </w:rPr>
+              <w:t>1.md)</w:t>
             </w:r>
           </w:p>
         </w:tc>
@@ -1666,13 +3348,14 @@
     <w:p/>
     <w:p>
       <w:pPr>
-        <w:pStyle w:val="Heading1"/>
+        <w:pStyle w:val="Heading2"/>
       </w:pPr>
       <w:r>
         <w:rPr>
           <w:rFonts w:ascii="TH Sarabun New" w:hAnsi="TH Sarabun New" w:eastAsia="TH Sarabun New" w:cs="TH Sarabun New"/>
           <w:b/>
-          <w:sz w:val="40"/>
+          <w:i w:val="0"/>
+          <w:sz w:val="36"/>
         </w:rPr>
         <w:t>D-05 LINE OA Paid Plan / Notification Budget Trigger</w:t>
       </w:r>
@@ -1682,22 +3365,24 @@
       <w:tblPr>
         <w:tblStyle w:val="TableGrid"/>
         <w:tblW w:type="auto" w:w="0"/>
+        <w:tblLayout w:type="autofit"/>
         <w:tblLook w:firstColumn="1" w:firstRow="1" w:lastColumn="0" w:lastRow="0" w:noHBand="0" w:noVBand="1" w:val="04A0"/>
       </w:tblPr>
       <w:tblGrid>
-        <w:gridCol w:w="4680"/>
-        <w:gridCol w:w="4680"/>
+        <w:gridCol w:w="4513"/>
+        <w:gridCol w:w="4513"/>
       </w:tblGrid>
       <w:tr>
         <w:tc>
           <w:tcPr>
-            <w:tcW w:type="dxa" w:w="4680"/>
+            <w:tcW w:type="dxa" w:w="4513"/>
           </w:tcPr>
           <w:p>
             <w:r>
               <w:rPr>
                 <w:rFonts w:ascii="TH Sarabun New" w:hAnsi="TH Sarabun New" w:eastAsia="TH Sarabun New" w:cs="TH Sarabun New"/>
                 <w:b/>
+                <w:i w:val="0"/>
                 <w:sz w:val="32"/>
               </w:rPr>
               <w:t>Item</w:t>
@@ -1706,13 +3391,14 @@
         </w:tc>
         <w:tc>
           <w:tcPr>
-            <w:tcW w:type="dxa" w:w="4680"/>
+            <w:tcW w:type="dxa" w:w="4513"/>
           </w:tcPr>
           <w:p>
             <w:r>
               <w:rPr>
                 <w:rFonts w:ascii="TH Sarabun New" w:hAnsi="TH Sarabun New" w:eastAsia="TH Sarabun New" w:cs="TH Sarabun New"/>
                 <w:b/>
+                <w:i w:val="0"/>
                 <w:sz w:val="32"/>
               </w:rPr>
               <w:t>Detail</w:t>
@@ -1723,12 +3409,14 @@
       <w:tr>
         <w:tc>
           <w:tcPr>
-            <w:tcW w:type="dxa" w:w="4680"/>
+            <w:tcW w:type="dxa" w:w="4513"/>
           </w:tcPr>
           <w:p>
             <w:r>
               <w:rPr>
                 <w:rFonts w:ascii="TH Sarabun New" w:hAnsi="TH Sarabun New" w:eastAsia="TH Sarabun New" w:cs="TH Sarabun New"/>
+                <w:b w:val="0"/>
+                <w:i w:val="0"/>
                 <w:sz w:val="32"/>
               </w:rPr>
               <w:t>Current baseline</w:t>
@@ -1737,12 +3425,14 @@
         </w:tc>
         <w:tc>
           <w:tcPr>
-            <w:tcW w:type="dxa" w:w="4680"/>
+            <w:tcW w:type="dxa" w:w="4513"/>
           </w:tcPr>
           <w:p>
             <w:r>
               <w:rPr>
                 <w:rFonts w:ascii="TH Sarabun New" w:hAnsi="TH Sarabun New" w:eastAsia="TH Sarabun New" w:cs="TH Sarabun New"/>
+                <w:b w:val="0"/>
+                <w:i w:val="0"/>
                 <w:sz w:val="32"/>
               </w:rPr>
               <w:t>ใช้ free tier ก่อน และ re-check quota/price จริงก่อน commercial launch</w:t>
@@ -1753,12 +3443,14 @@
       <w:tr>
         <w:tc>
           <w:tcPr>
-            <w:tcW w:type="dxa" w:w="4680"/>
+            <w:tcW w:type="dxa" w:w="4513"/>
           </w:tcPr>
           <w:p>
             <w:r>
               <w:rPr>
                 <w:rFonts w:ascii="TH Sarabun New" w:hAnsi="TH Sarabun New" w:eastAsia="TH Sarabun New" w:cs="TH Sarabun New"/>
+                <w:b w:val="0"/>
+                <w:i w:val="0"/>
                 <w:sz w:val="32"/>
               </w:rPr>
               <w:t>Why it matters</w:t>
@@ -1767,12 +3459,14 @@
         </w:tc>
         <w:tc>
           <w:tcPr>
-            <w:tcW w:type="dxa" w:w="4680"/>
+            <w:tcW w:type="dxa" w:w="4513"/>
           </w:tcPr>
           <w:p>
             <w:r>
               <w:rPr>
                 <w:rFonts w:ascii="TH Sarabun New" w:hAnsi="TH Sarabun New" w:eastAsia="TH Sarabun New" w:cs="TH Sarabun New"/>
+                <w:b w:val="0"/>
+                <w:i w:val="0"/>
                 <w:sz w:val="32"/>
               </w:rPr>
               <w:t>กระทบ monthly cost planning, alert strategy, และ communication to pilot users</w:t>
@@ -1783,12 +3477,14 @@
       <w:tr>
         <w:tc>
           <w:tcPr>
-            <w:tcW w:type="dxa" w:w="4680"/>
+            <w:tcW w:type="dxa" w:w="4513"/>
           </w:tcPr>
           <w:p>
             <w:r>
               <w:rPr>
                 <w:rFonts w:ascii="TH Sarabun New" w:hAnsi="TH Sarabun New" w:eastAsia="TH Sarabun New" w:cs="TH Sarabun New"/>
+                <w:b w:val="0"/>
+                <w:i w:val="0"/>
                 <w:sz w:val="32"/>
               </w:rPr>
               <w:t>Options</w:t>
@@ -1797,15 +3493,62 @@
         </w:tc>
         <w:tc>
           <w:tcPr>
-            <w:tcW w:type="dxa" w:w="4680"/>
+            <w:tcW w:type="dxa" w:w="4513"/>
           </w:tcPr>
           <w:p>
             <w:r>
               <w:rPr>
+                <w:rFonts w:ascii="Consolas" w:hAnsi="Consolas" w:eastAsia="Consolas" w:cs="Consolas"/>
+                <w:b w:val="0"/>
+                <w:i w:val="0"/>
+                <w:sz w:val="20"/>
+              </w:rPr>
+              <w:t>A)</w:t>
+            </w:r>
+            <w:r>
+              <w:rPr>
                 <w:rFonts w:ascii="TH Sarabun New" w:hAnsi="TH Sarabun New" w:eastAsia="TH Sarabun New" w:cs="TH Sarabun New"/>
+                <w:b w:val="0"/>
+                <w:i w:val="0"/>
                 <w:sz w:val="32"/>
               </w:rPr>
-              <w:t>A) ใช้ free tier จนชน quota แล้วค่อยเลือก plan, B) เลือก paid plan ล่วงหน้าเพื่อกันสะดุด, C) ลดการพึ่ง LINE โดยดัน web push/in-app มากขึ้น</w:t>
+              <w:t xml:space="preserve"> ใช้ free tier จนชน quota แล้วค่อยเลือก plan, </w:t>
+            </w:r>
+            <w:r>
+              <w:rPr>
+                <w:rFonts w:ascii="Consolas" w:hAnsi="Consolas" w:eastAsia="Consolas" w:cs="Consolas"/>
+                <w:b w:val="0"/>
+                <w:i w:val="0"/>
+                <w:sz w:val="20"/>
+              </w:rPr>
+              <w:t>B)</w:t>
+            </w:r>
+            <w:r>
+              <w:rPr>
+                <w:rFonts w:ascii="TH Sarabun New" w:hAnsi="TH Sarabun New" w:eastAsia="TH Sarabun New" w:cs="TH Sarabun New"/>
+                <w:b w:val="0"/>
+                <w:i w:val="0"/>
+                <w:sz w:val="32"/>
+              </w:rPr>
+              <w:t xml:space="preserve"> เลือก paid plan ล่วงหน้าเพื่อกันสะดุด, </w:t>
+            </w:r>
+            <w:r>
+              <w:rPr>
+                <w:rFonts w:ascii="Consolas" w:hAnsi="Consolas" w:eastAsia="Consolas" w:cs="Consolas"/>
+                <w:b w:val="0"/>
+                <w:i w:val="0"/>
+                <w:sz w:val="20"/>
+              </w:rPr>
+              <w:t>C)</w:t>
+            </w:r>
+            <w:r>
+              <w:rPr>
+                <w:rFonts w:ascii="TH Sarabun New" w:hAnsi="TH Sarabun New" w:eastAsia="TH Sarabun New" w:cs="TH Sarabun New"/>
+                <w:b w:val="0"/>
+                <w:i w:val="0"/>
+                <w:sz w:val="32"/>
+              </w:rPr>
+              <w:t xml:space="preserve"> ลดการพึ่ง LINE โดยดัน web push/in-app มากขึ้น</w:t>
             </w:r>
           </w:p>
         </w:tc>
@@ -1813,12 +3556,14 @@
       <w:tr>
         <w:tc>
           <w:tcPr>
-            <w:tcW w:type="dxa" w:w="4680"/>
+            <w:tcW w:type="dxa" w:w="4513"/>
           </w:tcPr>
           <w:p>
             <w:r>
               <w:rPr>
                 <w:rFonts w:ascii="TH Sarabun New" w:hAnsi="TH Sarabun New" w:eastAsia="TH Sarabun New" w:cs="TH Sarabun New"/>
+                <w:b w:val="0"/>
+                <w:i w:val="0"/>
                 <w:sz w:val="32"/>
               </w:rPr>
               <w:t>Recommendation</w:t>
@@ -1827,15 +3572,26 @@
         </w:tc>
         <w:tc>
           <w:tcPr>
-            <w:tcW w:type="dxa" w:w="4680"/>
+            <w:tcW w:type="dxa" w:w="4513"/>
           </w:tcPr>
           <w:p>
             <w:r>
               <w:rPr>
+                <w:rFonts w:ascii="Consolas" w:hAnsi="Consolas" w:eastAsia="Consolas" w:cs="Consolas"/>
+                <w:b w:val="0"/>
+                <w:i w:val="0"/>
+                <w:sz w:val="20"/>
+              </w:rPr>
+              <w:t>A)</w:t>
+            </w:r>
+            <w:r>
+              <w:rPr>
                 <w:rFonts w:ascii="TH Sarabun New" w:hAnsi="TH Sarabun New" w:eastAsia="TH Sarabun New" w:cs="TH Sarabun New"/>
+                <w:b w:val="0"/>
+                <w:i w:val="0"/>
                 <w:sz w:val="32"/>
               </w:rPr>
-              <w:t>A) ใช้ free tier ระหว่าง pilot และ review quota/price จริงอีกครั้งใน launch readiness review</w:t>
+              <w:t xml:space="preserve"> ใช้ free tier ระหว่าง pilot และ review quota/price จริงอีกครั้งใน launch readiness review</w:t>
             </w:r>
           </w:p>
         </w:tc>
@@ -1843,12 +3599,14 @@
       <w:tr>
         <w:tc>
           <w:tcPr>
-            <w:tcW w:type="dxa" w:w="4680"/>
+            <w:tcW w:type="dxa" w:w="4513"/>
           </w:tcPr>
           <w:p>
             <w:r>
               <w:rPr>
                 <w:rFonts w:ascii="TH Sarabun New" w:hAnsi="TH Sarabun New" w:eastAsia="TH Sarabun New" w:cs="TH Sarabun New"/>
+                <w:b w:val="0"/>
+                <w:i w:val="0"/>
                 <w:sz w:val="32"/>
               </w:rPr>
               <w:t>Reasoning</w:t>
@@ -1857,12 +3615,14 @@
         </w:tc>
         <w:tc>
           <w:tcPr>
-            <w:tcW w:type="dxa" w:w="4680"/>
+            <w:tcW w:type="dxa" w:w="4513"/>
           </w:tcPr>
           <w:p>
             <w:r>
               <w:rPr>
                 <w:rFonts w:ascii="TH Sarabun New" w:hAnsi="TH Sarabun New" w:eastAsia="TH Sarabun New" w:cs="TH Sarabun New"/>
+                <w:b w:val="0"/>
+                <w:i w:val="0"/>
                 <w:sz w:val="32"/>
               </w:rPr>
               <w:t>ลดค่าใช้จ่ายช่วง pilot และเลื่อนการตัดสินใจที่ขึ้นกับราคา live ไปใกล้เวลาที่ต้องใช้จริง</w:t>
@@ -1873,12 +3633,14 @@
       <w:tr>
         <w:tc>
           <w:tcPr>
-            <w:tcW w:type="dxa" w:w="4680"/>
+            <w:tcW w:type="dxa" w:w="4513"/>
           </w:tcPr>
           <w:p>
             <w:r>
               <w:rPr>
                 <w:rFonts w:ascii="TH Sarabun New" w:hAnsi="TH Sarabun New" w:eastAsia="TH Sarabun New" w:cs="TH Sarabun New"/>
+                <w:b w:val="0"/>
+                <w:i w:val="0"/>
                 <w:sz w:val="32"/>
               </w:rPr>
               <w:t>If delayed</w:t>
@@ -1887,12 +3649,14 @@
         </w:tc>
         <w:tc>
           <w:tcPr>
-            <w:tcW w:type="dxa" w:w="4680"/>
+            <w:tcW w:type="dxa" w:w="4513"/>
           </w:tcPr>
           <w:p>
             <w:r>
               <w:rPr>
                 <w:rFonts w:ascii="TH Sarabun New" w:hAnsi="TH Sarabun New" w:eastAsia="TH Sarabun New" w:cs="TH Sarabun New"/>
+                <w:b w:val="0"/>
+                <w:i w:val="0"/>
                 <w:sz w:val="32"/>
               </w:rPr>
               <w:t>ไม่กระทบ pilot มาก แต่จะทำให้ forecast ต้นทุน commercial launch ไม่แม่น</w:t>
@@ -1903,12 +3667,14 @@
       <w:tr>
         <w:tc>
           <w:tcPr>
-            <w:tcW w:type="dxa" w:w="4680"/>
+            <w:tcW w:type="dxa" w:w="4513"/>
           </w:tcPr>
           <w:p>
             <w:r>
               <w:rPr>
                 <w:rFonts w:ascii="TH Sarabun New" w:hAnsi="TH Sarabun New" w:eastAsia="TH Sarabun New" w:cs="TH Sarabun New"/>
+                <w:b w:val="0"/>
+                <w:i w:val="0"/>
                 <w:sz w:val="32"/>
               </w:rPr>
               <w:t>Related docs</w:t>
@@ -1917,15 +3683,233 @@
         </w:tc>
         <w:tc>
           <w:tcPr>
-            <w:tcW w:type="dxa" w:w="4680"/>
+            <w:tcW w:type="dxa" w:w="4513"/>
           </w:tcPr>
           <w:p>
             <w:r>
               <w:rPr>
                 <w:rFonts w:ascii="TH Sarabun New" w:hAnsi="TH Sarabun New" w:eastAsia="TH Sarabun New" w:cs="TH Sarabun New"/>
+                <w:b w:val="0"/>
+                <w:i w:val="0"/>
                 <w:sz w:val="32"/>
               </w:rPr>
-              <w:t>SB-00_Master_Assumptions_v1_1.md (./SB-00_Master_Assumptions_v1_1.md), SB-00_Backend_Security_v1_1.md (./SB-00_Backend_Security_v1_1.md), SB-00_Procurement_List_v1_1.md (./SB-00_Procurement_List_v1_1.md)</w:t>
+              <w:t>SB-00</w:t>
+            </w:r>
+            <w:r>
+              <w:rPr>
+                <w:rFonts w:ascii="TH Sarabun New" w:hAnsi="TH Sarabun New" w:eastAsia="TH Sarabun New" w:cs="TH Sarabun New"/>
+                <w:b w:val="0"/>
+                <w:i/>
+                <w:sz w:val="32"/>
+              </w:rPr>
+              <w:t>Master</w:t>
+            </w:r>
+            <w:r>
+              <w:rPr>
+                <w:rFonts w:ascii="TH Sarabun New" w:hAnsi="TH Sarabun New" w:eastAsia="TH Sarabun New" w:cs="TH Sarabun New"/>
+                <w:b w:val="0"/>
+                <w:i w:val="0"/>
+                <w:sz w:val="32"/>
+              </w:rPr>
+              <w:t>Assumptions</w:t>
+            </w:r>
+            <w:r>
+              <w:rPr>
+                <w:rFonts w:ascii="TH Sarabun New" w:hAnsi="TH Sarabun New" w:eastAsia="TH Sarabun New" w:cs="TH Sarabun New"/>
+                <w:b w:val="0"/>
+                <w:i/>
+                <w:sz w:val="32"/>
+              </w:rPr>
+              <w:t>v1</w:t>
+            </w:r>
+            <w:r>
+              <w:rPr>
+                <w:rFonts w:ascii="TH Sarabun New" w:hAnsi="TH Sarabun New" w:eastAsia="TH Sarabun New" w:cs="TH Sarabun New"/>
+                <w:b w:val="0"/>
+                <w:i w:val="0"/>
+                <w:sz w:val="32"/>
+              </w:rPr>
+              <w:t>1.md (./SB-00</w:t>
+            </w:r>
+            <w:r>
+              <w:rPr>
+                <w:rFonts w:ascii="TH Sarabun New" w:hAnsi="TH Sarabun New" w:eastAsia="TH Sarabun New" w:cs="TH Sarabun New"/>
+                <w:b w:val="0"/>
+                <w:i/>
+                <w:sz w:val="32"/>
+              </w:rPr>
+              <w:t>Master</w:t>
+            </w:r>
+            <w:r>
+              <w:rPr>
+                <w:rFonts w:ascii="TH Sarabun New" w:hAnsi="TH Sarabun New" w:eastAsia="TH Sarabun New" w:cs="TH Sarabun New"/>
+                <w:b w:val="0"/>
+                <w:i w:val="0"/>
+                <w:sz w:val="32"/>
+              </w:rPr>
+              <w:t>Assumptions</w:t>
+            </w:r>
+            <w:r>
+              <w:rPr>
+                <w:rFonts w:ascii="TH Sarabun New" w:hAnsi="TH Sarabun New" w:eastAsia="TH Sarabun New" w:cs="TH Sarabun New"/>
+                <w:b w:val="0"/>
+                <w:i/>
+                <w:sz w:val="32"/>
+              </w:rPr>
+              <w:t>v1</w:t>
+            </w:r>
+            <w:r>
+              <w:rPr>
+                <w:rFonts w:ascii="TH Sarabun New" w:hAnsi="TH Sarabun New" w:eastAsia="TH Sarabun New" w:cs="TH Sarabun New"/>
+                <w:b w:val="0"/>
+                <w:i w:val="0"/>
+                <w:sz w:val="32"/>
+              </w:rPr>
+              <w:t>1.md), SB-00</w:t>
+            </w:r>
+            <w:r>
+              <w:rPr>
+                <w:rFonts w:ascii="TH Sarabun New" w:hAnsi="TH Sarabun New" w:eastAsia="TH Sarabun New" w:cs="TH Sarabun New"/>
+                <w:b w:val="0"/>
+                <w:i/>
+                <w:sz w:val="32"/>
+              </w:rPr>
+              <w:t>Backend</w:t>
+            </w:r>
+            <w:r>
+              <w:rPr>
+                <w:rFonts w:ascii="TH Sarabun New" w:hAnsi="TH Sarabun New" w:eastAsia="TH Sarabun New" w:cs="TH Sarabun New"/>
+                <w:b w:val="0"/>
+                <w:i w:val="0"/>
+                <w:sz w:val="32"/>
+              </w:rPr>
+              <w:t>Security</w:t>
+            </w:r>
+            <w:r>
+              <w:rPr>
+                <w:rFonts w:ascii="TH Sarabun New" w:hAnsi="TH Sarabun New" w:eastAsia="TH Sarabun New" w:cs="TH Sarabun New"/>
+                <w:b w:val="0"/>
+                <w:i/>
+                <w:sz w:val="32"/>
+              </w:rPr>
+              <w:t>v1</w:t>
+            </w:r>
+            <w:r>
+              <w:rPr>
+                <w:rFonts w:ascii="TH Sarabun New" w:hAnsi="TH Sarabun New" w:eastAsia="TH Sarabun New" w:cs="TH Sarabun New"/>
+                <w:b w:val="0"/>
+                <w:i w:val="0"/>
+                <w:sz w:val="32"/>
+              </w:rPr>
+              <w:t>1.md (./SB-00</w:t>
+            </w:r>
+            <w:r>
+              <w:rPr>
+                <w:rFonts w:ascii="TH Sarabun New" w:hAnsi="TH Sarabun New" w:eastAsia="TH Sarabun New" w:cs="TH Sarabun New"/>
+                <w:b w:val="0"/>
+                <w:i/>
+                <w:sz w:val="32"/>
+              </w:rPr>
+              <w:t>Backend</w:t>
+            </w:r>
+            <w:r>
+              <w:rPr>
+                <w:rFonts w:ascii="TH Sarabun New" w:hAnsi="TH Sarabun New" w:eastAsia="TH Sarabun New" w:cs="TH Sarabun New"/>
+                <w:b w:val="0"/>
+                <w:i w:val="0"/>
+                <w:sz w:val="32"/>
+              </w:rPr>
+              <w:t>Security</w:t>
+            </w:r>
+            <w:r>
+              <w:rPr>
+                <w:rFonts w:ascii="TH Sarabun New" w:hAnsi="TH Sarabun New" w:eastAsia="TH Sarabun New" w:cs="TH Sarabun New"/>
+                <w:b w:val="0"/>
+                <w:i/>
+                <w:sz w:val="32"/>
+              </w:rPr>
+              <w:t>v1</w:t>
+            </w:r>
+            <w:r>
+              <w:rPr>
+                <w:rFonts w:ascii="TH Sarabun New" w:hAnsi="TH Sarabun New" w:eastAsia="TH Sarabun New" w:cs="TH Sarabun New"/>
+                <w:b w:val="0"/>
+                <w:i w:val="0"/>
+                <w:sz w:val="32"/>
+              </w:rPr>
+              <w:t>1.md), SB-00</w:t>
+            </w:r>
+            <w:r>
+              <w:rPr>
+                <w:rFonts w:ascii="TH Sarabun New" w:hAnsi="TH Sarabun New" w:eastAsia="TH Sarabun New" w:cs="TH Sarabun New"/>
+                <w:b w:val="0"/>
+                <w:i/>
+                <w:sz w:val="32"/>
+              </w:rPr>
+              <w:t>Procurement</w:t>
+            </w:r>
+            <w:r>
+              <w:rPr>
+                <w:rFonts w:ascii="TH Sarabun New" w:hAnsi="TH Sarabun New" w:eastAsia="TH Sarabun New" w:cs="TH Sarabun New"/>
+                <w:b w:val="0"/>
+                <w:i w:val="0"/>
+                <w:sz w:val="32"/>
+              </w:rPr>
+              <w:t>List</w:t>
+            </w:r>
+            <w:r>
+              <w:rPr>
+                <w:rFonts w:ascii="TH Sarabun New" w:hAnsi="TH Sarabun New" w:eastAsia="TH Sarabun New" w:cs="TH Sarabun New"/>
+                <w:b w:val="0"/>
+                <w:i/>
+                <w:sz w:val="32"/>
+              </w:rPr>
+              <w:t>v1</w:t>
+            </w:r>
+            <w:r>
+              <w:rPr>
+                <w:rFonts w:ascii="TH Sarabun New" w:hAnsi="TH Sarabun New" w:eastAsia="TH Sarabun New" w:cs="TH Sarabun New"/>
+                <w:b w:val="0"/>
+                <w:i w:val="0"/>
+                <w:sz w:val="32"/>
+              </w:rPr>
+              <w:t>1.md (./SB-00</w:t>
+            </w:r>
+            <w:r>
+              <w:rPr>
+                <w:rFonts w:ascii="TH Sarabun New" w:hAnsi="TH Sarabun New" w:eastAsia="TH Sarabun New" w:cs="TH Sarabun New"/>
+                <w:b w:val="0"/>
+                <w:i/>
+                <w:sz w:val="32"/>
+              </w:rPr>
+              <w:t>Procurement</w:t>
+            </w:r>
+            <w:r>
+              <w:rPr>
+                <w:rFonts w:ascii="TH Sarabun New" w:hAnsi="TH Sarabun New" w:eastAsia="TH Sarabun New" w:cs="TH Sarabun New"/>
+                <w:b w:val="0"/>
+                <w:i w:val="0"/>
+                <w:sz w:val="32"/>
+              </w:rPr>
+              <w:t>List</w:t>
+            </w:r>
+            <w:r>
+              <w:rPr>
+                <w:rFonts w:ascii="TH Sarabun New" w:hAnsi="TH Sarabun New" w:eastAsia="TH Sarabun New" w:cs="TH Sarabun New"/>
+                <w:b w:val="0"/>
+                <w:i/>
+                <w:sz w:val="32"/>
+              </w:rPr>
+              <w:t>v1</w:t>
+            </w:r>
+            <w:r>
+              <w:rPr>
+                <w:rFonts w:ascii="TH Sarabun New" w:hAnsi="TH Sarabun New" w:eastAsia="TH Sarabun New" w:cs="TH Sarabun New"/>
+                <w:b w:val="0"/>
+                <w:i w:val="0"/>
+                <w:sz w:val="32"/>
+              </w:rPr>
+              <w:t>1.md)</w:t>
             </w:r>
           </w:p>
         </w:tc>
@@ -1934,24 +3918,15 @@
     <w:p/>
     <w:p/>
     <w:p>
-      <w:r>
-        <w:rPr>
-          <w:rFonts w:ascii="TH Sarabun New" w:hAnsi="TH Sarabun New" w:eastAsia="TH Sarabun New" w:cs="TH Sarabun New"/>
-          <w:sz w:val="32"/>
-        </w:rPr>
-        <w:t>---</w:t>
-      </w:r>
-    </w:p>
-    <w:p/>
-    <w:p>
       <w:pPr>
-        <w:pStyle w:val="Heading1"/>
+        <w:pStyle w:val="Heading2"/>
       </w:pPr>
       <w:r>
         <w:rPr>
           <w:rFonts w:ascii="TH Sarabun New" w:hAnsi="TH Sarabun New" w:eastAsia="TH Sarabun New" w:cs="TH Sarabun New"/>
           <w:b/>
-          <w:sz w:val="40"/>
+          <w:i w:val="0"/>
+          <w:sz w:val="36"/>
         </w:rPr>
         <w:t>Decision Close Log</w:t>
       </w:r>
@@ -1961,24 +3936,26 @@
       <w:tblPr>
         <w:tblStyle w:val="TableGrid"/>
         <w:tblW w:type="auto" w:w="0"/>
+        <w:tblLayout w:type="autofit"/>
         <w:tblLook w:firstColumn="1" w:firstRow="1" w:lastColumn="0" w:lastRow="0" w:noHBand="0" w:noVBand="1" w:val="04A0"/>
       </w:tblPr>
       <w:tblGrid>
-        <w:gridCol w:w="2340"/>
-        <w:gridCol w:w="2340"/>
-        <w:gridCol w:w="2340"/>
-        <w:gridCol w:w="2340"/>
+        <w:gridCol w:w="2256"/>
+        <w:gridCol w:w="2256"/>
+        <w:gridCol w:w="2256"/>
+        <w:gridCol w:w="2256"/>
       </w:tblGrid>
       <w:tr>
         <w:tc>
           <w:tcPr>
-            <w:tcW w:type="dxa" w:w="2340"/>
+            <w:tcW w:type="dxa" w:w="2256"/>
           </w:tcPr>
           <w:p>
             <w:r>
               <w:rPr>
                 <w:rFonts w:ascii="TH Sarabun New" w:hAnsi="TH Sarabun New" w:eastAsia="TH Sarabun New" w:cs="TH Sarabun New"/>
                 <w:b/>
+                <w:i w:val="0"/>
                 <w:sz w:val="32"/>
               </w:rPr>
               <w:t>ID</w:t>
@@ -1987,13 +3964,14 @@
         </w:tc>
         <w:tc>
           <w:tcPr>
-            <w:tcW w:type="dxa" w:w="2340"/>
+            <w:tcW w:type="dxa" w:w="2256"/>
           </w:tcPr>
           <w:p>
             <w:r>
               <w:rPr>
                 <w:rFonts w:ascii="TH Sarabun New" w:hAnsi="TH Sarabun New" w:eastAsia="TH Sarabun New" w:cs="TH Sarabun New"/>
                 <w:b/>
+                <w:i w:val="0"/>
                 <w:sz w:val="32"/>
               </w:rPr>
               <w:t>Closed on</w:t>
@@ -2002,13 +3980,14 @@
         </w:tc>
         <w:tc>
           <w:tcPr>
-            <w:tcW w:type="dxa" w:w="2340"/>
+            <w:tcW w:type="dxa" w:w="2256"/>
           </w:tcPr>
           <w:p>
             <w:r>
               <w:rPr>
                 <w:rFonts w:ascii="TH Sarabun New" w:hAnsi="TH Sarabun New" w:eastAsia="TH Sarabun New" w:cs="TH Sarabun New"/>
                 <w:b/>
+                <w:i w:val="0"/>
                 <w:sz w:val="32"/>
               </w:rPr>
               <w:t>Final choice</w:t>
@@ -2017,13 +3996,14 @@
         </w:tc>
         <w:tc>
           <w:tcPr>
-            <w:tcW w:type="dxa" w:w="2340"/>
+            <w:tcW w:type="dxa" w:w="2256"/>
           </w:tcPr>
           <w:p>
             <w:r>
               <w:rPr>
                 <w:rFonts w:ascii="TH Sarabun New" w:hAnsi="TH Sarabun New" w:eastAsia="TH Sarabun New" w:cs="TH Sarabun New"/>
                 <w:b/>
+                <w:i w:val="0"/>
                 <w:sz w:val="32"/>
               </w:rPr>
               <w:t>Notes</w:t>
@@ -2034,12 +4014,14 @@
       <w:tr>
         <w:tc>
           <w:tcPr>
-            <w:tcW w:type="dxa" w:w="2340"/>
+            <w:tcW w:type="dxa" w:w="2256"/>
           </w:tcPr>
           <w:p>
             <w:r>
               <w:rPr>
                 <w:rFonts w:ascii="TH Sarabun New" w:hAnsi="TH Sarabun New" w:eastAsia="TH Sarabun New" w:cs="TH Sarabun New"/>
+                <w:b w:val="0"/>
+                <w:i w:val="0"/>
                 <w:sz w:val="32"/>
               </w:rPr>
               <w:t>D-01</w:t>
@@ -2048,12 +4030,14 @@
         </w:tc>
         <w:tc>
           <w:tcPr>
-            <w:tcW w:type="dxa" w:w="2340"/>
+            <w:tcW w:type="dxa" w:w="2256"/>
           </w:tcPr>
           <w:p>
             <w:r>
               <w:rPr>
                 <w:rFonts w:ascii="TH Sarabun New" w:hAnsi="TH Sarabun New" w:eastAsia="TH Sarabun New" w:cs="TH Sarabun New"/>
+                <w:b w:val="0"/>
+                <w:i w:val="0"/>
                 <w:sz w:val="32"/>
               </w:rPr>
               <w:t>-</w:t>
@@ -2062,12 +4046,14 @@
         </w:tc>
         <w:tc>
           <w:tcPr>
-            <w:tcW w:type="dxa" w:w="2340"/>
+            <w:tcW w:type="dxa" w:w="2256"/>
           </w:tcPr>
           <w:p>
             <w:r>
               <w:rPr>
                 <w:rFonts w:ascii="TH Sarabun New" w:hAnsi="TH Sarabun New" w:eastAsia="TH Sarabun New" w:cs="TH Sarabun New"/>
+                <w:b w:val="0"/>
+                <w:i w:val="0"/>
                 <w:sz w:val="32"/>
               </w:rPr>
               <w:t>-</w:t>
@@ -2076,12 +4062,14 @@
         </w:tc>
         <w:tc>
           <w:tcPr>
-            <w:tcW w:type="dxa" w:w="2340"/>
+            <w:tcW w:type="dxa" w:w="2256"/>
           </w:tcPr>
           <w:p>
             <w:r>
               <w:rPr>
                 <w:rFonts w:ascii="TH Sarabun New" w:hAnsi="TH Sarabun New" w:eastAsia="TH Sarabun New" w:cs="TH Sarabun New"/>
+                <w:b w:val="0"/>
+                <w:i w:val="0"/>
                 <w:sz w:val="32"/>
               </w:rPr>
               <w:t>-</w:t>
@@ -2092,12 +4080,14 @@
       <w:tr>
         <w:tc>
           <w:tcPr>
-            <w:tcW w:type="dxa" w:w="2340"/>
+            <w:tcW w:type="dxa" w:w="2256"/>
           </w:tcPr>
           <w:p>
             <w:r>
               <w:rPr>
                 <w:rFonts w:ascii="TH Sarabun New" w:hAnsi="TH Sarabun New" w:eastAsia="TH Sarabun New" w:cs="TH Sarabun New"/>
+                <w:b w:val="0"/>
+                <w:i w:val="0"/>
                 <w:sz w:val="32"/>
               </w:rPr>
               <w:t>D-02</w:t>
@@ -2106,12 +4096,14 @@
         </w:tc>
         <w:tc>
           <w:tcPr>
-            <w:tcW w:type="dxa" w:w="2340"/>
+            <w:tcW w:type="dxa" w:w="2256"/>
           </w:tcPr>
           <w:p>
             <w:r>
               <w:rPr>
                 <w:rFonts w:ascii="TH Sarabun New" w:hAnsi="TH Sarabun New" w:eastAsia="TH Sarabun New" w:cs="TH Sarabun New"/>
+                <w:b w:val="0"/>
+                <w:i w:val="0"/>
                 <w:sz w:val="32"/>
               </w:rPr>
               <w:t>-</w:t>
@@ -2120,12 +4112,14 @@
         </w:tc>
         <w:tc>
           <w:tcPr>
-            <w:tcW w:type="dxa" w:w="2340"/>
+            <w:tcW w:type="dxa" w:w="2256"/>
           </w:tcPr>
           <w:p>
             <w:r>
               <w:rPr>
                 <w:rFonts w:ascii="TH Sarabun New" w:hAnsi="TH Sarabun New" w:eastAsia="TH Sarabun New" w:cs="TH Sarabun New"/>
+                <w:b w:val="0"/>
+                <w:i w:val="0"/>
                 <w:sz w:val="32"/>
               </w:rPr>
               <w:t>-</w:t>
@@ -2134,12 +4128,14 @@
         </w:tc>
         <w:tc>
           <w:tcPr>
-            <w:tcW w:type="dxa" w:w="2340"/>
+            <w:tcW w:type="dxa" w:w="2256"/>
           </w:tcPr>
           <w:p>
             <w:r>
               <w:rPr>
                 <w:rFonts w:ascii="TH Sarabun New" w:hAnsi="TH Sarabun New" w:eastAsia="TH Sarabun New" w:cs="TH Sarabun New"/>
+                <w:b w:val="0"/>
+                <w:i w:val="0"/>
                 <w:sz w:val="32"/>
               </w:rPr>
               <w:t>-</w:t>
@@ -2150,12 +4146,14 @@
       <w:tr>
         <w:tc>
           <w:tcPr>
-            <w:tcW w:type="dxa" w:w="2340"/>
+            <w:tcW w:type="dxa" w:w="2256"/>
           </w:tcPr>
           <w:p>
             <w:r>
               <w:rPr>
                 <w:rFonts w:ascii="TH Sarabun New" w:hAnsi="TH Sarabun New" w:eastAsia="TH Sarabun New" w:cs="TH Sarabun New"/>
+                <w:b w:val="0"/>
+                <w:i w:val="0"/>
                 <w:sz w:val="32"/>
               </w:rPr>
               <w:t>D-03</w:t>
@@ -2164,12 +4162,14 @@
         </w:tc>
         <w:tc>
           <w:tcPr>
-            <w:tcW w:type="dxa" w:w="2340"/>
+            <w:tcW w:type="dxa" w:w="2256"/>
           </w:tcPr>
           <w:p>
             <w:r>
               <w:rPr>
                 <w:rFonts w:ascii="TH Sarabun New" w:hAnsi="TH Sarabun New" w:eastAsia="TH Sarabun New" w:cs="TH Sarabun New"/>
+                <w:b w:val="0"/>
+                <w:i w:val="0"/>
                 <w:sz w:val="32"/>
               </w:rPr>
               <w:t>-</w:t>
@@ -2178,12 +4178,14 @@
         </w:tc>
         <w:tc>
           <w:tcPr>
-            <w:tcW w:type="dxa" w:w="2340"/>
+            <w:tcW w:type="dxa" w:w="2256"/>
           </w:tcPr>
           <w:p>
             <w:r>
               <w:rPr>
                 <w:rFonts w:ascii="TH Sarabun New" w:hAnsi="TH Sarabun New" w:eastAsia="TH Sarabun New" w:cs="TH Sarabun New"/>
+                <w:b w:val="0"/>
+                <w:i w:val="0"/>
                 <w:sz w:val="32"/>
               </w:rPr>
               <w:t>-</w:t>
@@ -2192,12 +4194,14 @@
         </w:tc>
         <w:tc>
           <w:tcPr>
-            <w:tcW w:type="dxa" w:w="2340"/>
+            <w:tcW w:type="dxa" w:w="2256"/>
           </w:tcPr>
           <w:p>
             <w:r>
               <w:rPr>
                 <w:rFonts w:ascii="TH Sarabun New" w:hAnsi="TH Sarabun New" w:eastAsia="TH Sarabun New" w:cs="TH Sarabun New"/>
+                <w:b w:val="0"/>
+                <w:i w:val="0"/>
                 <w:sz w:val="32"/>
               </w:rPr>
               <w:t>-</w:t>
@@ -2208,12 +4212,14 @@
       <w:tr>
         <w:tc>
           <w:tcPr>
-            <w:tcW w:type="dxa" w:w="2340"/>
+            <w:tcW w:type="dxa" w:w="2256"/>
           </w:tcPr>
           <w:p>
             <w:r>
               <w:rPr>
                 <w:rFonts w:ascii="TH Sarabun New" w:hAnsi="TH Sarabun New" w:eastAsia="TH Sarabun New" w:cs="TH Sarabun New"/>
+                <w:b w:val="0"/>
+                <w:i w:val="0"/>
                 <w:sz w:val="32"/>
               </w:rPr>
               <w:t>D-04</w:t>
@@ -2222,12 +4228,14 @@
         </w:tc>
         <w:tc>
           <w:tcPr>
-            <w:tcW w:type="dxa" w:w="2340"/>
+            <w:tcW w:type="dxa" w:w="2256"/>
           </w:tcPr>
           <w:p>
             <w:r>
               <w:rPr>
                 <w:rFonts w:ascii="TH Sarabun New" w:hAnsi="TH Sarabun New" w:eastAsia="TH Sarabun New" w:cs="TH Sarabun New"/>
+                <w:b w:val="0"/>
+                <w:i w:val="0"/>
                 <w:sz w:val="32"/>
               </w:rPr>
               <w:t>-</w:t>
@@ -2236,12 +4244,14 @@
         </w:tc>
         <w:tc>
           <w:tcPr>
-            <w:tcW w:type="dxa" w:w="2340"/>
+            <w:tcW w:type="dxa" w:w="2256"/>
           </w:tcPr>
           <w:p>
             <w:r>
               <w:rPr>
                 <w:rFonts w:ascii="TH Sarabun New" w:hAnsi="TH Sarabun New" w:eastAsia="TH Sarabun New" w:cs="TH Sarabun New"/>
+                <w:b w:val="0"/>
+                <w:i w:val="0"/>
                 <w:sz w:val="32"/>
               </w:rPr>
               <w:t>-</w:t>
@@ -2250,12 +4260,14 @@
         </w:tc>
         <w:tc>
           <w:tcPr>
-            <w:tcW w:type="dxa" w:w="2340"/>
+            <w:tcW w:type="dxa" w:w="2256"/>
           </w:tcPr>
           <w:p>
             <w:r>
               <w:rPr>
                 <w:rFonts w:ascii="TH Sarabun New" w:hAnsi="TH Sarabun New" w:eastAsia="TH Sarabun New" w:cs="TH Sarabun New"/>
+                <w:b w:val="0"/>
+                <w:i w:val="0"/>
                 <w:sz w:val="32"/>
               </w:rPr>
               <w:t>-</w:t>
@@ -2266,12 +4278,14 @@
       <w:tr>
         <w:tc>
           <w:tcPr>
-            <w:tcW w:type="dxa" w:w="2340"/>
+            <w:tcW w:type="dxa" w:w="2256"/>
           </w:tcPr>
           <w:p>
             <w:r>
               <w:rPr>
                 <w:rFonts w:ascii="TH Sarabun New" w:hAnsi="TH Sarabun New" w:eastAsia="TH Sarabun New" w:cs="TH Sarabun New"/>
+                <w:b w:val="0"/>
+                <w:i w:val="0"/>
                 <w:sz w:val="32"/>
               </w:rPr>
               <w:t>D-05</w:t>
@@ -2280,12 +4294,14 @@
         </w:tc>
         <w:tc>
           <w:tcPr>
-            <w:tcW w:type="dxa" w:w="2340"/>
+            <w:tcW w:type="dxa" w:w="2256"/>
           </w:tcPr>
           <w:p>
             <w:r>
               <w:rPr>
                 <w:rFonts w:ascii="TH Sarabun New" w:hAnsi="TH Sarabun New" w:eastAsia="TH Sarabun New" w:cs="TH Sarabun New"/>
+                <w:b w:val="0"/>
+                <w:i w:val="0"/>
                 <w:sz w:val="32"/>
               </w:rPr>
               <w:t>-</w:t>
@@ -2294,12 +4310,14 @@
         </w:tc>
         <w:tc>
           <w:tcPr>
-            <w:tcW w:type="dxa" w:w="2340"/>
+            <w:tcW w:type="dxa" w:w="2256"/>
           </w:tcPr>
           <w:p>
             <w:r>
               <w:rPr>
                 <w:rFonts w:ascii="TH Sarabun New" w:hAnsi="TH Sarabun New" w:eastAsia="TH Sarabun New" w:cs="TH Sarabun New"/>
+                <w:b w:val="0"/>
+                <w:i w:val="0"/>
                 <w:sz w:val="32"/>
               </w:rPr>
               <w:t>-</w:t>
@@ -2308,12 +4326,14 @@
         </w:tc>
         <w:tc>
           <w:tcPr>
-            <w:tcW w:type="dxa" w:w="2340"/>
+            <w:tcW w:type="dxa" w:w="2256"/>
           </w:tcPr>
           <w:p>
             <w:r>
               <w:rPr>
                 <w:rFonts w:ascii="TH Sarabun New" w:hAnsi="TH Sarabun New" w:eastAsia="TH Sarabun New" w:cs="TH Sarabun New"/>
+                <w:b w:val="0"/>
+                <w:i w:val="0"/>
                 <w:sz w:val="32"/>
               </w:rPr>
               <w:t>-</w:t>
@@ -2324,13 +4344,63 @@
     </w:tbl>
     <w:p/>
     <w:sectPr>
-      <w:pgSz w:w="12240" w:h="15840"/>
+      <w:headerReference w:type="default" r:id="rId9"/>
+      <w:footerReference w:type="default" r:id="rId10"/>
+      <w:pgSz w:w="11906" w:h="16838"/>
       <w:pgMar w:top="1440" w:right="1440" w:bottom="1440" w:left="1440" w:header="720" w:footer="720" w:gutter="0"/>
       <w:cols w:space="720"/>
       <w:docGrid w:linePitch="360"/>
     </w:sectPr>
   </w:body>
 </w:document>
+</file>
+
+<file path=word/footer1.xml><?xml version="1.0" encoding="utf-8"?>
+<w:ftr xmlns:m="http://schemas.openxmlformats.org/officeDocument/2006/math" xmlns:mc="http://schemas.openxmlformats.org/markup-compatibility/2006" xmlns:mo="http://schemas.microsoft.com/office/mac/office/2008/main" xmlns:mv="urn:schemas-microsoft-com:mac:vml" xmlns:o="urn:schemas-microsoft-com:office:office" xmlns:r="http://schemas.openxmlformats.org/officeDocument/2006/relationships" xmlns:v="urn:schemas-microsoft-com:vml" xmlns:w10="urn:schemas-microsoft-com:office:word" xmlns:w14="http://schemas.microsoft.com/office/word/2010/wordml" xmlns:w="http://schemas.openxmlformats.org/wordprocessingml/2006/main" xmlns:wne="http://schemas.microsoft.com/office/word/2006/wordml" xmlns:wp14="http://schemas.microsoft.com/office/word/2010/wordprocessingDrawing" xmlns:wp="http://schemas.openxmlformats.org/drawingml/2006/wordprocessingDrawing" xmlns:wpc="http://schemas.microsoft.com/office/word/2010/wordprocessingCanvas" xmlns:wpg="http://schemas.microsoft.com/office/word/2010/wordprocessingGroup" xmlns:wpi="http://schemas.microsoft.com/office/word/2010/wordprocessingInk" xmlns:wps="http://schemas.microsoft.com/office/word/2010/wordprocessingShape" mc:Ignorable="w14 wp14">
+  <w:p>
+    <w:pPr>
+      <w:pStyle w:val="Footer"/>
+      <w:jc w:val="center"/>
+    </w:pPr>
+    <w:r>
+      <w:rPr>
+        <w:rFonts w:ascii="TH Sarabun New" w:hAnsi="TH Sarabun New" w:eastAsia="TH Sarabun New" w:cs="TH Sarabun New"/>
+        <w:sz w:val="20"/>
+      </w:rPr>
+      <w:t xml:space="preserve">หน้า </w:t>
+    </w:r>
+    <w:r>
+      <w:rPr>
+        <w:rFonts w:ascii="TH Sarabun New" w:hAnsi="TH Sarabun New" w:eastAsia="TH Sarabun New" w:cs="TH Sarabun New"/>
+        <w:sz w:val="20"/>
+      </w:rPr>
+      <w:fldChar w:fldCharType="begin"/>
+      <w:instrText xml:space="preserve"> PAGE </w:instrText>
+      <w:fldChar w:fldCharType="separate"/>
+      <w:fldChar w:fldCharType="end"/>
+    </w:r>
+  </w:p>
+</w:ftr>
+</file>
+
+<file path=word/header1.xml><?xml version="1.0" encoding="utf-8"?>
+<w:hdr xmlns:m="http://schemas.openxmlformats.org/officeDocument/2006/math" xmlns:mc="http://schemas.openxmlformats.org/markup-compatibility/2006" xmlns:mo="http://schemas.microsoft.com/office/mac/office/2008/main" xmlns:mv="urn:schemas-microsoft-com:mac:vml" xmlns:o="urn:schemas-microsoft-com:office:office" xmlns:r="http://schemas.openxmlformats.org/officeDocument/2006/relationships" xmlns:v="urn:schemas-microsoft-com:vml" xmlns:w10="urn:schemas-microsoft-com:office:word" xmlns:w14="http://schemas.microsoft.com/office/word/2010/wordml" xmlns:w="http://schemas.openxmlformats.org/wordprocessingml/2006/main" xmlns:wne="http://schemas.microsoft.com/office/word/2006/wordml" xmlns:wp14="http://schemas.microsoft.com/office/word/2010/wordprocessingDrawing" xmlns:wp="http://schemas.openxmlformats.org/drawingml/2006/wordprocessingDrawing" xmlns:wpc="http://schemas.microsoft.com/office/word/2010/wordprocessingCanvas" xmlns:wpg="http://schemas.microsoft.com/office/word/2010/wordprocessingGroup" xmlns:wpi="http://schemas.microsoft.com/office/word/2010/wordprocessingInk" xmlns:wps="http://schemas.microsoft.com/office/word/2010/wordprocessingShape" mc:Ignorable="w14 wp14">
+  <w:p>
+    <w:pPr>
+      <w:pStyle w:val="Header"/>
+      <w:jc w:val="right"/>
+    </w:pPr>
+    <w:r>
+      <w:rPr>
+        <w:rFonts w:ascii="TH Sarabun New" w:hAnsi="TH Sarabun New" w:eastAsia="TH Sarabun New" w:cs="TH Sarabun New"/>
+        <w:b w:val="0"/>
+        <w:i w:val="0"/>
+        <w:sz w:val="20"/>
+      </w:rPr>
+      <w:t>SB-00 - Decision Register</w:t>
+    </w:r>
+  </w:p>
+</w:hdr>
 </file>
 
 <file path=word/numbering.xml><?xml version="1.0" encoding="utf-8"?>
@@ -2696,6 +4766,9 @@
     <w:name w:val="Normal"/>
     <w:qFormat/>
     <w:rsid w:val="00FC693F"/>
+    <w:pPr>
+      <w:spacing w:after="120" w:line="276" w:lineRule="auto"/>
+    </w:pPr>
     <w:rPr>
       <w:rFonts w:ascii="TH Sarabun New" w:hAnsi="TH Sarabun New"/>
       <w:sz w:val="32"/>
@@ -2756,7 +4829,7 @@
     <w:pPr>
       <w:keepNext/>
       <w:keepLines/>
-      <w:spacing w:before="480" w:after="0"/>
+      <w:spacing w:before="480" w:after="120" w:line="276" w:lineRule="auto"/>
       <w:outlineLvl w:val="0"/>
     </w:pPr>
     <w:rPr>
@@ -2780,7 +4853,7 @@
     <w:pPr>
       <w:keepNext/>
       <w:keepLines/>
-      <w:spacing w:before="200" w:after="0"/>
+      <w:spacing w:before="200" w:after="120" w:line="276" w:lineRule="auto"/>
       <w:outlineLvl w:val="1"/>
     </w:pPr>
     <w:rPr>
@@ -2804,7 +4877,7 @@
     <w:pPr>
       <w:keepNext/>
       <w:keepLines/>
-      <w:spacing w:before="200" w:after="0"/>
+      <w:spacing w:before="200" w:after="120" w:line="276" w:lineRule="auto"/>
       <w:outlineLvl w:val="2"/>
     </w:pPr>
     <w:rPr>
@@ -3046,15 +5119,16 @@
       <w:pBdr>
         <w:bottom w:val="single" w:sz="8" w:space="4" w:color="4F81BD" w:themeColor="accent1"/>
       </w:pBdr>
-      <w:spacing w:after="300" w:line="240" w:lineRule="auto"/>
+      <w:spacing w:after="120" w:line="276" w:lineRule="auto"/>
       <w:contextualSpacing/>
     </w:pPr>
     <w:rPr>
       <w:rFonts w:asciiTheme="majorHAnsi" w:eastAsiaTheme="majorEastAsia" w:hAnsiTheme="majorHAnsi" w:cstheme="majorBidi" w:ascii="TH Sarabun New" w:hAnsi="TH Sarabun New"/>
+      <w:b/>
       <w:color w:val="17365D" w:themeColor="text2" w:themeShade="BF"/>
       <w:spacing w:val="5"/>
       <w:kern w:val="28"/>
-      <w:sz w:val="48"/>
+      <w:sz w:val="52"/>
       <w:szCs w:val="52"/>
     </w:rPr>
   </w:style>
@@ -3228,8 +5302,13 @@
       <w:numPr>
         <w:numId w:val="1"/>
       </w:numPr>
+      <w:spacing w:after="80" w:line="264" w:lineRule="auto"/>
       <w:contextualSpacing/>
     </w:pPr>
+    <w:rPr>
+      <w:rFonts w:ascii="TH Sarabun New" w:hAnsi="TH Sarabun New"/>
+      <w:sz w:val="32"/>
+    </w:rPr>
   </w:style>
   <w:style w:type="paragraph" w:styleId="ListBullet2">
     <w:name w:val="List Bullet 2"/>
@@ -3267,8 +5346,13 @@
       <w:numPr>
         <w:numId w:val="5"/>
       </w:numPr>
+      <w:spacing w:after="80" w:line="264" w:lineRule="auto"/>
       <w:contextualSpacing/>
     </w:pPr>
+    <w:rPr>
+      <w:rFonts w:ascii="TH Sarabun New" w:hAnsi="TH Sarabun New"/>
+      <w:sz w:val="32"/>
+    </w:rPr>
   </w:style>
   <w:style w:type="paragraph" w:styleId="ListNumber2">
     <w:name w:val="List Number 2"/>
@@ -14386,6 +16470,10 @@
   </w:style>
   <w:style w:type="paragraph" w:customStyle="1" w:styleId="CodeBlock">
     <w:name w:val="Code Block"/>
+    <w:pPr>
+      <w:spacing w:after="120" w:line="240" w:lineRule="auto"/>
+      <w:ind w:left="360"/>
+    </w:pPr>
     <w:rPr>
       <w:rFonts w:ascii="Consolas" w:hAnsi="Consolas"/>
       <w:sz w:val="18"/>

</xml_diff>

<commit_message>
Finalize modular battery platform docs and checklist
</commit_message>
<xml_diff>
--- a/doc/human/SB-00_Decision_Register_v1_1.docx
+++ b/doc/human/SB-00_Decision_Register_v1_1.docx
@@ -942,7 +942,7 @@
                 <w:i w:val="0"/>
                 <w:sz w:val="32"/>
               </w:rPr>
-              <w:t>Proposed</w:t>
+              <w:t>Closed</w:t>
             </w:r>
           </w:p>
         </w:tc>
@@ -3292,7 +3292,7 @@
                 <w:i w:val="0"/>
                 <w:sz w:val="32"/>
               </w:rPr>
-              <w:t>Proposed choice</w:t>
+              <w:t>Final choice</w:t>
             </w:r>
           </w:p>
         </w:tc>
@@ -3482,7 +3482,7 @@
                 <w:i w:val="0"/>
                 <w:sz w:val="32"/>
               </w:rPr>
-              <w:t>ปิด decision ก่อน freeze PCB v1, enclosure v1, และ procurement ของ pilot</w:t>
+              <w:t>ปิดแล้วใน 2026-04-03; ใช้เป็น baseline ก่อน freeze PCB v1, enclosure v1, และ procurement ของ pilot</w:t>
             </w:r>
           </w:p>
         </w:tc>
@@ -4105,15 +4105,6 @@
           <w:p>
             <w:r>
               <w:rPr>
-                <w:rFonts w:ascii="TH Sarabun New" w:hAnsi="TH Sarabun New" w:eastAsia="TH Sarabun New" w:cs="TH Sarabun New"/>
-                <w:b w:val="0"/>
-                <w:i w:val="0"/>
-                <w:sz w:val="32"/>
-              </w:rPr>
-              <w:t xml:space="preserve">proposed: </w:t>
-            </w:r>
-            <w:r>
-              <w:rPr>
                 <w:rFonts w:ascii="Consolas" w:hAnsi="Consolas" w:eastAsia="Consolas" w:cs="Consolas"/>
                 <w:b w:val="0"/>
                 <w:i w:val="0"/>
@@ -4135,7 +4126,7 @@
                 <w:i w:val="0"/>
                 <w:sz w:val="32"/>
               </w:rPr>
-              <w:t>ต้องปิดก่อน freeze PCB/enclosure</w:t>
+              <w:t>ใช้เป็น baseline ก่อน freeze PCB/enclosure</w:t>
             </w:r>
           </w:p>
         </w:tc>

</xml_diff>